<commit_message>
API Heading is added
</commit_message>
<xml_diff>
--- a/docs/RaceDay_API_Endpoint_Plan.docx
+++ b/docs/RaceDay_API_Endpoint_Plan.docx
@@ -8,6 +8,12 @@
           <w:lang w:val="en-US"/>
         </w:rPr>
       </w:pPr>
+      <w:r>
+        <w:rPr>
+          <w:lang w:val="en-US"/>
+        </w:rPr>
+        <w:t>Section B – API Endpoint Plan</w:t>
+      </w:r>
       <w:bookmarkStart w:id="0" w:name="_GoBack"/>
       <w:bookmarkEnd w:id="0"/>
     </w:p>

</xml_diff>

<commit_message>
Table of content is created
</commit_message>
<xml_diff>
--- a/docs/RaceDay_API_Endpoint_Plan.docx
+++ b/docs/RaceDay_API_Endpoint_Plan.docx
@@ -8,14 +8,356 @@
           <w:lang w:val="en-US"/>
         </w:rPr>
       </w:pPr>
+    </w:p>
+    <w:p>
+      <w:pPr>
+        <w:rPr>
+          <w:lang w:val="en-US"/>
+        </w:rPr>
+      </w:pPr>
+    </w:p>
+    <w:p>
+      <w:pPr>
+        <w:rPr>
+          <w:lang w:val="en-US"/>
+        </w:rPr>
+      </w:pPr>
+    </w:p>
+    <w:p>
+      <w:pPr>
+        <w:rPr>
+          <w:lang w:val="en-US"/>
+        </w:rPr>
+      </w:pPr>
+    </w:p>
+    <w:p>
+      <w:pPr>
+        <w:rPr>
+          <w:lang w:val="en-US"/>
+        </w:rPr>
+      </w:pPr>
+    </w:p>
+    <w:p>
+      <w:pPr>
+        <w:rPr>
+          <w:lang w:val="en-US"/>
+        </w:rPr>
+      </w:pPr>
+    </w:p>
+    <w:p>
+      <w:pPr>
+        <w:rPr>
+          <w:lang w:val="en-US"/>
+        </w:rPr>
+      </w:pPr>
+    </w:p>
+    <w:p>
+      <w:pPr>
+        <w:rPr>
+          <w:lang w:val="en-US"/>
+        </w:rPr>
+      </w:pPr>
+      <w:bookmarkStart w:id="0" w:name="_GoBack"/>
+      <w:bookmarkEnd w:id="0"/>
+    </w:p>
+    <w:p>
+      <w:pPr>
+        <w:rPr>
+          <w:lang w:val="en-US"/>
+        </w:rPr>
+      </w:pPr>
+    </w:p>
+    <w:p>
+      <w:pPr>
+        <w:rPr>
+          <w:b/>
+          <w:sz w:val="40"/>
+          <w:szCs w:val="40"/>
+          <w:lang w:val="en-US"/>
+        </w:rPr>
+      </w:pPr>
+      <w:r>
+        <w:rPr>
+          <w:b/>
+          <w:sz w:val="40"/>
+          <w:szCs w:val="40"/>
+          <w:lang w:val="en-US"/>
+        </w:rPr>
+        <w:t>STUDENT NUMBER: ST10486705</w:t>
+      </w:r>
+    </w:p>
+    <w:p>
+      <w:pPr>
+        <w:rPr>
+          <w:b/>
+          <w:sz w:val="40"/>
+          <w:szCs w:val="40"/>
+          <w:lang w:val="en-US"/>
+        </w:rPr>
+      </w:pPr>
+      <w:r>
+        <w:rPr>
+          <w:b/>
+          <w:sz w:val="40"/>
+          <w:szCs w:val="40"/>
+          <w:lang w:val="en-US"/>
+        </w:rPr>
+        <w:t>NAME &amp; SURNAME: KUPA LEMOGANG</w:t>
+      </w:r>
+    </w:p>
+    <w:p>
+      <w:pPr>
+        <w:rPr>
+          <w:b/>
+          <w:sz w:val="40"/>
+          <w:szCs w:val="40"/>
+          <w:lang w:val="en-US"/>
+        </w:rPr>
+      </w:pPr>
+      <w:r>
+        <w:rPr>
+          <w:b/>
+          <w:sz w:val="40"/>
+          <w:szCs w:val="40"/>
+          <w:lang w:val="en-US"/>
+        </w:rPr>
+        <w:t>MODULE NAME: PROGRAMMING 2B</w:t>
+      </w:r>
+    </w:p>
+    <w:p>
+      <w:pPr>
+        <w:rPr>
+          <w:b/>
+          <w:sz w:val="40"/>
+          <w:szCs w:val="40"/>
+          <w:lang w:val="en-US"/>
+        </w:rPr>
+      </w:pPr>
+      <w:r>
+        <w:rPr>
+          <w:b/>
+          <w:sz w:val="40"/>
+          <w:szCs w:val="40"/>
+          <w:lang w:val="en-US"/>
+        </w:rPr>
+        <w:t>MODULE CODE: PROG6212/W</w:t>
+      </w:r>
+    </w:p>
+    <w:p>
+      <w:pPr>
+        <w:rPr>
+          <w:lang w:val="en-US"/>
+        </w:rPr>
+      </w:pPr>
+    </w:p>
+    <w:p>
+      <w:pPr>
+        <w:rPr>
+          <w:lang w:val="en-US"/>
+        </w:rPr>
+      </w:pPr>
+    </w:p>
+    <w:p>
+      <w:pPr>
+        <w:rPr>
+          <w:lang w:val="en-US"/>
+        </w:rPr>
+      </w:pPr>
+    </w:p>
+    <w:p>
+      <w:pPr>
+        <w:rPr>
+          <w:lang w:val="en-US"/>
+        </w:rPr>
+      </w:pPr>
+    </w:p>
+    <w:p>
+      <w:pPr>
+        <w:rPr>
+          <w:lang w:val="en-US"/>
+        </w:rPr>
+      </w:pPr>
+    </w:p>
+    <w:p>
+      <w:pPr>
+        <w:rPr>
+          <w:lang w:val="en-US"/>
+        </w:rPr>
+      </w:pPr>
+    </w:p>
+    <w:p>
+      <w:pPr>
+        <w:rPr>
+          <w:lang w:val="en-US"/>
+        </w:rPr>
+      </w:pPr>
+    </w:p>
+    <w:p>
+      <w:pPr>
+        <w:rPr>
+          <w:lang w:val="en-US"/>
+        </w:rPr>
+      </w:pPr>
+    </w:p>
+    <w:p>
+      <w:pPr>
+        <w:rPr>
+          <w:lang w:val="en-US"/>
+        </w:rPr>
+      </w:pPr>
+    </w:p>
+    <w:p>
+      <w:pPr>
+        <w:rPr>
+          <w:lang w:val="en-US"/>
+        </w:rPr>
+      </w:pPr>
+    </w:p>
+    <w:p>
+      <w:pPr>
+        <w:rPr>
+          <w:lang w:val="en-US"/>
+        </w:rPr>
+      </w:pPr>
+    </w:p>
+    <w:p>
+      <w:pPr>
+        <w:rPr>
+          <w:lang w:val="en-US"/>
+        </w:rPr>
+      </w:pPr>
+    </w:p>
+    <w:p>
+      <w:pPr>
+        <w:rPr>
+          <w:lang w:val="en-US"/>
+        </w:rPr>
+      </w:pPr>
+    </w:p>
+    <w:p>
+      <w:pPr>
+        <w:rPr>
+          <w:lang w:val="en-US"/>
+        </w:rPr>
+      </w:pPr>
+    </w:p>
+    <w:p>
+      <w:pPr>
+        <w:rPr>
+          <w:lang w:val="en-US"/>
+        </w:rPr>
+      </w:pPr>
+    </w:p>
+    <w:p>
+      <w:pPr>
+        <w:rPr>
+          <w:lang w:val="en-US"/>
+        </w:rPr>
+      </w:pPr>
+    </w:p>
+    <w:p>
+      <w:pPr>
+        <w:rPr>
+          <w:lang w:val="en-US"/>
+        </w:rPr>
+      </w:pPr>
+    </w:p>
+    <w:p>
+      <w:pPr>
+        <w:rPr>
+          <w:lang w:val="en-US"/>
+        </w:rPr>
+      </w:pPr>
+    </w:p>
+    <w:p>
+      <w:pPr>
+        <w:rPr>
+          <w:lang w:val="en-US"/>
+        </w:rPr>
+      </w:pPr>
+    </w:p>
+    <w:p>
+      <w:pPr>
+        <w:rPr>
+          <w:lang w:val="en-US"/>
+        </w:rPr>
+      </w:pPr>
+    </w:p>
+    <w:p>
+      <w:pPr>
+        <w:rPr>
+          <w:lang w:val="en-US"/>
+        </w:rPr>
+      </w:pPr>
+    </w:p>
+    <w:p>
+      <w:pPr>
+        <w:rPr>
+          <w:lang w:val="en-US"/>
+        </w:rPr>
+      </w:pPr>
+    </w:p>
+    <w:p>
+      <w:pPr>
+        <w:rPr>
+          <w:lang w:val="en-US"/>
+        </w:rPr>
+      </w:pPr>
+    </w:p>
+    <w:p>
+      <w:pPr>
+        <w:rPr>
+          <w:lang w:val="en-US"/>
+        </w:rPr>
+      </w:pPr>
+    </w:p>
+    <w:p>
+      <w:pPr>
+        <w:rPr>
+          <w:lang w:val="en-US"/>
+        </w:rPr>
+      </w:pPr>
+    </w:p>
+    <w:p>
+      <w:pPr>
+        <w:rPr>
+          <w:lang w:val="en-US"/>
+        </w:rPr>
+      </w:pPr>
+    </w:p>
+    <w:p>
+      <w:pPr>
+        <w:rPr>
+          <w:lang w:val="en-US"/>
+        </w:rPr>
+      </w:pPr>
+    </w:p>
+    <w:p>
+      <w:pPr>
+        <w:rPr>
+          <w:lang w:val="en-US"/>
+        </w:rPr>
+      </w:pPr>
       <w:r>
         <w:rPr>
           <w:lang w:val="en-US"/>
         </w:rPr>
         <w:t>Section B – API Endpoint Plan</w:t>
       </w:r>
-      <w:bookmarkStart w:id="0" w:name="_GoBack"/>
-      <w:bookmarkEnd w:id="0"/>
+    </w:p>
+    <w:p>
+      <w:pPr>
+        <w:rPr>
+          <w:lang w:val="en-US"/>
+        </w:rPr>
+      </w:pPr>
+    </w:p>
+    <w:p>
+      <w:pPr>
+        <w:rPr>
+          <w:lang w:val="en-US"/>
+        </w:rPr>
+      </w:pPr>
     </w:p>
     <w:sectPr>
       <w:pgSz w:w="11906" w:h="16838"/>

</xml_diff>

<commit_message>
Cover page is created
</commit_message>
<xml_diff>
--- a/docs/RaceDay_API_Endpoint_Plan.docx
+++ b/docs/RaceDay_API_Endpoint_Plan.docx
@@ -57,6 +57,166 @@
           <w:lang w:val="en-US"/>
         </w:rPr>
       </w:pPr>
+    </w:p>
+    <w:p>
+      <w:pPr>
+        <w:rPr>
+          <w:lang w:val="en-US"/>
+        </w:rPr>
+      </w:pPr>
+    </w:p>
+    <w:p>
+      <w:pPr>
+        <w:rPr>
+          <w:b/>
+          <w:sz w:val="40"/>
+          <w:szCs w:val="40"/>
+          <w:lang w:val="en-US"/>
+        </w:rPr>
+      </w:pPr>
+      <w:r>
+        <w:rPr>
+          <w:b/>
+          <w:sz w:val="40"/>
+          <w:szCs w:val="40"/>
+          <w:lang w:val="en-US"/>
+        </w:rPr>
+        <w:t>STUDENT NUMBER: ST10486705</w:t>
+      </w:r>
+    </w:p>
+    <w:p>
+      <w:pPr>
+        <w:rPr>
+          <w:b/>
+          <w:sz w:val="40"/>
+          <w:szCs w:val="40"/>
+          <w:lang w:val="en-US"/>
+        </w:rPr>
+      </w:pPr>
+      <w:r>
+        <w:rPr>
+          <w:b/>
+          <w:sz w:val="40"/>
+          <w:szCs w:val="40"/>
+          <w:lang w:val="en-US"/>
+        </w:rPr>
+        <w:t>NAME &amp; SURNAME: KUPA LEMOGANG</w:t>
+      </w:r>
+    </w:p>
+    <w:p>
+      <w:pPr>
+        <w:rPr>
+          <w:b/>
+          <w:sz w:val="40"/>
+          <w:szCs w:val="40"/>
+          <w:lang w:val="en-US"/>
+        </w:rPr>
+      </w:pPr>
+      <w:r>
+        <w:rPr>
+          <w:b/>
+          <w:sz w:val="40"/>
+          <w:szCs w:val="40"/>
+          <w:lang w:val="en-US"/>
+        </w:rPr>
+        <w:t>MODULE NAME: PROGRAMMING 2B</w:t>
+      </w:r>
+    </w:p>
+    <w:p>
+      <w:pPr>
+        <w:rPr>
+          <w:b/>
+          <w:sz w:val="40"/>
+          <w:szCs w:val="40"/>
+          <w:lang w:val="en-US"/>
+        </w:rPr>
+      </w:pPr>
+      <w:r>
+        <w:rPr>
+          <w:b/>
+          <w:sz w:val="40"/>
+          <w:szCs w:val="40"/>
+          <w:lang w:val="en-US"/>
+        </w:rPr>
+        <w:t>MODULE CODE: PROG6212/W</w:t>
+      </w:r>
+    </w:p>
+    <w:p>
+      <w:pPr>
+        <w:rPr>
+          <w:lang w:val="en-US"/>
+        </w:rPr>
+      </w:pPr>
+    </w:p>
+    <w:p>
+      <w:pPr>
+        <w:rPr>
+          <w:lang w:val="en-US"/>
+        </w:rPr>
+      </w:pPr>
+    </w:p>
+    <w:p>
+      <w:pPr>
+        <w:rPr>
+          <w:lang w:val="en-US"/>
+        </w:rPr>
+      </w:pPr>
+    </w:p>
+    <w:p>
+      <w:pPr>
+        <w:rPr>
+          <w:lang w:val="en-US"/>
+        </w:rPr>
+      </w:pPr>
+    </w:p>
+    <w:p>
+      <w:pPr>
+        <w:rPr>
+          <w:lang w:val="en-US"/>
+        </w:rPr>
+      </w:pPr>
+    </w:p>
+    <w:p>
+      <w:pPr>
+        <w:rPr>
+          <w:lang w:val="en-US"/>
+        </w:rPr>
+      </w:pPr>
+    </w:p>
+    <w:p>
+      <w:pPr>
+        <w:rPr>
+          <w:lang w:val="en-US"/>
+        </w:rPr>
+      </w:pPr>
+    </w:p>
+    <w:p>
+      <w:pPr>
+        <w:rPr>
+          <w:lang w:val="en-US"/>
+        </w:rPr>
+      </w:pPr>
+    </w:p>
+    <w:p>
+      <w:pPr>
+        <w:rPr>
+          <w:lang w:val="en-US"/>
+        </w:rPr>
+      </w:pPr>
+    </w:p>
+    <w:p>
+      <w:pPr>
+        <w:rPr>
+          <w:lang w:val="en-US"/>
+        </w:rPr>
+      </w:pPr>
+    </w:p>
+    <w:p>
+      <w:pPr>
+        <w:rPr>
+          <w:lang w:val="en-US"/>
+        </w:rPr>
+      </w:pPr>
       <w:bookmarkStart w:id="0" w:name="_GoBack"/>
       <w:bookmarkEnd w:id="0"/>
     </w:p>
@@ -70,117 +230,135 @@
     <w:p>
       <w:pPr>
         <w:rPr>
-          <w:b/>
-          <w:sz w:val="40"/>
-          <w:szCs w:val="40"/>
-          <w:lang w:val="en-US"/>
-        </w:rPr>
-      </w:pPr>
-      <w:r>
-        <w:rPr>
-          <w:b/>
-          <w:sz w:val="40"/>
-          <w:szCs w:val="40"/>
-          <w:lang w:val="en-US"/>
-        </w:rPr>
-        <w:t>STUDENT NUMBER: ST10486705</w:t>
-      </w:r>
-    </w:p>
-    <w:p>
-      <w:pPr>
-        <w:rPr>
-          <w:b/>
-          <w:sz w:val="40"/>
-          <w:szCs w:val="40"/>
-          <w:lang w:val="en-US"/>
-        </w:rPr>
-      </w:pPr>
-      <w:r>
-        <w:rPr>
-          <w:b/>
-          <w:sz w:val="40"/>
-          <w:szCs w:val="40"/>
-          <w:lang w:val="en-US"/>
-        </w:rPr>
-        <w:t>NAME &amp; SURNAME: KUPA LEMOGANG</w:t>
-      </w:r>
-    </w:p>
-    <w:p>
-      <w:pPr>
-        <w:rPr>
-          <w:b/>
-          <w:sz w:val="40"/>
-          <w:szCs w:val="40"/>
-          <w:lang w:val="en-US"/>
-        </w:rPr>
-      </w:pPr>
-      <w:r>
-        <w:rPr>
-          <w:b/>
-          <w:sz w:val="40"/>
-          <w:szCs w:val="40"/>
-          <w:lang w:val="en-US"/>
-        </w:rPr>
-        <w:t>MODULE NAME: PROGRAMMING 2B</w:t>
-      </w:r>
-    </w:p>
-    <w:p>
-      <w:pPr>
-        <w:rPr>
-          <w:b/>
-          <w:sz w:val="40"/>
-          <w:szCs w:val="40"/>
-          <w:lang w:val="en-US"/>
-        </w:rPr>
-      </w:pPr>
-      <w:r>
-        <w:rPr>
-          <w:b/>
-          <w:sz w:val="40"/>
-          <w:szCs w:val="40"/>
-          <w:lang w:val="en-US"/>
-        </w:rPr>
-        <w:t>MODULE CODE: PROG6212/W</w:t>
-      </w:r>
-    </w:p>
-    <w:p>
-      <w:pPr>
-        <w:rPr>
-          <w:lang w:val="en-US"/>
-        </w:rPr>
-      </w:pPr>
-    </w:p>
-    <w:p>
-      <w:pPr>
-        <w:rPr>
-          <w:lang w:val="en-US"/>
-        </w:rPr>
-      </w:pPr>
-    </w:p>
-    <w:p>
-      <w:pPr>
-        <w:rPr>
-          <w:lang w:val="en-US"/>
-        </w:rPr>
-      </w:pPr>
-    </w:p>
-    <w:p>
-      <w:pPr>
-        <w:rPr>
-          <w:lang w:val="en-US"/>
-        </w:rPr>
-      </w:pPr>
-    </w:p>
-    <w:p>
-      <w:pPr>
-        <w:rPr>
-          <w:lang w:val="en-US"/>
-        </w:rPr>
-      </w:pPr>
-    </w:p>
-    <w:p>
-      <w:pPr>
-        <w:rPr>
+          <w:lang w:val="en-US"/>
+        </w:rPr>
+      </w:pPr>
+    </w:p>
+    <w:p>
+      <w:pPr>
+        <w:rPr>
+          <w:lang w:val="en-US"/>
+        </w:rPr>
+      </w:pPr>
+    </w:p>
+    <w:p>
+      <w:pPr>
+        <w:rPr>
+          <w:lang w:val="en-US"/>
+        </w:rPr>
+      </w:pPr>
+    </w:p>
+    <w:p>
+      <w:pPr>
+        <w:ind w:left="1440" w:firstLine="720"/>
+        <w:rPr>
+          <w:b/>
+          <w:sz w:val="36"/>
+          <w:szCs w:val="36"/>
+          <w:lang w:val="en-US"/>
+        </w:rPr>
+      </w:pPr>
+      <w:r>
+        <w:rPr>
+          <w:b/>
+          <w:sz w:val="36"/>
+          <w:szCs w:val="36"/>
+          <w:lang w:val="en-US"/>
+        </w:rPr>
+        <w:lastRenderedPageBreak/>
+        <w:t>TABLE OF CONTENT</w:t>
+      </w:r>
+    </w:p>
+    <w:p>
+      <w:pPr>
+        <w:ind w:left="1440" w:firstLine="720"/>
+        <w:rPr>
+          <w:b/>
+          <w:sz w:val="36"/>
+          <w:szCs w:val="36"/>
+          <w:lang w:val="en-US"/>
+        </w:rPr>
+      </w:pPr>
+    </w:p>
+    <w:p>
+      <w:pPr>
+        <w:rPr>
+          <w:b/>
+          <w:lang w:val="en-US"/>
+        </w:rPr>
+      </w:pPr>
+      <w:r>
+        <w:rPr>
+          <w:b/>
+          <w:lang w:val="en-US"/>
+        </w:rPr>
+        <w:t>AUTHENTICATION------------------------------------------------------------------------------</w:t>
+      </w:r>
+    </w:p>
+    <w:p>
+      <w:pPr>
+        <w:rPr>
+          <w:b/>
+          <w:lang w:val="en-US"/>
+        </w:rPr>
+      </w:pPr>
+      <w:r>
+        <w:rPr>
+          <w:b/>
+          <w:lang w:val="en-US"/>
+        </w:rPr>
+        <w:t>EVENTS--------------------------------------------------------------------------------------------</w:t>
+      </w:r>
+    </w:p>
+    <w:p>
+      <w:pPr>
+        <w:rPr>
+          <w:b/>
+          <w:lang w:val="en-US"/>
+        </w:rPr>
+      </w:pPr>
+      <w:r>
+        <w:rPr>
+          <w:b/>
+          <w:lang w:val="en-US"/>
+        </w:rPr>
+        <w:t>USER PROFILE------------------------------------------------------------------------------------</w:t>
+      </w:r>
+    </w:p>
+    <w:p>
+      <w:pPr>
+        <w:rPr>
+          <w:b/>
+          <w:lang w:val="en-US"/>
+        </w:rPr>
+      </w:pPr>
+      <w:r>
+        <w:rPr>
+          <w:b/>
+          <w:lang w:val="en-US"/>
+        </w:rPr>
+        <w:t>CATEGORYENROLMENT-----------------------------------------------------------------------</w:t>
+      </w:r>
+    </w:p>
+    <w:p>
+      <w:pPr>
+        <w:rPr>
+          <w:b/>
+          <w:lang w:val="en-US"/>
+        </w:rPr>
+      </w:pPr>
+      <w:r>
+        <w:rPr>
+          <w:b/>
+          <w:lang w:val="en-US"/>
+        </w:rPr>
+        <w:t>RESULT----------------------------------------------------------------------------------------------</w:t>
+      </w:r>
+    </w:p>
+    <w:p>
+      <w:pPr>
+        <w:rPr>
+          <w:b/>
           <w:lang w:val="en-US"/>
         </w:rPr>
       </w:pPr>

</xml_diff>

<commit_message>
Created 6 heading for each graph
</commit_message>
<xml_diff>
--- a/docs/RaceDay_API_Endpoint_Plan.docx
+++ b/docs/RaceDay_API_Endpoint_Plan.docx
@@ -39,6 +39,24 @@
     </w:p>
     <w:p>
       <w:pPr>
+        <w:ind w:left="720" w:firstLine="720"/>
+        <w:rPr>
+          <w:sz w:val="52"/>
+          <w:szCs w:val="52"/>
+          <w:lang w:val="en-US"/>
+        </w:rPr>
+      </w:pPr>
+      <w:r>
+        <w:rPr>
+          <w:sz w:val="52"/>
+          <w:szCs w:val="52"/>
+          <w:lang w:val="en-US"/>
+        </w:rPr>
+        <w:t>Section B – API Endpoint Plan</w:t>
+      </w:r>
+    </w:p>
+    <w:p>
+      <w:pPr>
         <w:rPr>
           <w:lang w:val="en-US"/>
         </w:rPr>
@@ -217,325 +235,436 @@
           <w:lang w:val="en-US"/>
         </w:rPr>
       </w:pPr>
+    </w:p>
+    <w:p>
+      <w:pPr>
+        <w:rPr>
+          <w:lang w:val="en-US"/>
+        </w:rPr>
+      </w:pPr>
+    </w:p>
+    <w:p>
+      <w:pPr>
+        <w:rPr>
+          <w:lang w:val="en-US"/>
+        </w:rPr>
+      </w:pPr>
+    </w:p>
+    <w:p>
+      <w:pPr>
+        <w:rPr>
+          <w:lang w:val="en-US"/>
+        </w:rPr>
+      </w:pPr>
+    </w:p>
+    <w:p>
+      <w:pPr>
+        <w:rPr>
+          <w:lang w:val="en-US"/>
+        </w:rPr>
+      </w:pPr>
+    </w:p>
+    <w:p>
+      <w:pPr>
+        <w:ind w:left="1440" w:firstLine="720"/>
+        <w:rPr>
+          <w:b/>
+          <w:sz w:val="36"/>
+          <w:szCs w:val="36"/>
+          <w:lang w:val="en-US"/>
+        </w:rPr>
+      </w:pPr>
+      <w:r>
+        <w:rPr>
+          <w:b/>
+          <w:sz w:val="36"/>
+          <w:szCs w:val="36"/>
+          <w:lang w:val="en-US"/>
+        </w:rPr>
+        <w:t>TABLE OF CONTENT</w:t>
+      </w:r>
+    </w:p>
+    <w:p>
+      <w:pPr>
+        <w:ind w:left="1440" w:firstLine="720"/>
+        <w:rPr>
+          <w:b/>
+          <w:sz w:val="36"/>
+          <w:szCs w:val="36"/>
+          <w:lang w:val="en-US"/>
+        </w:rPr>
+      </w:pPr>
+    </w:p>
+    <w:p>
+      <w:pPr>
+        <w:rPr>
+          <w:b/>
+          <w:lang w:val="en-US"/>
+        </w:rPr>
+      </w:pPr>
+      <w:r>
+        <w:rPr>
+          <w:b/>
+          <w:lang w:val="en-US"/>
+        </w:rPr>
+        <w:t>AUTHENTICATION------------------------------------------------------------------------------</w:t>
+      </w:r>
+    </w:p>
+    <w:p>
+      <w:pPr>
+        <w:rPr>
+          <w:b/>
+          <w:lang w:val="en-US"/>
+        </w:rPr>
+      </w:pPr>
+      <w:r>
+        <w:rPr>
+          <w:b/>
+          <w:lang w:val="en-US"/>
+        </w:rPr>
+        <w:t>EVENTS--------------------------------------------------------------------------------------------</w:t>
+      </w:r>
+    </w:p>
+    <w:p>
+      <w:pPr>
+        <w:rPr>
+          <w:b/>
+          <w:lang w:val="en-US"/>
+        </w:rPr>
+      </w:pPr>
+      <w:r>
+        <w:rPr>
+          <w:b/>
+          <w:lang w:val="en-US"/>
+        </w:rPr>
+        <w:t>USER PROFILE------------------------------------------------------------------------------------</w:t>
+      </w:r>
+    </w:p>
+    <w:p>
+      <w:pPr>
+        <w:rPr>
+          <w:b/>
+          <w:lang w:val="en-US"/>
+        </w:rPr>
+      </w:pPr>
+      <w:r>
+        <w:rPr>
+          <w:b/>
+          <w:lang w:val="en-US"/>
+        </w:rPr>
+        <w:t>CATEGORY</w:t>
+      </w:r>
+      <w:r>
+        <w:rPr>
+          <w:b/>
+          <w:lang w:val="en-US"/>
+        </w:rPr>
+        <w:t>----------------------------------------------------------------------------------------</w:t>
+      </w:r>
+    </w:p>
+    <w:p>
+      <w:pPr>
+        <w:rPr>
+          <w:b/>
+          <w:lang w:val="en-US"/>
+        </w:rPr>
+      </w:pPr>
+      <w:r>
+        <w:rPr>
+          <w:b/>
+          <w:lang w:val="en-US"/>
+        </w:rPr>
+        <w:t>ENROLMENT--------</w:t>
+      </w:r>
+      <w:r>
+        <w:rPr>
+          <w:b/>
+          <w:lang w:val="en-US"/>
+        </w:rPr>
+        <w:t>--------------</w:t>
+      </w:r>
+      <w:r>
+        <w:rPr>
+          <w:b/>
+          <w:lang w:val="en-US"/>
+        </w:rPr>
+        <w:t>---------------------------------------------------------------</w:t>
+      </w:r>
+    </w:p>
+    <w:p>
+      <w:pPr>
+        <w:rPr>
+          <w:b/>
+          <w:lang w:val="en-US"/>
+        </w:rPr>
+      </w:pPr>
+      <w:r>
+        <w:rPr>
+          <w:b/>
+          <w:lang w:val="en-US"/>
+        </w:rPr>
+        <w:t>RESULT--------------------------------------------------------------</w:t>
+      </w:r>
+      <w:r>
+        <w:rPr>
+          <w:b/>
+          <w:lang w:val="en-US"/>
+        </w:rPr>
+        <w:t>-------------------------------</w:t>
+      </w:r>
+    </w:p>
+    <w:p>
+      <w:pPr>
+        <w:rPr>
+          <w:b/>
+          <w:lang w:val="en-US"/>
+        </w:rPr>
+      </w:pPr>
+    </w:p>
+    <w:p>
+      <w:pPr>
+        <w:rPr>
+          <w:lang w:val="en-US"/>
+        </w:rPr>
+      </w:pPr>
+    </w:p>
+    <w:p>
+      <w:pPr>
+        <w:rPr>
+          <w:lang w:val="en-US"/>
+        </w:rPr>
+      </w:pPr>
+    </w:p>
+    <w:p>
+      <w:pPr>
+        <w:rPr>
+          <w:lang w:val="en-US"/>
+        </w:rPr>
+      </w:pPr>
+    </w:p>
+    <w:p>
+      <w:pPr>
+        <w:rPr>
+          <w:lang w:val="en-US"/>
+        </w:rPr>
+      </w:pPr>
+    </w:p>
+    <w:p>
+      <w:pPr>
+        <w:rPr>
+          <w:lang w:val="en-US"/>
+        </w:rPr>
+      </w:pPr>
+    </w:p>
+    <w:p>
+      <w:pPr>
+        <w:rPr>
+          <w:lang w:val="en-US"/>
+        </w:rPr>
+      </w:pPr>
+    </w:p>
+    <w:p>
+      <w:pPr>
+        <w:rPr>
+          <w:lang w:val="en-US"/>
+        </w:rPr>
+      </w:pPr>
+    </w:p>
+    <w:p>
+      <w:pPr>
+        <w:rPr>
+          <w:lang w:val="en-US"/>
+        </w:rPr>
+      </w:pPr>
+    </w:p>
+    <w:p>
+      <w:pPr>
+        <w:rPr>
+          <w:lang w:val="en-US"/>
+        </w:rPr>
+      </w:pPr>
+    </w:p>
+    <w:p>
+      <w:pPr>
+        <w:rPr>
+          <w:lang w:val="en-US"/>
+        </w:rPr>
+      </w:pPr>
+    </w:p>
+    <w:p>
+      <w:pPr>
+        <w:rPr>
+          <w:lang w:val="en-US"/>
+        </w:rPr>
+      </w:pPr>
+    </w:p>
+    <w:p>
+      <w:pPr>
+        <w:rPr>
+          <w:lang w:val="en-US"/>
+        </w:rPr>
+      </w:pPr>
+    </w:p>
+    <w:p>
+      <w:pPr>
+        <w:rPr>
+          <w:lang w:val="en-US"/>
+        </w:rPr>
+      </w:pPr>
+    </w:p>
+    <w:p>
+      <w:pPr>
+        <w:rPr>
+          <w:lang w:val="en-US"/>
+        </w:rPr>
+      </w:pPr>
+    </w:p>
+    <w:p>
+      <w:pPr>
+        <w:rPr>
+          <w:lang w:val="en-US"/>
+        </w:rPr>
+      </w:pPr>
+    </w:p>
+    <w:p>
+      <w:pPr>
+        <w:rPr>
+          <w:lang w:val="en-US"/>
+        </w:rPr>
+      </w:pPr>
+    </w:p>
+    <w:p>
+      <w:pPr>
+        <w:rPr>
+          <w:lang w:val="en-US"/>
+        </w:rPr>
+      </w:pPr>
+    </w:p>
+    <w:p>
+      <w:pPr>
+        <w:rPr>
+          <w:lang w:val="en-US"/>
+        </w:rPr>
+      </w:pPr>
+    </w:p>
+    <w:p>
+      <w:pPr>
+        <w:rPr>
+          <w:lang w:val="en-US"/>
+        </w:rPr>
+      </w:pPr>
+    </w:p>
+    <w:p>
+      <w:pPr>
+        <w:rPr>
+          <w:lang w:val="en-US"/>
+        </w:rPr>
+      </w:pPr>
+    </w:p>
+    <w:p>
+      <w:pPr>
+        <w:rPr>
+          <w:lang w:val="en-US"/>
+        </w:rPr>
+      </w:pPr>
+    </w:p>
+    <w:p>
+      <w:pPr>
+        <w:rPr>
+          <w:lang w:val="en-US"/>
+        </w:rPr>
+      </w:pPr>
+    </w:p>
+    <w:p>
+      <w:pPr>
+        <w:rPr>
+          <w:b/>
+          <w:lang w:val="en-US"/>
+        </w:rPr>
+      </w:pPr>
+      <w:r>
+        <w:rPr>
+          <w:b/>
+          <w:lang w:val="en-US"/>
+        </w:rPr>
+        <w:t>AUTHENTICATION</w:t>
+      </w:r>
+    </w:p>
+    <w:p>
+      <w:pPr>
+        <w:rPr>
+          <w:b/>
+          <w:lang w:val="en-US"/>
+        </w:rPr>
+      </w:pPr>
+      <w:r>
+        <w:rPr>
+          <w:b/>
+          <w:lang w:val="en-US"/>
+        </w:rPr>
+        <w:t>EVENTS</w:t>
+      </w:r>
       <w:bookmarkStart w:id="0" w:name="_GoBack"/>
       <w:bookmarkEnd w:id="0"/>
     </w:p>
     <w:p>
       <w:pPr>
         <w:rPr>
-          <w:lang w:val="en-US"/>
-        </w:rPr>
-      </w:pPr>
-    </w:p>
-    <w:p>
-      <w:pPr>
-        <w:rPr>
-          <w:lang w:val="en-US"/>
-        </w:rPr>
-      </w:pPr>
-    </w:p>
-    <w:p>
-      <w:pPr>
-        <w:rPr>
-          <w:lang w:val="en-US"/>
-        </w:rPr>
-      </w:pPr>
-    </w:p>
-    <w:p>
-      <w:pPr>
-        <w:rPr>
-          <w:lang w:val="en-US"/>
-        </w:rPr>
-      </w:pPr>
-    </w:p>
-    <w:p>
-      <w:pPr>
-        <w:ind w:left="1440" w:firstLine="720"/>
-        <w:rPr>
-          <w:b/>
-          <w:sz w:val="36"/>
-          <w:szCs w:val="36"/>
-          <w:lang w:val="en-US"/>
-        </w:rPr>
-      </w:pPr>
-      <w:r>
-        <w:rPr>
-          <w:b/>
-          <w:sz w:val="36"/>
-          <w:szCs w:val="36"/>
-          <w:lang w:val="en-US"/>
-        </w:rPr>
-        <w:lastRenderedPageBreak/>
-        <w:t>TABLE OF CONTENT</w:t>
-      </w:r>
-    </w:p>
-    <w:p>
-      <w:pPr>
-        <w:ind w:left="1440" w:firstLine="720"/>
-        <w:rPr>
-          <w:b/>
-          <w:sz w:val="36"/>
-          <w:szCs w:val="36"/>
-          <w:lang w:val="en-US"/>
-        </w:rPr>
-      </w:pPr>
-    </w:p>
-    <w:p>
-      <w:pPr>
-        <w:rPr>
-          <w:b/>
-          <w:lang w:val="en-US"/>
-        </w:rPr>
-      </w:pPr>
-      <w:r>
-        <w:rPr>
-          <w:b/>
-          <w:lang w:val="en-US"/>
-        </w:rPr>
-        <w:t>AUTHENTICATION------------------------------------------------------------------------------</w:t>
-      </w:r>
-    </w:p>
-    <w:p>
-      <w:pPr>
-        <w:rPr>
-          <w:b/>
-          <w:lang w:val="en-US"/>
-        </w:rPr>
-      </w:pPr>
-      <w:r>
-        <w:rPr>
-          <w:b/>
-          <w:lang w:val="en-US"/>
-        </w:rPr>
-        <w:t>EVENTS--------------------------------------------------------------------------------------------</w:t>
-      </w:r>
-    </w:p>
-    <w:p>
-      <w:pPr>
-        <w:rPr>
-          <w:b/>
-          <w:lang w:val="en-US"/>
-        </w:rPr>
-      </w:pPr>
-      <w:r>
-        <w:rPr>
-          <w:b/>
-          <w:lang w:val="en-US"/>
-        </w:rPr>
-        <w:t>USER PROFILE------------------------------------------------------------------------------------</w:t>
-      </w:r>
-    </w:p>
-    <w:p>
-      <w:pPr>
-        <w:rPr>
-          <w:b/>
-          <w:lang w:val="en-US"/>
-        </w:rPr>
-      </w:pPr>
-      <w:r>
-        <w:rPr>
-          <w:b/>
-          <w:lang w:val="en-US"/>
-        </w:rPr>
-        <w:t>CATEGORYENROLMENT-----------------------------------------------------------------------</w:t>
-      </w:r>
-    </w:p>
-    <w:p>
-      <w:pPr>
-        <w:rPr>
-          <w:b/>
-          <w:lang w:val="en-US"/>
-        </w:rPr>
-      </w:pPr>
-      <w:r>
-        <w:rPr>
-          <w:b/>
-          <w:lang w:val="en-US"/>
-        </w:rPr>
-        <w:t>RESULT----------------------------------------------------------------------------------------------</w:t>
-      </w:r>
-    </w:p>
-    <w:p>
-      <w:pPr>
-        <w:rPr>
-          <w:b/>
-          <w:lang w:val="en-US"/>
-        </w:rPr>
-      </w:pPr>
-    </w:p>
-    <w:p>
-      <w:pPr>
-        <w:rPr>
-          <w:lang w:val="en-US"/>
-        </w:rPr>
-      </w:pPr>
-    </w:p>
-    <w:p>
-      <w:pPr>
-        <w:rPr>
-          <w:lang w:val="en-US"/>
-        </w:rPr>
-      </w:pPr>
-    </w:p>
-    <w:p>
-      <w:pPr>
-        <w:rPr>
-          <w:lang w:val="en-US"/>
-        </w:rPr>
-      </w:pPr>
-    </w:p>
-    <w:p>
-      <w:pPr>
-        <w:rPr>
-          <w:lang w:val="en-US"/>
-        </w:rPr>
-      </w:pPr>
-    </w:p>
-    <w:p>
-      <w:pPr>
-        <w:rPr>
-          <w:lang w:val="en-US"/>
-        </w:rPr>
-      </w:pPr>
-    </w:p>
-    <w:p>
-      <w:pPr>
-        <w:rPr>
-          <w:lang w:val="en-US"/>
-        </w:rPr>
-      </w:pPr>
-    </w:p>
-    <w:p>
-      <w:pPr>
-        <w:rPr>
-          <w:lang w:val="en-US"/>
-        </w:rPr>
-      </w:pPr>
-    </w:p>
-    <w:p>
-      <w:pPr>
-        <w:rPr>
-          <w:lang w:val="en-US"/>
-        </w:rPr>
-      </w:pPr>
-    </w:p>
-    <w:p>
-      <w:pPr>
-        <w:rPr>
-          <w:lang w:val="en-US"/>
-        </w:rPr>
-      </w:pPr>
-    </w:p>
-    <w:p>
-      <w:pPr>
-        <w:rPr>
-          <w:lang w:val="en-US"/>
-        </w:rPr>
-      </w:pPr>
-    </w:p>
-    <w:p>
-      <w:pPr>
-        <w:rPr>
-          <w:lang w:val="en-US"/>
-        </w:rPr>
-      </w:pPr>
-    </w:p>
-    <w:p>
-      <w:pPr>
-        <w:rPr>
-          <w:lang w:val="en-US"/>
-        </w:rPr>
-      </w:pPr>
-    </w:p>
-    <w:p>
-      <w:pPr>
-        <w:rPr>
-          <w:lang w:val="en-US"/>
-        </w:rPr>
-      </w:pPr>
-    </w:p>
-    <w:p>
-      <w:pPr>
-        <w:rPr>
-          <w:lang w:val="en-US"/>
-        </w:rPr>
-      </w:pPr>
-    </w:p>
-    <w:p>
-      <w:pPr>
-        <w:rPr>
-          <w:lang w:val="en-US"/>
-        </w:rPr>
-      </w:pPr>
-    </w:p>
-    <w:p>
-      <w:pPr>
-        <w:rPr>
-          <w:lang w:val="en-US"/>
-        </w:rPr>
-      </w:pPr>
-    </w:p>
-    <w:p>
-      <w:pPr>
-        <w:rPr>
-          <w:lang w:val="en-US"/>
-        </w:rPr>
-      </w:pPr>
-    </w:p>
-    <w:p>
-      <w:pPr>
-        <w:rPr>
-          <w:lang w:val="en-US"/>
-        </w:rPr>
-      </w:pPr>
-    </w:p>
-    <w:p>
-      <w:pPr>
-        <w:rPr>
-          <w:lang w:val="en-US"/>
-        </w:rPr>
-      </w:pPr>
-    </w:p>
-    <w:p>
-      <w:pPr>
-        <w:rPr>
-          <w:lang w:val="en-US"/>
-        </w:rPr>
-      </w:pPr>
-    </w:p>
-    <w:p>
-      <w:pPr>
-        <w:rPr>
-          <w:lang w:val="en-US"/>
-        </w:rPr>
-      </w:pPr>
-    </w:p>
-    <w:p>
-      <w:pPr>
-        <w:rPr>
-          <w:lang w:val="en-US"/>
-        </w:rPr>
-      </w:pPr>
-      <w:r>
-        <w:rPr>
-          <w:lang w:val="en-US"/>
-        </w:rPr>
-        <w:t>Section B – API Endpoint Plan</w:t>
-      </w:r>
-    </w:p>
-    <w:p>
-      <w:pPr>
-        <w:rPr>
-          <w:lang w:val="en-US"/>
-        </w:rPr>
-      </w:pPr>
-    </w:p>
-    <w:p>
-      <w:pPr>
-        <w:rPr>
-          <w:lang w:val="en-US"/>
-        </w:rPr>
-      </w:pPr>
+          <w:b/>
+          <w:lang w:val="en-US"/>
+        </w:rPr>
+      </w:pPr>
+      <w:r>
+        <w:rPr>
+          <w:b/>
+          <w:lang w:val="en-US"/>
+        </w:rPr>
+        <w:t>USER PROFILE</w:t>
+      </w:r>
+    </w:p>
+    <w:p>
+      <w:pPr>
+        <w:rPr>
+          <w:b/>
+          <w:lang w:val="en-US"/>
+        </w:rPr>
+      </w:pPr>
+      <w:r>
+        <w:rPr>
+          <w:b/>
+          <w:lang w:val="en-US"/>
+        </w:rPr>
+        <w:t>CATEGORY</w:t>
+      </w:r>
+    </w:p>
+    <w:p>
+      <w:pPr>
+        <w:rPr>
+          <w:b/>
+          <w:lang w:val="en-US"/>
+        </w:rPr>
+      </w:pPr>
+      <w:r>
+        <w:rPr>
+          <w:b/>
+          <w:lang w:val="en-US"/>
+        </w:rPr>
+        <w:t>ENROLMENT</w:t>
+      </w:r>
+    </w:p>
+    <w:p>
+      <w:pPr>
+        <w:rPr>
+          <w:lang w:val="en-US"/>
+        </w:rPr>
+      </w:pPr>
+      <w:r>
+        <w:rPr>
+          <w:b/>
+          <w:lang w:val="en-US"/>
+        </w:rPr>
+        <w:t>RESULT</w:t>
+      </w:r>
     </w:p>
     <w:sectPr>
       <w:pgSz w:w="11906" w:h="16838"/>
@@ -990,6 +1119,7 @@
   <w:style w:type="paragraph" w:default="1" w:styleId="Normal">
     <w:name w:val="Normal"/>
     <w:qFormat/>
+    <w:rsid w:val="00277166"/>
   </w:style>
   <w:style w:type="character" w:default="1" w:styleId="DefaultParagraphFont">
     <w:name w:val="Default Paragraph Font"/>

</xml_diff>

<commit_message>
Created 6 graphs under each heading
</commit_message>
<xml_diff>
--- a/docs/RaceDay_API_Endpoint_Plan.docx
+++ b/docs/RaceDay_API_Endpoint_Plan.docx
@@ -597,6 +597,293 @@
           <w:lang w:val="en-US"/>
         </w:rPr>
       </w:pPr>
+    </w:p>
+    <w:p>
+      <w:pPr>
+        <w:rPr>
+          <w:b/>
+          <w:lang w:val="en-US"/>
+        </w:rPr>
+      </w:pPr>
+    </w:p>
+    <w:p>
+      <w:pPr>
+        <w:rPr>
+          <w:b/>
+          <w:lang w:val="en-US"/>
+        </w:rPr>
+      </w:pPr>
+    </w:p>
+    <w:tbl>
+      <w:tblPr>
+        <w:tblStyle w:val="TableGrid"/>
+        <w:tblW w:w="0" w:type="auto"/>
+        <w:tblLook w:val="04A0" w:firstRow="1" w:lastRow="0" w:firstColumn="1" w:lastColumn="0" w:noHBand="0" w:noVBand="1"/>
+      </w:tblPr>
+      <w:tblGrid>
+        <w:gridCol w:w="1503"/>
+        <w:gridCol w:w="1503"/>
+        <w:gridCol w:w="1502"/>
+        <w:gridCol w:w="1502"/>
+        <w:gridCol w:w="1503"/>
+        <w:gridCol w:w="1503"/>
+      </w:tblGrid>
+      <w:tr>
+        <w:tc>
+          <w:tcPr>
+            <w:tcW w:w="1503" w:type="dxa"/>
+          </w:tcPr>
+          <w:p>
+            <w:pPr>
+              <w:rPr>
+                <w:b/>
+                <w:lang w:val="en-US"/>
+              </w:rPr>
+            </w:pPr>
+          </w:p>
+        </w:tc>
+        <w:tc>
+          <w:tcPr>
+            <w:tcW w:w="1503" w:type="dxa"/>
+          </w:tcPr>
+          <w:p>
+            <w:pPr>
+              <w:rPr>
+                <w:b/>
+                <w:lang w:val="en-US"/>
+              </w:rPr>
+            </w:pPr>
+          </w:p>
+        </w:tc>
+        <w:tc>
+          <w:tcPr>
+            <w:tcW w:w="1502" w:type="dxa"/>
+          </w:tcPr>
+          <w:p>
+            <w:pPr>
+              <w:rPr>
+                <w:b/>
+                <w:lang w:val="en-US"/>
+              </w:rPr>
+            </w:pPr>
+          </w:p>
+        </w:tc>
+        <w:tc>
+          <w:tcPr>
+            <w:tcW w:w="1502" w:type="dxa"/>
+          </w:tcPr>
+          <w:p>
+            <w:pPr>
+              <w:rPr>
+                <w:b/>
+                <w:lang w:val="en-US"/>
+              </w:rPr>
+            </w:pPr>
+          </w:p>
+        </w:tc>
+        <w:tc>
+          <w:tcPr>
+            <w:tcW w:w="1503" w:type="dxa"/>
+          </w:tcPr>
+          <w:p>
+            <w:pPr>
+              <w:rPr>
+                <w:b/>
+                <w:lang w:val="en-US"/>
+              </w:rPr>
+            </w:pPr>
+          </w:p>
+        </w:tc>
+        <w:tc>
+          <w:tcPr>
+            <w:tcW w:w="1503" w:type="dxa"/>
+          </w:tcPr>
+          <w:p>
+            <w:pPr>
+              <w:rPr>
+                <w:b/>
+                <w:lang w:val="en-US"/>
+              </w:rPr>
+            </w:pPr>
+          </w:p>
+        </w:tc>
+      </w:tr>
+      <w:tr>
+        <w:tc>
+          <w:tcPr>
+            <w:tcW w:w="1503" w:type="dxa"/>
+          </w:tcPr>
+          <w:p>
+            <w:pPr>
+              <w:rPr>
+                <w:b/>
+                <w:lang w:val="en-US"/>
+              </w:rPr>
+            </w:pPr>
+          </w:p>
+        </w:tc>
+        <w:tc>
+          <w:tcPr>
+            <w:tcW w:w="1503" w:type="dxa"/>
+          </w:tcPr>
+          <w:p>
+            <w:pPr>
+              <w:rPr>
+                <w:b/>
+                <w:lang w:val="en-US"/>
+              </w:rPr>
+            </w:pPr>
+          </w:p>
+        </w:tc>
+        <w:tc>
+          <w:tcPr>
+            <w:tcW w:w="1502" w:type="dxa"/>
+          </w:tcPr>
+          <w:p>
+            <w:pPr>
+              <w:rPr>
+                <w:b/>
+                <w:lang w:val="en-US"/>
+              </w:rPr>
+            </w:pPr>
+          </w:p>
+        </w:tc>
+        <w:tc>
+          <w:tcPr>
+            <w:tcW w:w="1502" w:type="dxa"/>
+          </w:tcPr>
+          <w:p>
+            <w:pPr>
+              <w:rPr>
+                <w:b/>
+                <w:lang w:val="en-US"/>
+              </w:rPr>
+            </w:pPr>
+          </w:p>
+        </w:tc>
+        <w:tc>
+          <w:tcPr>
+            <w:tcW w:w="1503" w:type="dxa"/>
+          </w:tcPr>
+          <w:p>
+            <w:pPr>
+              <w:rPr>
+                <w:b/>
+                <w:lang w:val="en-US"/>
+              </w:rPr>
+            </w:pPr>
+          </w:p>
+        </w:tc>
+        <w:tc>
+          <w:tcPr>
+            <w:tcW w:w="1503" w:type="dxa"/>
+          </w:tcPr>
+          <w:p>
+            <w:pPr>
+              <w:rPr>
+                <w:b/>
+                <w:lang w:val="en-US"/>
+              </w:rPr>
+            </w:pPr>
+          </w:p>
+        </w:tc>
+      </w:tr>
+      <w:tr>
+        <w:tc>
+          <w:tcPr>
+            <w:tcW w:w="1503" w:type="dxa"/>
+          </w:tcPr>
+          <w:p>
+            <w:pPr>
+              <w:rPr>
+                <w:b/>
+                <w:lang w:val="en-US"/>
+              </w:rPr>
+            </w:pPr>
+          </w:p>
+        </w:tc>
+        <w:tc>
+          <w:tcPr>
+            <w:tcW w:w="1503" w:type="dxa"/>
+          </w:tcPr>
+          <w:p>
+            <w:pPr>
+              <w:rPr>
+                <w:b/>
+                <w:lang w:val="en-US"/>
+              </w:rPr>
+            </w:pPr>
+          </w:p>
+        </w:tc>
+        <w:tc>
+          <w:tcPr>
+            <w:tcW w:w="1502" w:type="dxa"/>
+          </w:tcPr>
+          <w:p>
+            <w:pPr>
+              <w:rPr>
+                <w:b/>
+                <w:lang w:val="en-US"/>
+              </w:rPr>
+            </w:pPr>
+          </w:p>
+        </w:tc>
+        <w:tc>
+          <w:tcPr>
+            <w:tcW w:w="1502" w:type="dxa"/>
+          </w:tcPr>
+          <w:p>
+            <w:pPr>
+              <w:rPr>
+                <w:b/>
+                <w:lang w:val="en-US"/>
+              </w:rPr>
+            </w:pPr>
+          </w:p>
+        </w:tc>
+        <w:tc>
+          <w:tcPr>
+            <w:tcW w:w="1503" w:type="dxa"/>
+          </w:tcPr>
+          <w:p>
+            <w:pPr>
+              <w:rPr>
+                <w:b/>
+                <w:lang w:val="en-US"/>
+              </w:rPr>
+            </w:pPr>
+          </w:p>
+        </w:tc>
+        <w:tc>
+          <w:tcPr>
+            <w:tcW w:w="1503" w:type="dxa"/>
+          </w:tcPr>
+          <w:p>
+            <w:pPr>
+              <w:rPr>
+                <w:b/>
+                <w:lang w:val="en-US"/>
+              </w:rPr>
+            </w:pPr>
+          </w:p>
+        </w:tc>
+      </w:tr>
+    </w:tbl>
+    <w:p>
+      <w:pPr>
+        <w:rPr>
+          <w:b/>
+          <w:lang w:val="en-US"/>
+        </w:rPr>
+      </w:pPr>
+    </w:p>
+    <w:p>
+      <w:pPr>
+        <w:rPr>
+          <w:b/>
+          <w:lang w:val="en-US"/>
+        </w:rPr>
+      </w:pPr>
       <w:r>
         <w:rPr>
           <w:b/>
@@ -604,8 +891,357 @@
         </w:rPr>
         <w:t>EVENTS</w:t>
       </w:r>
-      <w:bookmarkStart w:id="0" w:name="_GoBack"/>
-      <w:bookmarkEnd w:id="0"/>
+    </w:p>
+    <w:tbl>
+      <w:tblPr>
+        <w:tblStyle w:val="TableGrid"/>
+        <w:tblW w:w="0" w:type="auto"/>
+        <w:tblLook w:val="04A0" w:firstRow="1" w:lastRow="0" w:firstColumn="1" w:lastColumn="0" w:noHBand="0" w:noVBand="1"/>
+      </w:tblPr>
+      <w:tblGrid>
+        <w:gridCol w:w="1502"/>
+        <w:gridCol w:w="1502"/>
+        <w:gridCol w:w="1503"/>
+        <w:gridCol w:w="1503"/>
+        <w:gridCol w:w="1503"/>
+        <w:gridCol w:w="1503"/>
+      </w:tblGrid>
+      <w:tr>
+        <w:tc>
+          <w:tcPr>
+            <w:tcW w:w="1502" w:type="dxa"/>
+          </w:tcPr>
+          <w:p>
+            <w:pPr>
+              <w:rPr>
+                <w:b/>
+                <w:lang w:val="en-US"/>
+              </w:rPr>
+            </w:pPr>
+          </w:p>
+        </w:tc>
+        <w:tc>
+          <w:tcPr>
+            <w:tcW w:w="1502" w:type="dxa"/>
+          </w:tcPr>
+          <w:p>
+            <w:pPr>
+              <w:rPr>
+                <w:b/>
+                <w:lang w:val="en-US"/>
+              </w:rPr>
+            </w:pPr>
+          </w:p>
+        </w:tc>
+        <w:tc>
+          <w:tcPr>
+            <w:tcW w:w="1503" w:type="dxa"/>
+          </w:tcPr>
+          <w:p>
+            <w:pPr>
+              <w:rPr>
+                <w:b/>
+                <w:lang w:val="en-US"/>
+              </w:rPr>
+            </w:pPr>
+          </w:p>
+        </w:tc>
+        <w:tc>
+          <w:tcPr>
+            <w:tcW w:w="1503" w:type="dxa"/>
+          </w:tcPr>
+          <w:p>
+            <w:pPr>
+              <w:rPr>
+                <w:b/>
+                <w:lang w:val="en-US"/>
+              </w:rPr>
+            </w:pPr>
+          </w:p>
+        </w:tc>
+        <w:tc>
+          <w:tcPr>
+            <w:tcW w:w="1503" w:type="dxa"/>
+          </w:tcPr>
+          <w:p>
+            <w:pPr>
+              <w:rPr>
+                <w:b/>
+                <w:lang w:val="en-US"/>
+              </w:rPr>
+            </w:pPr>
+          </w:p>
+        </w:tc>
+        <w:tc>
+          <w:tcPr>
+            <w:tcW w:w="1503" w:type="dxa"/>
+          </w:tcPr>
+          <w:p>
+            <w:pPr>
+              <w:rPr>
+                <w:b/>
+                <w:lang w:val="en-US"/>
+              </w:rPr>
+            </w:pPr>
+          </w:p>
+        </w:tc>
+      </w:tr>
+      <w:tr>
+        <w:tc>
+          <w:tcPr>
+            <w:tcW w:w="1502" w:type="dxa"/>
+          </w:tcPr>
+          <w:p>
+            <w:pPr>
+              <w:rPr>
+                <w:b/>
+                <w:lang w:val="en-US"/>
+              </w:rPr>
+            </w:pPr>
+          </w:p>
+        </w:tc>
+        <w:tc>
+          <w:tcPr>
+            <w:tcW w:w="1502" w:type="dxa"/>
+          </w:tcPr>
+          <w:p>
+            <w:pPr>
+              <w:rPr>
+                <w:b/>
+                <w:lang w:val="en-US"/>
+              </w:rPr>
+            </w:pPr>
+          </w:p>
+        </w:tc>
+        <w:tc>
+          <w:tcPr>
+            <w:tcW w:w="1503" w:type="dxa"/>
+          </w:tcPr>
+          <w:p>
+            <w:pPr>
+              <w:rPr>
+                <w:b/>
+                <w:lang w:val="en-US"/>
+              </w:rPr>
+            </w:pPr>
+          </w:p>
+        </w:tc>
+        <w:tc>
+          <w:tcPr>
+            <w:tcW w:w="1503" w:type="dxa"/>
+          </w:tcPr>
+          <w:p>
+            <w:pPr>
+              <w:rPr>
+                <w:b/>
+                <w:lang w:val="en-US"/>
+              </w:rPr>
+            </w:pPr>
+          </w:p>
+        </w:tc>
+        <w:tc>
+          <w:tcPr>
+            <w:tcW w:w="1503" w:type="dxa"/>
+          </w:tcPr>
+          <w:p>
+            <w:pPr>
+              <w:rPr>
+                <w:b/>
+                <w:lang w:val="en-US"/>
+              </w:rPr>
+            </w:pPr>
+          </w:p>
+        </w:tc>
+        <w:tc>
+          <w:tcPr>
+            <w:tcW w:w="1503" w:type="dxa"/>
+          </w:tcPr>
+          <w:p>
+            <w:pPr>
+              <w:rPr>
+                <w:b/>
+                <w:lang w:val="en-US"/>
+              </w:rPr>
+            </w:pPr>
+          </w:p>
+        </w:tc>
+      </w:tr>
+      <w:tr>
+        <w:tc>
+          <w:tcPr>
+            <w:tcW w:w="1502" w:type="dxa"/>
+          </w:tcPr>
+          <w:p>
+            <w:pPr>
+              <w:rPr>
+                <w:b/>
+                <w:lang w:val="en-US"/>
+              </w:rPr>
+            </w:pPr>
+          </w:p>
+        </w:tc>
+        <w:tc>
+          <w:tcPr>
+            <w:tcW w:w="1502" w:type="dxa"/>
+          </w:tcPr>
+          <w:p>
+            <w:pPr>
+              <w:rPr>
+                <w:b/>
+                <w:lang w:val="en-US"/>
+              </w:rPr>
+            </w:pPr>
+          </w:p>
+        </w:tc>
+        <w:tc>
+          <w:tcPr>
+            <w:tcW w:w="1503" w:type="dxa"/>
+          </w:tcPr>
+          <w:p>
+            <w:pPr>
+              <w:rPr>
+                <w:b/>
+                <w:lang w:val="en-US"/>
+              </w:rPr>
+            </w:pPr>
+          </w:p>
+        </w:tc>
+        <w:tc>
+          <w:tcPr>
+            <w:tcW w:w="1503" w:type="dxa"/>
+          </w:tcPr>
+          <w:p>
+            <w:pPr>
+              <w:rPr>
+                <w:b/>
+                <w:lang w:val="en-US"/>
+              </w:rPr>
+            </w:pPr>
+          </w:p>
+        </w:tc>
+        <w:tc>
+          <w:tcPr>
+            <w:tcW w:w="1503" w:type="dxa"/>
+          </w:tcPr>
+          <w:p>
+            <w:pPr>
+              <w:rPr>
+                <w:b/>
+                <w:lang w:val="en-US"/>
+              </w:rPr>
+            </w:pPr>
+          </w:p>
+        </w:tc>
+        <w:tc>
+          <w:tcPr>
+            <w:tcW w:w="1503" w:type="dxa"/>
+          </w:tcPr>
+          <w:p>
+            <w:pPr>
+              <w:rPr>
+                <w:b/>
+                <w:lang w:val="en-US"/>
+              </w:rPr>
+            </w:pPr>
+          </w:p>
+        </w:tc>
+      </w:tr>
+      <w:tr>
+        <w:tc>
+          <w:tcPr>
+            <w:tcW w:w="1502" w:type="dxa"/>
+          </w:tcPr>
+          <w:p>
+            <w:pPr>
+              <w:rPr>
+                <w:b/>
+                <w:lang w:val="en-US"/>
+              </w:rPr>
+            </w:pPr>
+          </w:p>
+        </w:tc>
+        <w:tc>
+          <w:tcPr>
+            <w:tcW w:w="1502" w:type="dxa"/>
+          </w:tcPr>
+          <w:p>
+            <w:pPr>
+              <w:rPr>
+                <w:b/>
+                <w:lang w:val="en-US"/>
+              </w:rPr>
+            </w:pPr>
+          </w:p>
+        </w:tc>
+        <w:tc>
+          <w:tcPr>
+            <w:tcW w:w="1503" w:type="dxa"/>
+          </w:tcPr>
+          <w:p>
+            <w:pPr>
+              <w:rPr>
+                <w:b/>
+                <w:lang w:val="en-US"/>
+              </w:rPr>
+            </w:pPr>
+          </w:p>
+        </w:tc>
+        <w:tc>
+          <w:tcPr>
+            <w:tcW w:w="1503" w:type="dxa"/>
+          </w:tcPr>
+          <w:p>
+            <w:pPr>
+              <w:rPr>
+                <w:b/>
+                <w:lang w:val="en-US"/>
+              </w:rPr>
+            </w:pPr>
+          </w:p>
+        </w:tc>
+        <w:tc>
+          <w:tcPr>
+            <w:tcW w:w="1503" w:type="dxa"/>
+          </w:tcPr>
+          <w:p>
+            <w:pPr>
+              <w:rPr>
+                <w:b/>
+                <w:lang w:val="en-US"/>
+              </w:rPr>
+            </w:pPr>
+          </w:p>
+        </w:tc>
+        <w:tc>
+          <w:tcPr>
+            <w:tcW w:w="1503" w:type="dxa"/>
+          </w:tcPr>
+          <w:p>
+            <w:pPr>
+              <w:rPr>
+                <w:b/>
+                <w:lang w:val="en-US"/>
+              </w:rPr>
+            </w:pPr>
+          </w:p>
+        </w:tc>
+      </w:tr>
+    </w:tbl>
+    <w:p>
+      <w:pPr>
+        <w:rPr>
+          <w:b/>
+          <w:lang w:val="en-US"/>
+        </w:rPr>
+      </w:pPr>
+    </w:p>
+    <w:p>
+      <w:pPr>
+        <w:rPr>
+          <w:b/>
+          <w:lang w:val="en-US"/>
+        </w:rPr>
+      </w:pPr>
     </w:p>
     <w:p>
       <w:pPr>
@@ -622,6 +1258,357 @@
         <w:t>USER PROFILE</w:t>
       </w:r>
     </w:p>
+    <w:tbl>
+      <w:tblPr>
+        <w:tblStyle w:val="TableGrid"/>
+        <w:tblW w:w="0" w:type="auto"/>
+        <w:tblLook w:val="04A0" w:firstRow="1" w:lastRow="0" w:firstColumn="1" w:lastColumn="0" w:noHBand="0" w:noVBand="1"/>
+      </w:tblPr>
+      <w:tblGrid>
+        <w:gridCol w:w="1502"/>
+        <w:gridCol w:w="1502"/>
+        <w:gridCol w:w="1503"/>
+        <w:gridCol w:w="1503"/>
+        <w:gridCol w:w="1503"/>
+        <w:gridCol w:w="1503"/>
+      </w:tblGrid>
+      <w:tr>
+        <w:tc>
+          <w:tcPr>
+            <w:tcW w:w="1502" w:type="dxa"/>
+          </w:tcPr>
+          <w:p>
+            <w:pPr>
+              <w:rPr>
+                <w:b/>
+                <w:lang w:val="en-US"/>
+              </w:rPr>
+            </w:pPr>
+          </w:p>
+        </w:tc>
+        <w:tc>
+          <w:tcPr>
+            <w:tcW w:w="1502" w:type="dxa"/>
+          </w:tcPr>
+          <w:p>
+            <w:pPr>
+              <w:rPr>
+                <w:b/>
+                <w:lang w:val="en-US"/>
+              </w:rPr>
+            </w:pPr>
+          </w:p>
+        </w:tc>
+        <w:tc>
+          <w:tcPr>
+            <w:tcW w:w="1503" w:type="dxa"/>
+          </w:tcPr>
+          <w:p>
+            <w:pPr>
+              <w:rPr>
+                <w:b/>
+                <w:lang w:val="en-US"/>
+              </w:rPr>
+            </w:pPr>
+          </w:p>
+        </w:tc>
+        <w:tc>
+          <w:tcPr>
+            <w:tcW w:w="1503" w:type="dxa"/>
+          </w:tcPr>
+          <w:p>
+            <w:pPr>
+              <w:rPr>
+                <w:b/>
+                <w:lang w:val="en-US"/>
+              </w:rPr>
+            </w:pPr>
+          </w:p>
+        </w:tc>
+        <w:tc>
+          <w:tcPr>
+            <w:tcW w:w="1503" w:type="dxa"/>
+          </w:tcPr>
+          <w:p>
+            <w:pPr>
+              <w:rPr>
+                <w:b/>
+                <w:lang w:val="en-US"/>
+              </w:rPr>
+            </w:pPr>
+          </w:p>
+        </w:tc>
+        <w:tc>
+          <w:tcPr>
+            <w:tcW w:w="1503" w:type="dxa"/>
+          </w:tcPr>
+          <w:p>
+            <w:pPr>
+              <w:rPr>
+                <w:b/>
+                <w:lang w:val="en-US"/>
+              </w:rPr>
+            </w:pPr>
+          </w:p>
+        </w:tc>
+      </w:tr>
+      <w:tr>
+        <w:tc>
+          <w:tcPr>
+            <w:tcW w:w="1502" w:type="dxa"/>
+          </w:tcPr>
+          <w:p>
+            <w:pPr>
+              <w:rPr>
+                <w:b/>
+                <w:lang w:val="en-US"/>
+              </w:rPr>
+            </w:pPr>
+          </w:p>
+        </w:tc>
+        <w:tc>
+          <w:tcPr>
+            <w:tcW w:w="1502" w:type="dxa"/>
+          </w:tcPr>
+          <w:p>
+            <w:pPr>
+              <w:rPr>
+                <w:b/>
+                <w:lang w:val="en-US"/>
+              </w:rPr>
+            </w:pPr>
+          </w:p>
+        </w:tc>
+        <w:tc>
+          <w:tcPr>
+            <w:tcW w:w="1503" w:type="dxa"/>
+          </w:tcPr>
+          <w:p>
+            <w:pPr>
+              <w:rPr>
+                <w:b/>
+                <w:lang w:val="en-US"/>
+              </w:rPr>
+            </w:pPr>
+          </w:p>
+        </w:tc>
+        <w:tc>
+          <w:tcPr>
+            <w:tcW w:w="1503" w:type="dxa"/>
+          </w:tcPr>
+          <w:p>
+            <w:pPr>
+              <w:rPr>
+                <w:b/>
+                <w:lang w:val="en-US"/>
+              </w:rPr>
+            </w:pPr>
+          </w:p>
+        </w:tc>
+        <w:tc>
+          <w:tcPr>
+            <w:tcW w:w="1503" w:type="dxa"/>
+          </w:tcPr>
+          <w:p>
+            <w:pPr>
+              <w:rPr>
+                <w:b/>
+                <w:lang w:val="en-US"/>
+              </w:rPr>
+            </w:pPr>
+          </w:p>
+        </w:tc>
+        <w:tc>
+          <w:tcPr>
+            <w:tcW w:w="1503" w:type="dxa"/>
+          </w:tcPr>
+          <w:p>
+            <w:pPr>
+              <w:rPr>
+                <w:b/>
+                <w:lang w:val="en-US"/>
+              </w:rPr>
+            </w:pPr>
+          </w:p>
+        </w:tc>
+      </w:tr>
+      <w:tr>
+        <w:tc>
+          <w:tcPr>
+            <w:tcW w:w="1502" w:type="dxa"/>
+          </w:tcPr>
+          <w:p>
+            <w:pPr>
+              <w:rPr>
+                <w:b/>
+                <w:lang w:val="en-US"/>
+              </w:rPr>
+            </w:pPr>
+          </w:p>
+        </w:tc>
+        <w:tc>
+          <w:tcPr>
+            <w:tcW w:w="1502" w:type="dxa"/>
+          </w:tcPr>
+          <w:p>
+            <w:pPr>
+              <w:rPr>
+                <w:b/>
+                <w:lang w:val="en-US"/>
+              </w:rPr>
+            </w:pPr>
+          </w:p>
+        </w:tc>
+        <w:tc>
+          <w:tcPr>
+            <w:tcW w:w="1503" w:type="dxa"/>
+          </w:tcPr>
+          <w:p>
+            <w:pPr>
+              <w:rPr>
+                <w:b/>
+                <w:lang w:val="en-US"/>
+              </w:rPr>
+            </w:pPr>
+          </w:p>
+        </w:tc>
+        <w:tc>
+          <w:tcPr>
+            <w:tcW w:w="1503" w:type="dxa"/>
+          </w:tcPr>
+          <w:p>
+            <w:pPr>
+              <w:rPr>
+                <w:b/>
+                <w:lang w:val="en-US"/>
+              </w:rPr>
+            </w:pPr>
+          </w:p>
+        </w:tc>
+        <w:tc>
+          <w:tcPr>
+            <w:tcW w:w="1503" w:type="dxa"/>
+          </w:tcPr>
+          <w:p>
+            <w:pPr>
+              <w:rPr>
+                <w:b/>
+                <w:lang w:val="en-US"/>
+              </w:rPr>
+            </w:pPr>
+          </w:p>
+        </w:tc>
+        <w:tc>
+          <w:tcPr>
+            <w:tcW w:w="1503" w:type="dxa"/>
+          </w:tcPr>
+          <w:p>
+            <w:pPr>
+              <w:rPr>
+                <w:b/>
+                <w:lang w:val="en-US"/>
+              </w:rPr>
+            </w:pPr>
+          </w:p>
+        </w:tc>
+      </w:tr>
+      <w:tr>
+        <w:tc>
+          <w:tcPr>
+            <w:tcW w:w="1502" w:type="dxa"/>
+          </w:tcPr>
+          <w:p>
+            <w:pPr>
+              <w:rPr>
+                <w:b/>
+                <w:lang w:val="en-US"/>
+              </w:rPr>
+            </w:pPr>
+          </w:p>
+        </w:tc>
+        <w:tc>
+          <w:tcPr>
+            <w:tcW w:w="1502" w:type="dxa"/>
+          </w:tcPr>
+          <w:p>
+            <w:pPr>
+              <w:rPr>
+                <w:b/>
+                <w:lang w:val="en-US"/>
+              </w:rPr>
+            </w:pPr>
+          </w:p>
+        </w:tc>
+        <w:tc>
+          <w:tcPr>
+            <w:tcW w:w="1503" w:type="dxa"/>
+          </w:tcPr>
+          <w:p>
+            <w:pPr>
+              <w:rPr>
+                <w:b/>
+                <w:lang w:val="en-US"/>
+              </w:rPr>
+            </w:pPr>
+          </w:p>
+        </w:tc>
+        <w:tc>
+          <w:tcPr>
+            <w:tcW w:w="1503" w:type="dxa"/>
+          </w:tcPr>
+          <w:p>
+            <w:pPr>
+              <w:rPr>
+                <w:b/>
+                <w:lang w:val="en-US"/>
+              </w:rPr>
+            </w:pPr>
+          </w:p>
+        </w:tc>
+        <w:tc>
+          <w:tcPr>
+            <w:tcW w:w="1503" w:type="dxa"/>
+          </w:tcPr>
+          <w:p>
+            <w:pPr>
+              <w:rPr>
+                <w:b/>
+                <w:lang w:val="en-US"/>
+              </w:rPr>
+            </w:pPr>
+          </w:p>
+        </w:tc>
+        <w:tc>
+          <w:tcPr>
+            <w:tcW w:w="1503" w:type="dxa"/>
+          </w:tcPr>
+          <w:p>
+            <w:pPr>
+              <w:rPr>
+                <w:b/>
+                <w:lang w:val="en-US"/>
+              </w:rPr>
+            </w:pPr>
+          </w:p>
+        </w:tc>
+      </w:tr>
+    </w:tbl>
+    <w:p>
+      <w:pPr>
+        <w:rPr>
+          <w:b/>
+          <w:lang w:val="en-US"/>
+        </w:rPr>
+      </w:pPr>
+    </w:p>
+    <w:p>
+      <w:pPr>
+        <w:rPr>
+          <w:b/>
+          <w:lang w:val="en-US"/>
+        </w:rPr>
+      </w:pPr>
+    </w:p>
     <w:p>
       <w:pPr>
         <w:rPr>
@@ -637,6 +1624,357 @@
         <w:t>CATEGORY</w:t>
       </w:r>
     </w:p>
+    <w:tbl>
+      <w:tblPr>
+        <w:tblStyle w:val="TableGrid"/>
+        <w:tblW w:w="0" w:type="auto"/>
+        <w:tblLook w:val="04A0" w:firstRow="1" w:lastRow="0" w:firstColumn="1" w:lastColumn="0" w:noHBand="0" w:noVBand="1"/>
+      </w:tblPr>
+      <w:tblGrid>
+        <w:gridCol w:w="1502"/>
+        <w:gridCol w:w="1502"/>
+        <w:gridCol w:w="1503"/>
+        <w:gridCol w:w="1503"/>
+        <w:gridCol w:w="1503"/>
+        <w:gridCol w:w="1503"/>
+      </w:tblGrid>
+      <w:tr>
+        <w:tc>
+          <w:tcPr>
+            <w:tcW w:w="1502" w:type="dxa"/>
+          </w:tcPr>
+          <w:p>
+            <w:pPr>
+              <w:rPr>
+                <w:b/>
+                <w:lang w:val="en-US"/>
+              </w:rPr>
+            </w:pPr>
+          </w:p>
+        </w:tc>
+        <w:tc>
+          <w:tcPr>
+            <w:tcW w:w="1502" w:type="dxa"/>
+          </w:tcPr>
+          <w:p>
+            <w:pPr>
+              <w:rPr>
+                <w:b/>
+                <w:lang w:val="en-US"/>
+              </w:rPr>
+            </w:pPr>
+          </w:p>
+        </w:tc>
+        <w:tc>
+          <w:tcPr>
+            <w:tcW w:w="1503" w:type="dxa"/>
+          </w:tcPr>
+          <w:p>
+            <w:pPr>
+              <w:rPr>
+                <w:b/>
+                <w:lang w:val="en-US"/>
+              </w:rPr>
+            </w:pPr>
+          </w:p>
+        </w:tc>
+        <w:tc>
+          <w:tcPr>
+            <w:tcW w:w="1503" w:type="dxa"/>
+          </w:tcPr>
+          <w:p>
+            <w:pPr>
+              <w:rPr>
+                <w:b/>
+                <w:lang w:val="en-US"/>
+              </w:rPr>
+            </w:pPr>
+          </w:p>
+        </w:tc>
+        <w:tc>
+          <w:tcPr>
+            <w:tcW w:w="1503" w:type="dxa"/>
+          </w:tcPr>
+          <w:p>
+            <w:pPr>
+              <w:rPr>
+                <w:b/>
+                <w:lang w:val="en-US"/>
+              </w:rPr>
+            </w:pPr>
+          </w:p>
+        </w:tc>
+        <w:tc>
+          <w:tcPr>
+            <w:tcW w:w="1503" w:type="dxa"/>
+          </w:tcPr>
+          <w:p>
+            <w:pPr>
+              <w:rPr>
+                <w:b/>
+                <w:lang w:val="en-US"/>
+              </w:rPr>
+            </w:pPr>
+          </w:p>
+        </w:tc>
+      </w:tr>
+      <w:tr>
+        <w:tc>
+          <w:tcPr>
+            <w:tcW w:w="1502" w:type="dxa"/>
+          </w:tcPr>
+          <w:p>
+            <w:pPr>
+              <w:rPr>
+                <w:b/>
+                <w:lang w:val="en-US"/>
+              </w:rPr>
+            </w:pPr>
+          </w:p>
+        </w:tc>
+        <w:tc>
+          <w:tcPr>
+            <w:tcW w:w="1502" w:type="dxa"/>
+          </w:tcPr>
+          <w:p>
+            <w:pPr>
+              <w:rPr>
+                <w:b/>
+                <w:lang w:val="en-US"/>
+              </w:rPr>
+            </w:pPr>
+          </w:p>
+        </w:tc>
+        <w:tc>
+          <w:tcPr>
+            <w:tcW w:w="1503" w:type="dxa"/>
+          </w:tcPr>
+          <w:p>
+            <w:pPr>
+              <w:rPr>
+                <w:b/>
+                <w:lang w:val="en-US"/>
+              </w:rPr>
+            </w:pPr>
+          </w:p>
+        </w:tc>
+        <w:tc>
+          <w:tcPr>
+            <w:tcW w:w="1503" w:type="dxa"/>
+          </w:tcPr>
+          <w:p>
+            <w:pPr>
+              <w:rPr>
+                <w:b/>
+                <w:lang w:val="en-US"/>
+              </w:rPr>
+            </w:pPr>
+          </w:p>
+        </w:tc>
+        <w:tc>
+          <w:tcPr>
+            <w:tcW w:w="1503" w:type="dxa"/>
+          </w:tcPr>
+          <w:p>
+            <w:pPr>
+              <w:rPr>
+                <w:b/>
+                <w:lang w:val="en-US"/>
+              </w:rPr>
+            </w:pPr>
+          </w:p>
+        </w:tc>
+        <w:tc>
+          <w:tcPr>
+            <w:tcW w:w="1503" w:type="dxa"/>
+          </w:tcPr>
+          <w:p>
+            <w:pPr>
+              <w:rPr>
+                <w:b/>
+                <w:lang w:val="en-US"/>
+              </w:rPr>
+            </w:pPr>
+          </w:p>
+        </w:tc>
+      </w:tr>
+      <w:tr>
+        <w:tc>
+          <w:tcPr>
+            <w:tcW w:w="1502" w:type="dxa"/>
+          </w:tcPr>
+          <w:p>
+            <w:pPr>
+              <w:rPr>
+                <w:b/>
+                <w:lang w:val="en-US"/>
+              </w:rPr>
+            </w:pPr>
+          </w:p>
+        </w:tc>
+        <w:tc>
+          <w:tcPr>
+            <w:tcW w:w="1502" w:type="dxa"/>
+          </w:tcPr>
+          <w:p>
+            <w:pPr>
+              <w:rPr>
+                <w:b/>
+                <w:lang w:val="en-US"/>
+              </w:rPr>
+            </w:pPr>
+          </w:p>
+        </w:tc>
+        <w:tc>
+          <w:tcPr>
+            <w:tcW w:w="1503" w:type="dxa"/>
+          </w:tcPr>
+          <w:p>
+            <w:pPr>
+              <w:rPr>
+                <w:b/>
+                <w:lang w:val="en-US"/>
+              </w:rPr>
+            </w:pPr>
+          </w:p>
+        </w:tc>
+        <w:tc>
+          <w:tcPr>
+            <w:tcW w:w="1503" w:type="dxa"/>
+          </w:tcPr>
+          <w:p>
+            <w:pPr>
+              <w:rPr>
+                <w:b/>
+                <w:lang w:val="en-US"/>
+              </w:rPr>
+            </w:pPr>
+          </w:p>
+        </w:tc>
+        <w:tc>
+          <w:tcPr>
+            <w:tcW w:w="1503" w:type="dxa"/>
+          </w:tcPr>
+          <w:p>
+            <w:pPr>
+              <w:rPr>
+                <w:b/>
+                <w:lang w:val="en-US"/>
+              </w:rPr>
+            </w:pPr>
+          </w:p>
+        </w:tc>
+        <w:tc>
+          <w:tcPr>
+            <w:tcW w:w="1503" w:type="dxa"/>
+          </w:tcPr>
+          <w:p>
+            <w:pPr>
+              <w:rPr>
+                <w:b/>
+                <w:lang w:val="en-US"/>
+              </w:rPr>
+            </w:pPr>
+          </w:p>
+        </w:tc>
+      </w:tr>
+      <w:tr>
+        <w:tc>
+          <w:tcPr>
+            <w:tcW w:w="1502" w:type="dxa"/>
+          </w:tcPr>
+          <w:p>
+            <w:pPr>
+              <w:rPr>
+                <w:b/>
+                <w:lang w:val="en-US"/>
+              </w:rPr>
+            </w:pPr>
+          </w:p>
+        </w:tc>
+        <w:tc>
+          <w:tcPr>
+            <w:tcW w:w="1502" w:type="dxa"/>
+          </w:tcPr>
+          <w:p>
+            <w:pPr>
+              <w:rPr>
+                <w:b/>
+                <w:lang w:val="en-US"/>
+              </w:rPr>
+            </w:pPr>
+          </w:p>
+        </w:tc>
+        <w:tc>
+          <w:tcPr>
+            <w:tcW w:w="1503" w:type="dxa"/>
+          </w:tcPr>
+          <w:p>
+            <w:pPr>
+              <w:rPr>
+                <w:b/>
+                <w:lang w:val="en-US"/>
+              </w:rPr>
+            </w:pPr>
+          </w:p>
+        </w:tc>
+        <w:tc>
+          <w:tcPr>
+            <w:tcW w:w="1503" w:type="dxa"/>
+          </w:tcPr>
+          <w:p>
+            <w:pPr>
+              <w:rPr>
+                <w:b/>
+                <w:lang w:val="en-US"/>
+              </w:rPr>
+            </w:pPr>
+          </w:p>
+        </w:tc>
+        <w:tc>
+          <w:tcPr>
+            <w:tcW w:w="1503" w:type="dxa"/>
+          </w:tcPr>
+          <w:p>
+            <w:pPr>
+              <w:rPr>
+                <w:b/>
+                <w:lang w:val="en-US"/>
+              </w:rPr>
+            </w:pPr>
+          </w:p>
+        </w:tc>
+        <w:tc>
+          <w:tcPr>
+            <w:tcW w:w="1503" w:type="dxa"/>
+          </w:tcPr>
+          <w:p>
+            <w:pPr>
+              <w:rPr>
+                <w:b/>
+                <w:lang w:val="en-US"/>
+              </w:rPr>
+            </w:pPr>
+          </w:p>
+        </w:tc>
+      </w:tr>
+    </w:tbl>
+    <w:p>
+      <w:pPr>
+        <w:rPr>
+          <w:b/>
+          <w:lang w:val="en-US"/>
+        </w:rPr>
+      </w:pPr>
+    </w:p>
+    <w:p>
+      <w:pPr>
+        <w:rPr>
+          <w:b/>
+          <w:lang w:val="en-US"/>
+        </w:rPr>
+      </w:pPr>
+    </w:p>
     <w:p>
       <w:pPr>
         <w:rPr>
@@ -652,9 +1990,361 @@
         <w:t>ENROLMENT</w:t>
       </w:r>
     </w:p>
-    <w:p>
-      <w:pPr>
-        <w:rPr>
+    <w:tbl>
+      <w:tblPr>
+        <w:tblStyle w:val="TableGrid"/>
+        <w:tblW w:w="0" w:type="auto"/>
+        <w:tblLook w:val="04A0" w:firstRow="1" w:lastRow="0" w:firstColumn="1" w:lastColumn="0" w:noHBand="0" w:noVBand="1"/>
+      </w:tblPr>
+      <w:tblGrid>
+        <w:gridCol w:w="1502"/>
+        <w:gridCol w:w="1502"/>
+        <w:gridCol w:w="1503"/>
+        <w:gridCol w:w="1503"/>
+        <w:gridCol w:w="1503"/>
+        <w:gridCol w:w="1503"/>
+      </w:tblGrid>
+      <w:tr>
+        <w:tc>
+          <w:tcPr>
+            <w:tcW w:w="1502" w:type="dxa"/>
+          </w:tcPr>
+          <w:p>
+            <w:pPr>
+              <w:rPr>
+                <w:b/>
+                <w:lang w:val="en-US"/>
+              </w:rPr>
+            </w:pPr>
+          </w:p>
+        </w:tc>
+        <w:tc>
+          <w:tcPr>
+            <w:tcW w:w="1502" w:type="dxa"/>
+          </w:tcPr>
+          <w:p>
+            <w:pPr>
+              <w:rPr>
+                <w:b/>
+                <w:lang w:val="en-US"/>
+              </w:rPr>
+            </w:pPr>
+          </w:p>
+        </w:tc>
+        <w:tc>
+          <w:tcPr>
+            <w:tcW w:w="1503" w:type="dxa"/>
+          </w:tcPr>
+          <w:p>
+            <w:pPr>
+              <w:rPr>
+                <w:b/>
+                <w:lang w:val="en-US"/>
+              </w:rPr>
+            </w:pPr>
+          </w:p>
+        </w:tc>
+        <w:tc>
+          <w:tcPr>
+            <w:tcW w:w="1503" w:type="dxa"/>
+          </w:tcPr>
+          <w:p>
+            <w:pPr>
+              <w:rPr>
+                <w:b/>
+                <w:lang w:val="en-US"/>
+              </w:rPr>
+            </w:pPr>
+          </w:p>
+        </w:tc>
+        <w:tc>
+          <w:tcPr>
+            <w:tcW w:w="1503" w:type="dxa"/>
+          </w:tcPr>
+          <w:p>
+            <w:pPr>
+              <w:rPr>
+                <w:b/>
+                <w:lang w:val="en-US"/>
+              </w:rPr>
+            </w:pPr>
+          </w:p>
+        </w:tc>
+        <w:tc>
+          <w:tcPr>
+            <w:tcW w:w="1503" w:type="dxa"/>
+          </w:tcPr>
+          <w:p>
+            <w:pPr>
+              <w:rPr>
+                <w:b/>
+                <w:lang w:val="en-US"/>
+              </w:rPr>
+            </w:pPr>
+          </w:p>
+        </w:tc>
+      </w:tr>
+      <w:tr>
+        <w:tc>
+          <w:tcPr>
+            <w:tcW w:w="1502" w:type="dxa"/>
+          </w:tcPr>
+          <w:p>
+            <w:pPr>
+              <w:rPr>
+                <w:b/>
+                <w:lang w:val="en-US"/>
+              </w:rPr>
+            </w:pPr>
+          </w:p>
+        </w:tc>
+        <w:tc>
+          <w:tcPr>
+            <w:tcW w:w="1502" w:type="dxa"/>
+          </w:tcPr>
+          <w:p>
+            <w:pPr>
+              <w:rPr>
+                <w:b/>
+                <w:lang w:val="en-US"/>
+              </w:rPr>
+            </w:pPr>
+          </w:p>
+        </w:tc>
+        <w:tc>
+          <w:tcPr>
+            <w:tcW w:w="1503" w:type="dxa"/>
+          </w:tcPr>
+          <w:p>
+            <w:pPr>
+              <w:rPr>
+                <w:b/>
+                <w:lang w:val="en-US"/>
+              </w:rPr>
+            </w:pPr>
+          </w:p>
+        </w:tc>
+        <w:tc>
+          <w:tcPr>
+            <w:tcW w:w="1503" w:type="dxa"/>
+          </w:tcPr>
+          <w:p>
+            <w:pPr>
+              <w:rPr>
+                <w:b/>
+                <w:lang w:val="en-US"/>
+              </w:rPr>
+            </w:pPr>
+          </w:p>
+        </w:tc>
+        <w:tc>
+          <w:tcPr>
+            <w:tcW w:w="1503" w:type="dxa"/>
+          </w:tcPr>
+          <w:p>
+            <w:pPr>
+              <w:rPr>
+                <w:b/>
+                <w:lang w:val="en-US"/>
+              </w:rPr>
+            </w:pPr>
+          </w:p>
+        </w:tc>
+        <w:tc>
+          <w:tcPr>
+            <w:tcW w:w="1503" w:type="dxa"/>
+          </w:tcPr>
+          <w:p>
+            <w:pPr>
+              <w:rPr>
+                <w:b/>
+                <w:lang w:val="en-US"/>
+              </w:rPr>
+            </w:pPr>
+          </w:p>
+        </w:tc>
+      </w:tr>
+      <w:tr>
+        <w:tc>
+          <w:tcPr>
+            <w:tcW w:w="1502" w:type="dxa"/>
+          </w:tcPr>
+          <w:p>
+            <w:pPr>
+              <w:rPr>
+                <w:b/>
+                <w:lang w:val="en-US"/>
+              </w:rPr>
+            </w:pPr>
+          </w:p>
+        </w:tc>
+        <w:tc>
+          <w:tcPr>
+            <w:tcW w:w="1502" w:type="dxa"/>
+          </w:tcPr>
+          <w:p>
+            <w:pPr>
+              <w:rPr>
+                <w:b/>
+                <w:lang w:val="en-US"/>
+              </w:rPr>
+            </w:pPr>
+          </w:p>
+        </w:tc>
+        <w:tc>
+          <w:tcPr>
+            <w:tcW w:w="1503" w:type="dxa"/>
+          </w:tcPr>
+          <w:p>
+            <w:pPr>
+              <w:rPr>
+                <w:b/>
+                <w:lang w:val="en-US"/>
+              </w:rPr>
+            </w:pPr>
+          </w:p>
+        </w:tc>
+        <w:tc>
+          <w:tcPr>
+            <w:tcW w:w="1503" w:type="dxa"/>
+          </w:tcPr>
+          <w:p>
+            <w:pPr>
+              <w:rPr>
+                <w:b/>
+                <w:lang w:val="en-US"/>
+              </w:rPr>
+            </w:pPr>
+          </w:p>
+        </w:tc>
+        <w:tc>
+          <w:tcPr>
+            <w:tcW w:w="1503" w:type="dxa"/>
+          </w:tcPr>
+          <w:p>
+            <w:pPr>
+              <w:rPr>
+                <w:b/>
+                <w:lang w:val="en-US"/>
+              </w:rPr>
+            </w:pPr>
+          </w:p>
+        </w:tc>
+        <w:tc>
+          <w:tcPr>
+            <w:tcW w:w="1503" w:type="dxa"/>
+          </w:tcPr>
+          <w:p>
+            <w:pPr>
+              <w:rPr>
+                <w:b/>
+                <w:lang w:val="en-US"/>
+              </w:rPr>
+            </w:pPr>
+          </w:p>
+        </w:tc>
+      </w:tr>
+      <w:tr>
+        <w:tc>
+          <w:tcPr>
+            <w:tcW w:w="1502" w:type="dxa"/>
+          </w:tcPr>
+          <w:p>
+            <w:pPr>
+              <w:rPr>
+                <w:b/>
+                <w:lang w:val="en-US"/>
+              </w:rPr>
+            </w:pPr>
+          </w:p>
+        </w:tc>
+        <w:tc>
+          <w:tcPr>
+            <w:tcW w:w="1502" w:type="dxa"/>
+          </w:tcPr>
+          <w:p>
+            <w:pPr>
+              <w:rPr>
+                <w:b/>
+                <w:lang w:val="en-US"/>
+              </w:rPr>
+            </w:pPr>
+          </w:p>
+        </w:tc>
+        <w:tc>
+          <w:tcPr>
+            <w:tcW w:w="1503" w:type="dxa"/>
+          </w:tcPr>
+          <w:p>
+            <w:pPr>
+              <w:rPr>
+                <w:b/>
+                <w:lang w:val="en-US"/>
+              </w:rPr>
+            </w:pPr>
+          </w:p>
+        </w:tc>
+        <w:tc>
+          <w:tcPr>
+            <w:tcW w:w="1503" w:type="dxa"/>
+          </w:tcPr>
+          <w:p>
+            <w:pPr>
+              <w:rPr>
+                <w:b/>
+                <w:lang w:val="en-US"/>
+              </w:rPr>
+            </w:pPr>
+          </w:p>
+        </w:tc>
+        <w:tc>
+          <w:tcPr>
+            <w:tcW w:w="1503" w:type="dxa"/>
+          </w:tcPr>
+          <w:p>
+            <w:pPr>
+              <w:rPr>
+                <w:b/>
+                <w:lang w:val="en-US"/>
+              </w:rPr>
+            </w:pPr>
+          </w:p>
+        </w:tc>
+        <w:tc>
+          <w:tcPr>
+            <w:tcW w:w="1503" w:type="dxa"/>
+          </w:tcPr>
+          <w:p>
+            <w:pPr>
+              <w:rPr>
+                <w:b/>
+                <w:lang w:val="en-US"/>
+              </w:rPr>
+            </w:pPr>
+          </w:p>
+        </w:tc>
+      </w:tr>
+    </w:tbl>
+    <w:p>
+      <w:pPr>
+        <w:rPr>
+          <w:b/>
+          <w:lang w:val="en-US"/>
+        </w:rPr>
+      </w:pPr>
+    </w:p>
+    <w:p>
+      <w:pPr>
+        <w:rPr>
+          <w:b/>
+          <w:lang w:val="en-US"/>
+        </w:rPr>
+      </w:pPr>
+    </w:p>
+    <w:p>
+      <w:pPr>
+        <w:rPr>
+          <w:b/>
           <w:lang w:val="en-US"/>
         </w:rPr>
       </w:pPr>
@@ -663,8 +2353,368 @@
           <w:b/>
           <w:lang w:val="en-US"/>
         </w:rPr>
+        <w:lastRenderedPageBreak/>
         <w:t>RESULT</w:t>
       </w:r>
+      <w:r>
+        <w:rPr>
+          <w:b/>
+          <w:lang w:val="en-US"/>
+        </w:rPr>
+        <w:t>S</w:t>
+      </w:r>
+    </w:p>
+    <w:tbl>
+      <w:tblPr>
+        <w:tblStyle w:val="TableGrid"/>
+        <w:tblW w:w="0" w:type="auto"/>
+        <w:tblLook w:val="04A0" w:firstRow="1" w:lastRow="0" w:firstColumn="1" w:lastColumn="0" w:noHBand="0" w:noVBand="1"/>
+      </w:tblPr>
+      <w:tblGrid>
+        <w:gridCol w:w="1502"/>
+        <w:gridCol w:w="1502"/>
+        <w:gridCol w:w="1503"/>
+        <w:gridCol w:w="1503"/>
+        <w:gridCol w:w="1503"/>
+        <w:gridCol w:w="1503"/>
+      </w:tblGrid>
+      <w:tr>
+        <w:tc>
+          <w:tcPr>
+            <w:tcW w:w="1502" w:type="dxa"/>
+          </w:tcPr>
+          <w:p>
+            <w:pPr>
+              <w:rPr>
+                <w:b/>
+                <w:lang w:val="en-US"/>
+              </w:rPr>
+            </w:pPr>
+            <w:bookmarkStart w:id="0" w:name="_GoBack"/>
+            <w:bookmarkEnd w:id="0"/>
+          </w:p>
+        </w:tc>
+        <w:tc>
+          <w:tcPr>
+            <w:tcW w:w="1502" w:type="dxa"/>
+          </w:tcPr>
+          <w:p>
+            <w:pPr>
+              <w:rPr>
+                <w:b/>
+                <w:lang w:val="en-US"/>
+              </w:rPr>
+            </w:pPr>
+          </w:p>
+        </w:tc>
+        <w:tc>
+          <w:tcPr>
+            <w:tcW w:w="1503" w:type="dxa"/>
+          </w:tcPr>
+          <w:p>
+            <w:pPr>
+              <w:rPr>
+                <w:b/>
+                <w:lang w:val="en-US"/>
+              </w:rPr>
+            </w:pPr>
+          </w:p>
+        </w:tc>
+        <w:tc>
+          <w:tcPr>
+            <w:tcW w:w="1503" w:type="dxa"/>
+          </w:tcPr>
+          <w:p>
+            <w:pPr>
+              <w:rPr>
+                <w:b/>
+                <w:lang w:val="en-US"/>
+              </w:rPr>
+            </w:pPr>
+          </w:p>
+        </w:tc>
+        <w:tc>
+          <w:tcPr>
+            <w:tcW w:w="1503" w:type="dxa"/>
+          </w:tcPr>
+          <w:p>
+            <w:pPr>
+              <w:rPr>
+                <w:b/>
+                <w:lang w:val="en-US"/>
+              </w:rPr>
+            </w:pPr>
+          </w:p>
+        </w:tc>
+        <w:tc>
+          <w:tcPr>
+            <w:tcW w:w="1503" w:type="dxa"/>
+          </w:tcPr>
+          <w:p>
+            <w:pPr>
+              <w:rPr>
+                <w:b/>
+                <w:lang w:val="en-US"/>
+              </w:rPr>
+            </w:pPr>
+          </w:p>
+        </w:tc>
+      </w:tr>
+      <w:tr>
+        <w:tc>
+          <w:tcPr>
+            <w:tcW w:w="1502" w:type="dxa"/>
+          </w:tcPr>
+          <w:p>
+            <w:pPr>
+              <w:rPr>
+                <w:b/>
+                <w:lang w:val="en-US"/>
+              </w:rPr>
+            </w:pPr>
+          </w:p>
+        </w:tc>
+        <w:tc>
+          <w:tcPr>
+            <w:tcW w:w="1502" w:type="dxa"/>
+          </w:tcPr>
+          <w:p>
+            <w:pPr>
+              <w:rPr>
+                <w:b/>
+                <w:lang w:val="en-US"/>
+              </w:rPr>
+            </w:pPr>
+          </w:p>
+        </w:tc>
+        <w:tc>
+          <w:tcPr>
+            <w:tcW w:w="1503" w:type="dxa"/>
+          </w:tcPr>
+          <w:p>
+            <w:pPr>
+              <w:rPr>
+                <w:b/>
+                <w:lang w:val="en-US"/>
+              </w:rPr>
+            </w:pPr>
+          </w:p>
+        </w:tc>
+        <w:tc>
+          <w:tcPr>
+            <w:tcW w:w="1503" w:type="dxa"/>
+          </w:tcPr>
+          <w:p>
+            <w:pPr>
+              <w:rPr>
+                <w:b/>
+                <w:lang w:val="en-US"/>
+              </w:rPr>
+            </w:pPr>
+          </w:p>
+        </w:tc>
+        <w:tc>
+          <w:tcPr>
+            <w:tcW w:w="1503" w:type="dxa"/>
+          </w:tcPr>
+          <w:p>
+            <w:pPr>
+              <w:rPr>
+                <w:b/>
+                <w:lang w:val="en-US"/>
+              </w:rPr>
+            </w:pPr>
+          </w:p>
+        </w:tc>
+        <w:tc>
+          <w:tcPr>
+            <w:tcW w:w="1503" w:type="dxa"/>
+          </w:tcPr>
+          <w:p>
+            <w:pPr>
+              <w:rPr>
+                <w:b/>
+                <w:lang w:val="en-US"/>
+              </w:rPr>
+            </w:pPr>
+          </w:p>
+        </w:tc>
+      </w:tr>
+      <w:tr>
+        <w:tc>
+          <w:tcPr>
+            <w:tcW w:w="1502" w:type="dxa"/>
+          </w:tcPr>
+          <w:p>
+            <w:pPr>
+              <w:rPr>
+                <w:b/>
+                <w:lang w:val="en-US"/>
+              </w:rPr>
+            </w:pPr>
+          </w:p>
+        </w:tc>
+        <w:tc>
+          <w:tcPr>
+            <w:tcW w:w="1502" w:type="dxa"/>
+          </w:tcPr>
+          <w:p>
+            <w:pPr>
+              <w:rPr>
+                <w:b/>
+                <w:lang w:val="en-US"/>
+              </w:rPr>
+            </w:pPr>
+          </w:p>
+        </w:tc>
+        <w:tc>
+          <w:tcPr>
+            <w:tcW w:w="1503" w:type="dxa"/>
+          </w:tcPr>
+          <w:p>
+            <w:pPr>
+              <w:rPr>
+                <w:b/>
+                <w:lang w:val="en-US"/>
+              </w:rPr>
+            </w:pPr>
+          </w:p>
+        </w:tc>
+        <w:tc>
+          <w:tcPr>
+            <w:tcW w:w="1503" w:type="dxa"/>
+          </w:tcPr>
+          <w:p>
+            <w:pPr>
+              <w:rPr>
+                <w:b/>
+                <w:lang w:val="en-US"/>
+              </w:rPr>
+            </w:pPr>
+          </w:p>
+        </w:tc>
+        <w:tc>
+          <w:tcPr>
+            <w:tcW w:w="1503" w:type="dxa"/>
+          </w:tcPr>
+          <w:p>
+            <w:pPr>
+              <w:rPr>
+                <w:b/>
+                <w:lang w:val="en-US"/>
+              </w:rPr>
+            </w:pPr>
+          </w:p>
+        </w:tc>
+        <w:tc>
+          <w:tcPr>
+            <w:tcW w:w="1503" w:type="dxa"/>
+          </w:tcPr>
+          <w:p>
+            <w:pPr>
+              <w:rPr>
+                <w:b/>
+                <w:lang w:val="en-US"/>
+              </w:rPr>
+            </w:pPr>
+          </w:p>
+        </w:tc>
+      </w:tr>
+      <w:tr>
+        <w:tc>
+          <w:tcPr>
+            <w:tcW w:w="1502" w:type="dxa"/>
+          </w:tcPr>
+          <w:p>
+            <w:pPr>
+              <w:rPr>
+                <w:b/>
+                <w:lang w:val="en-US"/>
+              </w:rPr>
+            </w:pPr>
+          </w:p>
+        </w:tc>
+        <w:tc>
+          <w:tcPr>
+            <w:tcW w:w="1502" w:type="dxa"/>
+          </w:tcPr>
+          <w:p>
+            <w:pPr>
+              <w:rPr>
+                <w:b/>
+                <w:lang w:val="en-US"/>
+              </w:rPr>
+            </w:pPr>
+          </w:p>
+        </w:tc>
+        <w:tc>
+          <w:tcPr>
+            <w:tcW w:w="1503" w:type="dxa"/>
+          </w:tcPr>
+          <w:p>
+            <w:pPr>
+              <w:rPr>
+                <w:b/>
+                <w:lang w:val="en-US"/>
+              </w:rPr>
+            </w:pPr>
+          </w:p>
+        </w:tc>
+        <w:tc>
+          <w:tcPr>
+            <w:tcW w:w="1503" w:type="dxa"/>
+          </w:tcPr>
+          <w:p>
+            <w:pPr>
+              <w:rPr>
+                <w:b/>
+                <w:lang w:val="en-US"/>
+              </w:rPr>
+            </w:pPr>
+          </w:p>
+        </w:tc>
+        <w:tc>
+          <w:tcPr>
+            <w:tcW w:w="1503" w:type="dxa"/>
+          </w:tcPr>
+          <w:p>
+            <w:pPr>
+              <w:rPr>
+                <w:b/>
+                <w:lang w:val="en-US"/>
+              </w:rPr>
+            </w:pPr>
+          </w:p>
+        </w:tc>
+        <w:tc>
+          <w:tcPr>
+            <w:tcW w:w="1503" w:type="dxa"/>
+          </w:tcPr>
+          <w:p>
+            <w:pPr>
+              <w:rPr>
+                <w:b/>
+                <w:lang w:val="en-US"/>
+              </w:rPr>
+            </w:pPr>
+          </w:p>
+        </w:tc>
+      </w:tr>
+    </w:tbl>
+    <w:p>
+      <w:pPr>
+        <w:rPr>
+          <w:b/>
+          <w:lang w:val="en-US"/>
+        </w:rPr>
+      </w:pPr>
+    </w:p>
+    <w:p>
+      <w:pPr>
+        <w:rPr>
+          <w:lang w:val="en-US"/>
+        </w:rPr>
+      </w:pPr>
     </w:p>
     <w:sectPr>
       <w:pgSz w:w="11906" w:h="16838"/>
@@ -1192,6 +3242,25 @@
     <w:uiPriority w:val="99"/>
     <w:rsid w:val="00AB3681"/>
   </w:style>
+  <w:style w:type="table" w:styleId="TableGrid">
+    <w:name w:val="Table Grid"/>
+    <w:basedOn w:val="TableNormal"/>
+    <w:uiPriority w:val="39"/>
+    <w:rsid w:val="007322CB"/>
+    <w:pPr>
+      <w:spacing w:after="0" w:line="240" w:lineRule="auto"/>
+    </w:pPr>
+    <w:tblPr>
+      <w:tblBorders>
+        <w:top w:val="single" w:sz="4" w:space="0" w:color="auto"/>
+        <w:left w:val="single" w:sz="4" w:space="0" w:color="auto"/>
+        <w:bottom w:val="single" w:sz="4" w:space="0" w:color="auto"/>
+        <w:right w:val="single" w:sz="4" w:space="0" w:color="auto"/>
+        <w:insideH w:val="single" w:sz="4" w:space="0" w:color="auto"/>
+        <w:insideV w:val="single" w:sz="4" w:space="0" w:color="auto"/>
+      </w:tblBorders>
+    </w:tblPr>
+  </w:style>
 </w:styles>
 </file>
 

</xml_diff>

<commit_message>
tables under heading created
</commit_message>
<xml_diff>
--- a/docs/RaceDay_API_Endpoint_Plan.docx
+++ b/docs/RaceDay_API_Endpoint_Plan.docx
@@ -2363,6 +2363,8 @@
         </w:rPr>
         <w:t>S</w:t>
       </w:r>
+      <w:bookmarkStart w:id="0" w:name="_GoBack"/>
+      <w:bookmarkEnd w:id="0"/>
     </w:p>
     <w:tbl>
       <w:tblPr>
@@ -2390,8 +2392,6 @@
                 <w:lang w:val="en-US"/>
               </w:rPr>
             </w:pPr>
-            <w:bookmarkStart w:id="0" w:name="_GoBack"/>
-            <w:bookmarkEnd w:id="0"/>
           </w:p>
         </w:tc>
         <w:tc>

</xml_diff>

<commit_message>
Populating each table with headings
</commit_message>
<xml_diff>
--- a/docs/RaceDay_API_Endpoint_Plan.docx
+++ b/docs/RaceDay_API_Endpoint_Plan.docx
@@ -640,74 +640,118 @@
                 <w:lang w:val="en-US"/>
               </w:rPr>
             </w:pPr>
-          </w:p>
-        </w:tc>
-        <w:tc>
-          <w:tcPr>
-            <w:tcW w:w="1503" w:type="dxa"/>
-          </w:tcPr>
-          <w:p>
-            <w:pPr>
-              <w:rPr>
-                <w:b/>
-                <w:lang w:val="en-US"/>
-              </w:rPr>
-            </w:pPr>
-          </w:p>
-        </w:tc>
-        <w:tc>
-          <w:tcPr>
-            <w:tcW w:w="1502" w:type="dxa"/>
-          </w:tcPr>
-          <w:p>
-            <w:pPr>
-              <w:rPr>
-                <w:b/>
-                <w:lang w:val="en-US"/>
-              </w:rPr>
-            </w:pPr>
-          </w:p>
-        </w:tc>
-        <w:tc>
-          <w:tcPr>
-            <w:tcW w:w="1502" w:type="dxa"/>
-          </w:tcPr>
-          <w:p>
-            <w:pPr>
-              <w:rPr>
-                <w:b/>
-                <w:lang w:val="en-US"/>
-              </w:rPr>
-            </w:pPr>
-          </w:p>
-        </w:tc>
-        <w:tc>
-          <w:tcPr>
-            <w:tcW w:w="1503" w:type="dxa"/>
-          </w:tcPr>
-          <w:p>
-            <w:pPr>
-              <w:rPr>
-                <w:b/>
-                <w:lang w:val="en-US"/>
-              </w:rPr>
-            </w:pPr>
-          </w:p>
-        </w:tc>
-        <w:tc>
-          <w:tcPr>
-            <w:tcW w:w="1503" w:type="dxa"/>
-          </w:tcPr>
-          <w:p>
-            <w:pPr>
-              <w:rPr>
-                <w:b/>
-                <w:lang w:val="en-US"/>
-              </w:rPr>
-            </w:pPr>
+            <w:bookmarkStart w:id="0" w:name="_GoBack" w:colFirst="0" w:colLast="5"/>
+            <w:r>
+              <w:rPr>
+                <w:b/>
+                <w:lang w:val="en-US"/>
+              </w:rPr>
+              <w:t>HTTP METHOD</w:t>
+            </w:r>
+          </w:p>
+        </w:tc>
+        <w:tc>
+          <w:tcPr>
+            <w:tcW w:w="1503" w:type="dxa"/>
+          </w:tcPr>
+          <w:p>
+            <w:pPr>
+              <w:rPr>
+                <w:b/>
+                <w:lang w:val="en-US"/>
+              </w:rPr>
+            </w:pPr>
+            <w:r>
+              <w:rPr>
+                <w:b/>
+                <w:lang w:val="en-US"/>
+              </w:rPr>
+              <w:t>Route</w:t>
+            </w:r>
+          </w:p>
+        </w:tc>
+        <w:tc>
+          <w:tcPr>
+            <w:tcW w:w="1502" w:type="dxa"/>
+          </w:tcPr>
+          <w:p>
+            <w:pPr>
+              <w:rPr>
+                <w:b/>
+                <w:lang w:val="en-US"/>
+              </w:rPr>
+            </w:pPr>
+            <w:r>
+              <w:rPr>
+                <w:b/>
+                <w:lang w:val="en-US"/>
+              </w:rPr>
+              <w:t>Description</w:t>
+            </w:r>
+          </w:p>
+        </w:tc>
+        <w:tc>
+          <w:tcPr>
+            <w:tcW w:w="1502" w:type="dxa"/>
+          </w:tcPr>
+          <w:p>
+            <w:pPr>
+              <w:rPr>
+                <w:b/>
+                <w:lang w:val="en-US"/>
+              </w:rPr>
+            </w:pPr>
+            <w:r>
+              <w:rPr>
+                <w:b/>
+                <w:lang w:val="en-US"/>
+              </w:rPr>
+              <w:t>Role Requirement</w:t>
+            </w:r>
+          </w:p>
+        </w:tc>
+        <w:tc>
+          <w:tcPr>
+            <w:tcW w:w="1503" w:type="dxa"/>
+          </w:tcPr>
+          <w:p>
+            <w:pPr>
+              <w:rPr>
+                <w:b/>
+                <w:lang w:val="en-US"/>
+              </w:rPr>
+            </w:pPr>
+            <w:r>
+              <w:rPr>
+                <w:b/>
+                <w:lang w:val="en-US"/>
+              </w:rPr>
+              <w:t>Request body</w:t>
+            </w:r>
+          </w:p>
+        </w:tc>
+        <w:tc>
+          <w:tcPr>
+            <w:tcW w:w="1503" w:type="dxa"/>
+          </w:tcPr>
+          <w:p>
+            <w:pPr>
+              <w:rPr>
+                <w:b/>
+                <w:lang w:val="en-US"/>
+              </w:rPr>
+            </w:pPr>
+            <w:r>
+              <w:rPr>
+                <w:b/>
+                <w:lang w:val="en-US"/>
+              </w:rPr>
+              <w:t>Expected Respond</w:t>
+            </w:r>
           </w:p>
         </w:tc>
       </w:tr>
+      <w:bookmarkEnd w:id="0"/>
       <w:tr>
         <w:tc>
           <w:tcPr>
@@ -918,71 +962,113 @@
                 <w:lang w:val="en-US"/>
               </w:rPr>
             </w:pPr>
-          </w:p>
-        </w:tc>
-        <w:tc>
-          <w:tcPr>
-            <w:tcW w:w="1502" w:type="dxa"/>
-          </w:tcPr>
-          <w:p>
-            <w:pPr>
-              <w:rPr>
-                <w:b/>
-                <w:lang w:val="en-US"/>
-              </w:rPr>
-            </w:pPr>
-          </w:p>
-        </w:tc>
-        <w:tc>
-          <w:tcPr>
-            <w:tcW w:w="1503" w:type="dxa"/>
-          </w:tcPr>
-          <w:p>
-            <w:pPr>
-              <w:rPr>
-                <w:b/>
-                <w:lang w:val="en-US"/>
-              </w:rPr>
-            </w:pPr>
-          </w:p>
-        </w:tc>
-        <w:tc>
-          <w:tcPr>
-            <w:tcW w:w="1503" w:type="dxa"/>
-          </w:tcPr>
-          <w:p>
-            <w:pPr>
-              <w:rPr>
-                <w:b/>
-                <w:lang w:val="en-US"/>
-              </w:rPr>
-            </w:pPr>
-          </w:p>
-        </w:tc>
-        <w:tc>
-          <w:tcPr>
-            <w:tcW w:w="1503" w:type="dxa"/>
-          </w:tcPr>
-          <w:p>
-            <w:pPr>
-              <w:rPr>
-                <w:b/>
-                <w:lang w:val="en-US"/>
-              </w:rPr>
-            </w:pPr>
-          </w:p>
-        </w:tc>
-        <w:tc>
-          <w:tcPr>
-            <w:tcW w:w="1503" w:type="dxa"/>
-          </w:tcPr>
-          <w:p>
-            <w:pPr>
-              <w:rPr>
-                <w:b/>
-                <w:lang w:val="en-US"/>
-              </w:rPr>
-            </w:pPr>
+            <w:r>
+              <w:rPr>
+                <w:b/>
+                <w:lang w:val="en-US"/>
+              </w:rPr>
+              <w:t>HTTP METHOD</w:t>
+            </w:r>
+          </w:p>
+        </w:tc>
+        <w:tc>
+          <w:tcPr>
+            <w:tcW w:w="1502" w:type="dxa"/>
+          </w:tcPr>
+          <w:p>
+            <w:pPr>
+              <w:rPr>
+                <w:b/>
+                <w:lang w:val="en-US"/>
+              </w:rPr>
+            </w:pPr>
+            <w:r>
+              <w:rPr>
+                <w:b/>
+                <w:lang w:val="en-US"/>
+              </w:rPr>
+              <w:t>Route</w:t>
+            </w:r>
+          </w:p>
+        </w:tc>
+        <w:tc>
+          <w:tcPr>
+            <w:tcW w:w="1503" w:type="dxa"/>
+          </w:tcPr>
+          <w:p>
+            <w:pPr>
+              <w:rPr>
+                <w:b/>
+                <w:lang w:val="en-US"/>
+              </w:rPr>
+            </w:pPr>
+            <w:r>
+              <w:rPr>
+                <w:b/>
+                <w:lang w:val="en-US"/>
+              </w:rPr>
+              <w:t>Description</w:t>
+            </w:r>
+          </w:p>
+        </w:tc>
+        <w:tc>
+          <w:tcPr>
+            <w:tcW w:w="1503" w:type="dxa"/>
+          </w:tcPr>
+          <w:p>
+            <w:pPr>
+              <w:rPr>
+                <w:b/>
+                <w:lang w:val="en-US"/>
+              </w:rPr>
+            </w:pPr>
+            <w:r>
+              <w:rPr>
+                <w:b/>
+                <w:lang w:val="en-US"/>
+              </w:rPr>
+              <w:t>Role Requirement</w:t>
+            </w:r>
+          </w:p>
+        </w:tc>
+        <w:tc>
+          <w:tcPr>
+            <w:tcW w:w="1503" w:type="dxa"/>
+          </w:tcPr>
+          <w:p>
+            <w:pPr>
+              <w:rPr>
+                <w:b/>
+                <w:lang w:val="en-US"/>
+              </w:rPr>
+            </w:pPr>
+            <w:r>
+              <w:rPr>
+                <w:b/>
+                <w:lang w:val="en-US"/>
+              </w:rPr>
+              <w:t>Request body</w:t>
+            </w:r>
+          </w:p>
+        </w:tc>
+        <w:tc>
+          <w:tcPr>
+            <w:tcW w:w="1503" w:type="dxa"/>
+          </w:tcPr>
+          <w:p>
+            <w:pPr>
+              <w:rPr>
+                <w:b/>
+                <w:lang w:val="en-US"/>
+              </w:rPr>
+            </w:pPr>
+            <w:r>
+              <w:rPr>
+                <w:b/>
+                <w:lang w:val="en-US"/>
+              </w:rPr>
+              <w:t>Expected Respond</w:t>
+            </w:r>
           </w:p>
         </w:tc>
       </w:tr>
@@ -1284,71 +1370,113 @@
                 <w:lang w:val="en-US"/>
               </w:rPr>
             </w:pPr>
-          </w:p>
-        </w:tc>
-        <w:tc>
-          <w:tcPr>
-            <w:tcW w:w="1502" w:type="dxa"/>
-          </w:tcPr>
-          <w:p>
-            <w:pPr>
-              <w:rPr>
-                <w:b/>
-                <w:lang w:val="en-US"/>
-              </w:rPr>
-            </w:pPr>
-          </w:p>
-        </w:tc>
-        <w:tc>
-          <w:tcPr>
-            <w:tcW w:w="1503" w:type="dxa"/>
-          </w:tcPr>
-          <w:p>
-            <w:pPr>
-              <w:rPr>
-                <w:b/>
-                <w:lang w:val="en-US"/>
-              </w:rPr>
-            </w:pPr>
-          </w:p>
-        </w:tc>
-        <w:tc>
-          <w:tcPr>
-            <w:tcW w:w="1503" w:type="dxa"/>
-          </w:tcPr>
-          <w:p>
-            <w:pPr>
-              <w:rPr>
-                <w:b/>
-                <w:lang w:val="en-US"/>
-              </w:rPr>
-            </w:pPr>
-          </w:p>
-        </w:tc>
-        <w:tc>
-          <w:tcPr>
-            <w:tcW w:w="1503" w:type="dxa"/>
-          </w:tcPr>
-          <w:p>
-            <w:pPr>
-              <w:rPr>
-                <w:b/>
-                <w:lang w:val="en-US"/>
-              </w:rPr>
-            </w:pPr>
-          </w:p>
-        </w:tc>
-        <w:tc>
-          <w:tcPr>
-            <w:tcW w:w="1503" w:type="dxa"/>
-          </w:tcPr>
-          <w:p>
-            <w:pPr>
-              <w:rPr>
-                <w:b/>
-                <w:lang w:val="en-US"/>
-              </w:rPr>
-            </w:pPr>
+            <w:r>
+              <w:rPr>
+                <w:b/>
+                <w:lang w:val="en-US"/>
+              </w:rPr>
+              <w:t>HTTP METHOD</w:t>
+            </w:r>
+          </w:p>
+        </w:tc>
+        <w:tc>
+          <w:tcPr>
+            <w:tcW w:w="1502" w:type="dxa"/>
+          </w:tcPr>
+          <w:p>
+            <w:pPr>
+              <w:rPr>
+                <w:b/>
+                <w:lang w:val="en-US"/>
+              </w:rPr>
+            </w:pPr>
+            <w:r>
+              <w:rPr>
+                <w:b/>
+                <w:lang w:val="en-US"/>
+              </w:rPr>
+              <w:t>Route</w:t>
+            </w:r>
+          </w:p>
+        </w:tc>
+        <w:tc>
+          <w:tcPr>
+            <w:tcW w:w="1503" w:type="dxa"/>
+          </w:tcPr>
+          <w:p>
+            <w:pPr>
+              <w:rPr>
+                <w:b/>
+                <w:lang w:val="en-US"/>
+              </w:rPr>
+            </w:pPr>
+            <w:r>
+              <w:rPr>
+                <w:b/>
+                <w:lang w:val="en-US"/>
+              </w:rPr>
+              <w:t>Description</w:t>
+            </w:r>
+          </w:p>
+        </w:tc>
+        <w:tc>
+          <w:tcPr>
+            <w:tcW w:w="1503" w:type="dxa"/>
+          </w:tcPr>
+          <w:p>
+            <w:pPr>
+              <w:rPr>
+                <w:b/>
+                <w:lang w:val="en-US"/>
+              </w:rPr>
+            </w:pPr>
+            <w:r>
+              <w:rPr>
+                <w:b/>
+                <w:lang w:val="en-US"/>
+              </w:rPr>
+              <w:t>Role Requirement</w:t>
+            </w:r>
+          </w:p>
+        </w:tc>
+        <w:tc>
+          <w:tcPr>
+            <w:tcW w:w="1503" w:type="dxa"/>
+          </w:tcPr>
+          <w:p>
+            <w:pPr>
+              <w:rPr>
+                <w:b/>
+                <w:lang w:val="en-US"/>
+              </w:rPr>
+            </w:pPr>
+            <w:r>
+              <w:rPr>
+                <w:b/>
+                <w:lang w:val="en-US"/>
+              </w:rPr>
+              <w:t>Request body</w:t>
+            </w:r>
+          </w:p>
+        </w:tc>
+        <w:tc>
+          <w:tcPr>
+            <w:tcW w:w="1503" w:type="dxa"/>
+          </w:tcPr>
+          <w:p>
+            <w:pPr>
+              <w:rPr>
+                <w:b/>
+                <w:lang w:val="en-US"/>
+              </w:rPr>
+            </w:pPr>
+            <w:r>
+              <w:rPr>
+                <w:b/>
+                <w:lang w:val="en-US"/>
+              </w:rPr>
+              <w:t>Expected Respond</w:t>
+            </w:r>
           </w:p>
         </w:tc>
       </w:tr>
@@ -1650,71 +1778,113 @@
                 <w:lang w:val="en-US"/>
               </w:rPr>
             </w:pPr>
-          </w:p>
-        </w:tc>
-        <w:tc>
-          <w:tcPr>
-            <w:tcW w:w="1502" w:type="dxa"/>
-          </w:tcPr>
-          <w:p>
-            <w:pPr>
-              <w:rPr>
-                <w:b/>
-                <w:lang w:val="en-US"/>
-              </w:rPr>
-            </w:pPr>
-          </w:p>
-        </w:tc>
-        <w:tc>
-          <w:tcPr>
-            <w:tcW w:w="1503" w:type="dxa"/>
-          </w:tcPr>
-          <w:p>
-            <w:pPr>
-              <w:rPr>
-                <w:b/>
-                <w:lang w:val="en-US"/>
-              </w:rPr>
-            </w:pPr>
-          </w:p>
-        </w:tc>
-        <w:tc>
-          <w:tcPr>
-            <w:tcW w:w="1503" w:type="dxa"/>
-          </w:tcPr>
-          <w:p>
-            <w:pPr>
-              <w:rPr>
-                <w:b/>
-                <w:lang w:val="en-US"/>
-              </w:rPr>
-            </w:pPr>
-          </w:p>
-        </w:tc>
-        <w:tc>
-          <w:tcPr>
-            <w:tcW w:w="1503" w:type="dxa"/>
-          </w:tcPr>
-          <w:p>
-            <w:pPr>
-              <w:rPr>
-                <w:b/>
-                <w:lang w:val="en-US"/>
-              </w:rPr>
-            </w:pPr>
-          </w:p>
-        </w:tc>
-        <w:tc>
-          <w:tcPr>
-            <w:tcW w:w="1503" w:type="dxa"/>
-          </w:tcPr>
-          <w:p>
-            <w:pPr>
-              <w:rPr>
-                <w:b/>
-                <w:lang w:val="en-US"/>
-              </w:rPr>
-            </w:pPr>
+            <w:r>
+              <w:rPr>
+                <w:b/>
+                <w:lang w:val="en-US"/>
+              </w:rPr>
+              <w:t>HTTP METHOD</w:t>
+            </w:r>
+          </w:p>
+        </w:tc>
+        <w:tc>
+          <w:tcPr>
+            <w:tcW w:w="1502" w:type="dxa"/>
+          </w:tcPr>
+          <w:p>
+            <w:pPr>
+              <w:rPr>
+                <w:b/>
+                <w:lang w:val="en-US"/>
+              </w:rPr>
+            </w:pPr>
+            <w:r>
+              <w:rPr>
+                <w:b/>
+                <w:lang w:val="en-US"/>
+              </w:rPr>
+              <w:t>Route</w:t>
+            </w:r>
+          </w:p>
+        </w:tc>
+        <w:tc>
+          <w:tcPr>
+            <w:tcW w:w="1503" w:type="dxa"/>
+          </w:tcPr>
+          <w:p>
+            <w:pPr>
+              <w:rPr>
+                <w:b/>
+                <w:lang w:val="en-US"/>
+              </w:rPr>
+            </w:pPr>
+            <w:r>
+              <w:rPr>
+                <w:b/>
+                <w:lang w:val="en-US"/>
+              </w:rPr>
+              <w:t>Description</w:t>
+            </w:r>
+          </w:p>
+        </w:tc>
+        <w:tc>
+          <w:tcPr>
+            <w:tcW w:w="1503" w:type="dxa"/>
+          </w:tcPr>
+          <w:p>
+            <w:pPr>
+              <w:rPr>
+                <w:b/>
+                <w:lang w:val="en-US"/>
+              </w:rPr>
+            </w:pPr>
+            <w:r>
+              <w:rPr>
+                <w:b/>
+                <w:lang w:val="en-US"/>
+              </w:rPr>
+              <w:t>Role Requirement</w:t>
+            </w:r>
+          </w:p>
+        </w:tc>
+        <w:tc>
+          <w:tcPr>
+            <w:tcW w:w="1503" w:type="dxa"/>
+          </w:tcPr>
+          <w:p>
+            <w:pPr>
+              <w:rPr>
+                <w:b/>
+                <w:lang w:val="en-US"/>
+              </w:rPr>
+            </w:pPr>
+            <w:r>
+              <w:rPr>
+                <w:b/>
+                <w:lang w:val="en-US"/>
+              </w:rPr>
+              <w:t>Request body</w:t>
+            </w:r>
+          </w:p>
+        </w:tc>
+        <w:tc>
+          <w:tcPr>
+            <w:tcW w:w="1503" w:type="dxa"/>
+          </w:tcPr>
+          <w:p>
+            <w:pPr>
+              <w:rPr>
+                <w:b/>
+                <w:lang w:val="en-US"/>
+              </w:rPr>
+            </w:pPr>
+            <w:r>
+              <w:rPr>
+                <w:b/>
+                <w:lang w:val="en-US"/>
+              </w:rPr>
+              <w:t>Expected Respond</w:t>
+            </w:r>
           </w:p>
         </w:tc>
       </w:tr>
@@ -2016,71 +2186,113 @@
                 <w:lang w:val="en-US"/>
               </w:rPr>
             </w:pPr>
-          </w:p>
-        </w:tc>
-        <w:tc>
-          <w:tcPr>
-            <w:tcW w:w="1502" w:type="dxa"/>
-          </w:tcPr>
-          <w:p>
-            <w:pPr>
-              <w:rPr>
-                <w:b/>
-                <w:lang w:val="en-US"/>
-              </w:rPr>
-            </w:pPr>
-          </w:p>
-        </w:tc>
-        <w:tc>
-          <w:tcPr>
-            <w:tcW w:w="1503" w:type="dxa"/>
-          </w:tcPr>
-          <w:p>
-            <w:pPr>
-              <w:rPr>
-                <w:b/>
-                <w:lang w:val="en-US"/>
-              </w:rPr>
-            </w:pPr>
-          </w:p>
-        </w:tc>
-        <w:tc>
-          <w:tcPr>
-            <w:tcW w:w="1503" w:type="dxa"/>
-          </w:tcPr>
-          <w:p>
-            <w:pPr>
-              <w:rPr>
-                <w:b/>
-                <w:lang w:val="en-US"/>
-              </w:rPr>
-            </w:pPr>
-          </w:p>
-        </w:tc>
-        <w:tc>
-          <w:tcPr>
-            <w:tcW w:w="1503" w:type="dxa"/>
-          </w:tcPr>
-          <w:p>
-            <w:pPr>
-              <w:rPr>
-                <w:b/>
-                <w:lang w:val="en-US"/>
-              </w:rPr>
-            </w:pPr>
-          </w:p>
-        </w:tc>
-        <w:tc>
-          <w:tcPr>
-            <w:tcW w:w="1503" w:type="dxa"/>
-          </w:tcPr>
-          <w:p>
-            <w:pPr>
-              <w:rPr>
-                <w:b/>
-                <w:lang w:val="en-US"/>
-              </w:rPr>
-            </w:pPr>
+            <w:r>
+              <w:rPr>
+                <w:b/>
+                <w:lang w:val="en-US"/>
+              </w:rPr>
+              <w:t>HTTP METHOD</w:t>
+            </w:r>
+          </w:p>
+        </w:tc>
+        <w:tc>
+          <w:tcPr>
+            <w:tcW w:w="1502" w:type="dxa"/>
+          </w:tcPr>
+          <w:p>
+            <w:pPr>
+              <w:rPr>
+                <w:b/>
+                <w:lang w:val="en-US"/>
+              </w:rPr>
+            </w:pPr>
+            <w:r>
+              <w:rPr>
+                <w:b/>
+                <w:lang w:val="en-US"/>
+              </w:rPr>
+              <w:t>Route</w:t>
+            </w:r>
+          </w:p>
+        </w:tc>
+        <w:tc>
+          <w:tcPr>
+            <w:tcW w:w="1503" w:type="dxa"/>
+          </w:tcPr>
+          <w:p>
+            <w:pPr>
+              <w:rPr>
+                <w:b/>
+                <w:lang w:val="en-US"/>
+              </w:rPr>
+            </w:pPr>
+            <w:r>
+              <w:rPr>
+                <w:b/>
+                <w:lang w:val="en-US"/>
+              </w:rPr>
+              <w:t>Description</w:t>
+            </w:r>
+          </w:p>
+        </w:tc>
+        <w:tc>
+          <w:tcPr>
+            <w:tcW w:w="1503" w:type="dxa"/>
+          </w:tcPr>
+          <w:p>
+            <w:pPr>
+              <w:rPr>
+                <w:b/>
+                <w:lang w:val="en-US"/>
+              </w:rPr>
+            </w:pPr>
+            <w:r>
+              <w:rPr>
+                <w:b/>
+                <w:lang w:val="en-US"/>
+              </w:rPr>
+              <w:t>Role Requirement</w:t>
+            </w:r>
+          </w:p>
+        </w:tc>
+        <w:tc>
+          <w:tcPr>
+            <w:tcW w:w="1503" w:type="dxa"/>
+          </w:tcPr>
+          <w:p>
+            <w:pPr>
+              <w:rPr>
+                <w:b/>
+                <w:lang w:val="en-US"/>
+              </w:rPr>
+            </w:pPr>
+            <w:r>
+              <w:rPr>
+                <w:b/>
+                <w:lang w:val="en-US"/>
+              </w:rPr>
+              <w:t>Request body</w:t>
+            </w:r>
+          </w:p>
+        </w:tc>
+        <w:tc>
+          <w:tcPr>
+            <w:tcW w:w="1503" w:type="dxa"/>
+          </w:tcPr>
+          <w:p>
+            <w:pPr>
+              <w:rPr>
+                <w:b/>
+                <w:lang w:val="en-US"/>
+              </w:rPr>
+            </w:pPr>
+            <w:r>
+              <w:rPr>
+                <w:b/>
+                <w:lang w:val="en-US"/>
+              </w:rPr>
+              <w:t>Expected Respond</w:t>
+            </w:r>
           </w:p>
         </w:tc>
       </w:tr>
@@ -2353,7 +2565,6 @@
           <w:b/>
           <w:lang w:val="en-US"/>
         </w:rPr>
-        <w:lastRenderedPageBreak/>
         <w:t>RESULT</w:t>
       </w:r>
       <w:r>
@@ -2363,8 +2574,6 @@
         </w:rPr>
         <w:t>S</w:t>
       </w:r>
-      <w:bookmarkStart w:id="0" w:name="_GoBack"/>
-      <w:bookmarkEnd w:id="0"/>
     </w:p>
     <w:tbl>
       <w:tblPr>
@@ -2392,71 +2601,113 @@
                 <w:lang w:val="en-US"/>
               </w:rPr>
             </w:pPr>
-          </w:p>
-        </w:tc>
-        <w:tc>
-          <w:tcPr>
-            <w:tcW w:w="1502" w:type="dxa"/>
-          </w:tcPr>
-          <w:p>
-            <w:pPr>
-              <w:rPr>
-                <w:b/>
-                <w:lang w:val="en-US"/>
-              </w:rPr>
-            </w:pPr>
-          </w:p>
-        </w:tc>
-        <w:tc>
-          <w:tcPr>
-            <w:tcW w:w="1503" w:type="dxa"/>
-          </w:tcPr>
-          <w:p>
-            <w:pPr>
-              <w:rPr>
-                <w:b/>
-                <w:lang w:val="en-US"/>
-              </w:rPr>
-            </w:pPr>
-          </w:p>
-        </w:tc>
-        <w:tc>
-          <w:tcPr>
-            <w:tcW w:w="1503" w:type="dxa"/>
-          </w:tcPr>
-          <w:p>
-            <w:pPr>
-              <w:rPr>
-                <w:b/>
-                <w:lang w:val="en-US"/>
-              </w:rPr>
-            </w:pPr>
-          </w:p>
-        </w:tc>
-        <w:tc>
-          <w:tcPr>
-            <w:tcW w:w="1503" w:type="dxa"/>
-          </w:tcPr>
-          <w:p>
-            <w:pPr>
-              <w:rPr>
-                <w:b/>
-                <w:lang w:val="en-US"/>
-              </w:rPr>
-            </w:pPr>
-          </w:p>
-        </w:tc>
-        <w:tc>
-          <w:tcPr>
-            <w:tcW w:w="1503" w:type="dxa"/>
-          </w:tcPr>
-          <w:p>
-            <w:pPr>
-              <w:rPr>
-                <w:b/>
-                <w:lang w:val="en-US"/>
-              </w:rPr>
-            </w:pPr>
+            <w:r>
+              <w:rPr>
+                <w:b/>
+                <w:lang w:val="en-US"/>
+              </w:rPr>
+              <w:t>HTTP METHOD</w:t>
+            </w:r>
+          </w:p>
+        </w:tc>
+        <w:tc>
+          <w:tcPr>
+            <w:tcW w:w="1502" w:type="dxa"/>
+          </w:tcPr>
+          <w:p>
+            <w:pPr>
+              <w:rPr>
+                <w:b/>
+                <w:lang w:val="en-US"/>
+              </w:rPr>
+            </w:pPr>
+            <w:r>
+              <w:rPr>
+                <w:b/>
+                <w:lang w:val="en-US"/>
+              </w:rPr>
+              <w:t>Route</w:t>
+            </w:r>
+          </w:p>
+        </w:tc>
+        <w:tc>
+          <w:tcPr>
+            <w:tcW w:w="1503" w:type="dxa"/>
+          </w:tcPr>
+          <w:p>
+            <w:pPr>
+              <w:rPr>
+                <w:b/>
+                <w:lang w:val="en-US"/>
+              </w:rPr>
+            </w:pPr>
+            <w:r>
+              <w:rPr>
+                <w:b/>
+                <w:lang w:val="en-US"/>
+              </w:rPr>
+              <w:t>Description</w:t>
+            </w:r>
+          </w:p>
+        </w:tc>
+        <w:tc>
+          <w:tcPr>
+            <w:tcW w:w="1503" w:type="dxa"/>
+          </w:tcPr>
+          <w:p>
+            <w:pPr>
+              <w:rPr>
+                <w:b/>
+                <w:lang w:val="en-US"/>
+              </w:rPr>
+            </w:pPr>
+            <w:r>
+              <w:rPr>
+                <w:b/>
+                <w:lang w:val="en-US"/>
+              </w:rPr>
+              <w:t>Role Requirement</w:t>
+            </w:r>
+          </w:p>
+        </w:tc>
+        <w:tc>
+          <w:tcPr>
+            <w:tcW w:w="1503" w:type="dxa"/>
+          </w:tcPr>
+          <w:p>
+            <w:pPr>
+              <w:rPr>
+                <w:b/>
+                <w:lang w:val="en-US"/>
+              </w:rPr>
+            </w:pPr>
+            <w:r>
+              <w:rPr>
+                <w:b/>
+                <w:lang w:val="en-US"/>
+              </w:rPr>
+              <w:t>Request body</w:t>
+            </w:r>
+          </w:p>
+        </w:tc>
+        <w:tc>
+          <w:tcPr>
+            <w:tcW w:w="1503" w:type="dxa"/>
+          </w:tcPr>
+          <w:p>
+            <w:pPr>
+              <w:rPr>
+                <w:b/>
+                <w:lang w:val="en-US"/>
+              </w:rPr>
+            </w:pPr>
+            <w:r>
+              <w:rPr>
+                <w:b/>
+                <w:lang w:val="en-US"/>
+              </w:rPr>
+              <w:t>Expected Respond</w:t>
+            </w:r>
           </w:p>
         </w:tc>
       </w:tr>

</xml_diff>

<commit_message>
highlighting each teable with a different color
</commit_message>
<xml_diff>
--- a/docs/RaceDay_API_Endpoint_Plan.docx
+++ b/docs/RaceDay_API_Endpoint_Plan.docx
@@ -632,15 +632,15 @@
         <w:tc>
           <w:tcPr>
             <w:tcW w:w="1503" w:type="dxa"/>
-          </w:tcPr>
-          <w:p>
-            <w:pPr>
-              <w:rPr>
-                <w:b/>
-                <w:lang w:val="en-US"/>
-              </w:rPr>
-            </w:pPr>
-            <w:bookmarkStart w:id="0" w:name="_GoBack" w:colFirst="0" w:colLast="5"/>
+            <w:shd w:val="clear" w:color="auto" w:fill="833C0B" w:themeFill="accent2" w:themeFillShade="80"/>
+          </w:tcPr>
+          <w:p>
+            <w:pPr>
+              <w:rPr>
+                <w:b/>
+                <w:lang w:val="en-US"/>
+              </w:rPr>
+            </w:pPr>
             <w:r>
               <w:rPr>
                 <w:b/>
@@ -653,6 +653,7 @@
         <w:tc>
           <w:tcPr>
             <w:tcW w:w="1503" w:type="dxa"/>
+            <w:shd w:val="clear" w:color="auto" w:fill="833C0B" w:themeFill="accent2" w:themeFillShade="80"/>
           </w:tcPr>
           <w:p>
             <w:pPr>
@@ -673,6 +674,7 @@
         <w:tc>
           <w:tcPr>
             <w:tcW w:w="1502" w:type="dxa"/>
+            <w:shd w:val="clear" w:color="auto" w:fill="833C0B" w:themeFill="accent2" w:themeFillShade="80"/>
           </w:tcPr>
           <w:p>
             <w:pPr>
@@ -693,6 +695,7 @@
         <w:tc>
           <w:tcPr>
             <w:tcW w:w="1502" w:type="dxa"/>
+            <w:shd w:val="clear" w:color="auto" w:fill="833C0B" w:themeFill="accent2" w:themeFillShade="80"/>
           </w:tcPr>
           <w:p>
             <w:pPr>
@@ -713,6 +716,7 @@
         <w:tc>
           <w:tcPr>
             <w:tcW w:w="1503" w:type="dxa"/>
+            <w:shd w:val="clear" w:color="auto" w:fill="833C0B" w:themeFill="accent2" w:themeFillShade="80"/>
           </w:tcPr>
           <w:p>
             <w:pPr>
@@ -733,6 +737,7 @@
         <w:tc>
           <w:tcPr>
             <w:tcW w:w="1503" w:type="dxa"/>
+            <w:shd w:val="clear" w:color="auto" w:fill="833C0B" w:themeFill="accent2" w:themeFillShade="80"/>
           </w:tcPr>
           <w:p>
             <w:pPr>
@@ -751,7 +756,6 @@
           </w:p>
         </w:tc>
       </w:tr>
-      <w:bookmarkEnd w:id="0"/>
       <w:tr>
         <w:tc>
           <w:tcPr>
@@ -954,6 +958,7 @@
         <w:tc>
           <w:tcPr>
             <w:tcW w:w="1502" w:type="dxa"/>
+            <w:shd w:val="clear" w:color="auto" w:fill="833C0B" w:themeFill="accent2" w:themeFillShade="80"/>
           </w:tcPr>
           <w:p>
             <w:pPr>
@@ -974,6 +979,7 @@
         <w:tc>
           <w:tcPr>
             <w:tcW w:w="1502" w:type="dxa"/>
+            <w:shd w:val="clear" w:color="auto" w:fill="833C0B" w:themeFill="accent2" w:themeFillShade="80"/>
           </w:tcPr>
           <w:p>
             <w:pPr>
@@ -994,6 +1000,7 @@
         <w:tc>
           <w:tcPr>
             <w:tcW w:w="1503" w:type="dxa"/>
+            <w:shd w:val="clear" w:color="auto" w:fill="833C0B" w:themeFill="accent2" w:themeFillShade="80"/>
           </w:tcPr>
           <w:p>
             <w:pPr>
@@ -1014,6 +1021,7 @@
         <w:tc>
           <w:tcPr>
             <w:tcW w:w="1503" w:type="dxa"/>
+            <w:shd w:val="clear" w:color="auto" w:fill="833C0B" w:themeFill="accent2" w:themeFillShade="80"/>
           </w:tcPr>
           <w:p>
             <w:pPr>
@@ -1034,6 +1042,7 @@
         <w:tc>
           <w:tcPr>
             <w:tcW w:w="1503" w:type="dxa"/>
+            <w:shd w:val="clear" w:color="auto" w:fill="833C0B" w:themeFill="accent2" w:themeFillShade="80"/>
           </w:tcPr>
           <w:p>
             <w:pPr>
@@ -1054,6 +1063,7 @@
         <w:tc>
           <w:tcPr>
             <w:tcW w:w="1503" w:type="dxa"/>
+            <w:shd w:val="clear" w:color="auto" w:fill="833C0B" w:themeFill="accent2" w:themeFillShade="80"/>
           </w:tcPr>
           <w:p>
             <w:pPr>
@@ -1362,6 +1372,7 @@
         <w:tc>
           <w:tcPr>
             <w:tcW w:w="1502" w:type="dxa"/>
+            <w:shd w:val="clear" w:color="auto" w:fill="833C0B" w:themeFill="accent2" w:themeFillShade="80"/>
           </w:tcPr>
           <w:p>
             <w:pPr>
@@ -1382,6 +1393,7 @@
         <w:tc>
           <w:tcPr>
             <w:tcW w:w="1502" w:type="dxa"/>
+            <w:shd w:val="clear" w:color="auto" w:fill="833C0B" w:themeFill="accent2" w:themeFillShade="80"/>
           </w:tcPr>
           <w:p>
             <w:pPr>
@@ -1402,6 +1414,7 @@
         <w:tc>
           <w:tcPr>
             <w:tcW w:w="1503" w:type="dxa"/>
+            <w:shd w:val="clear" w:color="auto" w:fill="833C0B" w:themeFill="accent2" w:themeFillShade="80"/>
           </w:tcPr>
           <w:p>
             <w:pPr>
@@ -1422,6 +1435,7 @@
         <w:tc>
           <w:tcPr>
             <w:tcW w:w="1503" w:type="dxa"/>
+            <w:shd w:val="clear" w:color="auto" w:fill="833C0B" w:themeFill="accent2" w:themeFillShade="80"/>
           </w:tcPr>
           <w:p>
             <w:pPr>
@@ -1442,6 +1456,7 @@
         <w:tc>
           <w:tcPr>
             <w:tcW w:w="1503" w:type="dxa"/>
+            <w:shd w:val="clear" w:color="auto" w:fill="833C0B" w:themeFill="accent2" w:themeFillShade="80"/>
           </w:tcPr>
           <w:p>
             <w:pPr>
@@ -1462,6 +1477,7 @@
         <w:tc>
           <w:tcPr>
             <w:tcW w:w="1503" w:type="dxa"/>
+            <w:shd w:val="clear" w:color="auto" w:fill="833C0B" w:themeFill="accent2" w:themeFillShade="80"/>
           </w:tcPr>
           <w:p>
             <w:pPr>
@@ -1770,6 +1786,7 @@
         <w:tc>
           <w:tcPr>
             <w:tcW w:w="1502" w:type="dxa"/>
+            <w:shd w:val="clear" w:color="auto" w:fill="833C0B" w:themeFill="accent2" w:themeFillShade="80"/>
           </w:tcPr>
           <w:p>
             <w:pPr>
@@ -1790,6 +1807,7 @@
         <w:tc>
           <w:tcPr>
             <w:tcW w:w="1502" w:type="dxa"/>
+            <w:shd w:val="clear" w:color="auto" w:fill="833C0B" w:themeFill="accent2" w:themeFillShade="80"/>
           </w:tcPr>
           <w:p>
             <w:pPr>
@@ -1810,6 +1828,7 @@
         <w:tc>
           <w:tcPr>
             <w:tcW w:w="1503" w:type="dxa"/>
+            <w:shd w:val="clear" w:color="auto" w:fill="833C0B" w:themeFill="accent2" w:themeFillShade="80"/>
           </w:tcPr>
           <w:p>
             <w:pPr>
@@ -1830,6 +1849,7 @@
         <w:tc>
           <w:tcPr>
             <w:tcW w:w="1503" w:type="dxa"/>
+            <w:shd w:val="clear" w:color="auto" w:fill="833C0B" w:themeFill="accent2" w:themeFillShade="80"/>
           </w:tcPr>
           <w:p>
             <w:pPr>
@@ -1850,6 +1870,7 @@
         <w:tc>
           <w:tcPr>
             <w:tcW w:w="1503" w:type="dxa"/>
+            <w:shd w:val="clear" w:color="auto" w:fill="833C0B" w:themeFill="accent2" w:themeFillShade="80"/>
           </w:tcPr>
           <w:p>
             <w:pPr>
@@ -1870,6 +1891,7 @@
         <w:tc>
           <w:tcPr>
             <w:tcW w:w="1503" w:type="dxa"/>
+            <w:shd w:val="clear" w:color="auto" w:fill="833C0B" w:themeFill="accent2" w:themeFillShade="80"/>
           </w:tcPr>
           <w:p>
             <w:pPr>
@@ -2178,6 +2200,7 @@
         <w:tc>
           <w:tcPr>
             <w:tcW w:w="1502" w:type="dxa"/>
+            <w:shd w:val="clear" w:color="auto" w:fill="833C0B" w:themeFill="accent2" w:themeFillShade="80"/>
           </w:tcPr>
           <w:p>
             <w:pPr>
@@ -2198,6 +2221,7 @@
         <w:tc>
           <w:tcPr>
             <w:tcW w:w="1502" w:type="dxa"/>
+            <w:shd w:val="clear" w:color="auto" w:fill="833C0B" w:themeFill="accent2" w:themeFillShade="80"/>
           </w:tcPr>
           <w:p>
             <w:pPr>
@@ -2218,6 +2242,7 @@
         <w:tc>
           <w:tcPr>
             <w:tcW w:w="1503" w:type="dxa"/>
+            <w:shd w:val="clear" w:color="auto" w:fill="833C0B" w:themeFill="accent2" w:themeFillShade="80"/>
           </w:tcPr>
           <w:p>
             <w:pPr>
@@ -2238,6 +2263,7 @@
         <w:tc>
           <w:tcPr>
             <w:tcW w:w="1503" w:type="dxa"/>
+            <w:shd w:val="clear" w:color="auto" w:fill="833C0B" w:themeFill="accent2" w:themeFillShade="80"/>
           </w:tcPr>
           <w:p>
             <w:pPr>
@@ -2258,6 +2284,7 @@
         <w:tc>
           <w:tcPr>
             <w:tcW w:w="1503" w:type="dxa"/>
+            <w:shd w:val="clear" w:color="auto" w:fill="833C0B" w:themeFill="accent2" w:themeFillShade="80"/>
           </w:tcPr>
           <w:p>
             <w:pPr>
@@ -2278,6 +2305,7 @@
         <w:tc>
           <w:tcPr>
             <w:tcW w:w="1503" w:type="dxa"/>
+            <w:shd w:val="clear" w:color="auto" w:fill="833C0B" w:themeFill="accent2" w:themeFillShade="80"/>
           </w:tcPr>
           <w:p>
             <w:pPr>
@@ -2593,14 +2621,16 @@
         <w:tc>
           <w:tcPr>
             <w:tcW w:w="1502" w:type="dxa"/>
-          </w:tcPr>
-          <w:p>
-            <w:pPr>
-              <w:rPr>
-                <w:b/>
-                <w:lang w:val="en-US"/>
-              </w:rPr>
-            </w:pPr>
+            <w:shd w:val="clear" w:color="auto" w:fill="833C0B" w:themeFill="accent2" w:themeFillShade="80"/>
+          </w:tcPr>
+          <w:p>
+            <w:pPr>
+              <w:rPr>
+                <w:b/>
+                <w:lang w:val="en-US"/>
+              </w:rPr>
+            </w:pPr>
+            <w:bookmarkStart w:id="0" w:name="_GoBack" w:colFirst="0" w:colLast="5"/>
             <w:r>
               <w:rPr>
                 <w:b/>
@@ -2613,6 +2643,7 @@
         <w:tc>
           <w:tcPr>
             <w:tcW w:w="1502" w:type="dxa"/>
+            <w:shd w:val="clear" w:color="auto" w:fill="833C0B" w:themeFill="accent2" w:themeFillShade="80"/>
           </w:tcPr>
           <w:p>
             <w:pPr>
@@ -2633,6 +2664,7 @@
         <w:tc>
           <w:tcPr>
             <w:tcW w:w="1503" w:type="dxa"/>
+            <w:shd w:val="clear" w:color="auto" w:fill="833C0B" w:themeFill="accent2" w:themeFillShade="80"/>
           </w:tcPr>
           <w:p>
             <w:pPr>
@@ -2653,6 +2685,7 @@
         <w:tc>
           <w:tcPr>
             <w:tcW w:w="1503" w:type="dxa"/>
+            <w:shd w:val="clear" w:color="auto" w:fill="833C0B" w:themeFill="accent2" w:themeFillShade="80"/>
           </w:tcPr>
           <w:p>
             <w:pPr>
@@ -2673,6 +2706,7 @@
         <w:tc>
           <w:tcPr>
             <w:tcW w:w="1503" w:type="dxa"/>
+            <w:shd w:val="clear" w:color="auto" w:fill="833C0B" w:themeFill="accent2" w:themeFillShade="80"/>
           </w:tcPr>
           <w:p>
             <w:pPr>
@@ -2693,6 +2727,7 @@
         <w:tc>
           <w:tcPr>
             <w:tcW w:w="1503" w:type="dxa"/>
+            <w:shd w:val="clear" w:color="auto" w:fill="833C0B" w:themeFill="accent2" w:themeFillShade="80"/>
           </w:tcPr>
           <w:p>
             <w:pPr>
@@ -2711,6 +2746,7 @@
           </w:p>
         </w:tc>
       </w:tr>
+      <w:bookmarkEnd w:id="0"/>
       <w:tr>
         <w:tc>
           <w:tcPr>

</xml_diff>

<commit_message>
populating the first column with information
</commit_message>
<xml_diff>
--- a/docs/RaceDay_API_Endpoint_Plan.docx
+++ b/docs/RaceDay_API_Endpoint_Plan.docx
@@ -621,17 +621,17 @@
         <w:tblLook w:val="04A0" w:firstRow="1" w:lastRow="0" w:firstColumn="1" w:lastColumn="0" w:noHBand="0" w:noVBand="1"/>
       </w:tblPr>
       <w:tblGrid>
-        <w:gridCol w:w="1503"/>
-        <w:gridCol w:w="1503"/>
-        <w:gridCol w:w="1502"/>
-        <w:gridCol w:w="1502"/>
-        <w:gridCol w:w="1503"/>
-        <w:gridCol w:w="1503"/>
+        <w:gridCol w:w="1401"/>
+        <w:gridCol w:w="1406"/>
+        <w:gridCol w:w="1494"/>
+        <w:gridCol w:w="1482"/>
+        <w:gridCol w:w="1744"/>
+        <w:gridCol w:w="1489"/>
       </w:tblGrid>
       <w:tr>
         <w:tc>
           <w:tcPr>
-            <w:tcW w:w="1503" w:type="dxa"/>
+            <w:tcW w:w="1401" w:type="dxa"/>
             <w:shd w:val="clear" w:color="auto" w:fill="833C0B" w:themeFill="accent2" w:themeFillShade="80"/>
           </w:tcPr>
           <w:p>
@@ -652,7 +652,7 @@
         </w:tc>
         <w:tc>
           <w:tcPr>
-            <w:tcW w:w="1503" w:type="dxa"/>
+            <w:tcW w:w="1406" w:type="dxa"/>
             <w:shd w:val="clear" w:color="auto" w:fill="833C0B" w:themeFill="accent2" w:themeFillShade="80"/>
           </w:tcPr>
           <w:p>
@@ -673,7 +673,7 @@
         </w:tc>
         <w:tc>
           <w:tcPr>
-            <w:tcW w:w="1502" w:type="dxa"/>
+            <w:tcW w:w="1494" w:type="dxa"/>
             <w:shd w:val="clear" w:color="auto" w:fill="833C0B" w:themeFill="accent2" w:themeFillShade="80"/>
           </w:tcPr>
           <w:p>
@@ -694,7 +694,7 @@
         </w:tc>
         <w:tc>
           <w:tcPr>
-            <w:tcW w:w="1502" w:type="dxa"/>
+            <w:tcW w:w="1482" w:type="dxa"/>
             <w:shd w:val="clear" w:color="auto" w:fill="833C0B" w:themeFill="accent2" w:themeFillShade="80"/>
           </w:tcPr>
           <w:p>
@@ -715,7 +715,7 @@
         </w:tc>
         <w:tc>
           <w:tcPr>
-            <w:tcW w:w="1503" w:type="dxa"/>
+            <w:tcW w:w="1744" w:type="dxa"/>
             <w:shd w:val="clear" w:color="auto" w:fill="833C0B" w:themeFill="accent2" w:themeFillShade="80"/>
           </w:tcPr>
           <w:p>
@@ -736,7 +736,7 @@
         </w:tc>
         <w:tc>
           <w:tcPr>
-            <w:tcW w:w="1503" w:type="dxa"/>
+            <w:tcW w:w="1489" w:type="dxa"/>
             <w:shd w:val="clear" w:color="auto" w:fill="833C0B" w:themeFill="accent2" w:themeFillShade="80"/>
           </w:tcPr>
           <w:p>
@@ -759,160 +759,184 @@
       <w:tr>
         <w:tc>
           <w:tcPr>
-            <w:tcW w:w="1503" w:type="dxa"/>
-          </w:tcPr>
-          <w:p>
-            <w:pPr>
-              <w:rPr>
-                <w:b/>
-                <w:lang w:val="en-US"/>
-              </w:rPr>
-            </w:pPr>
-          </w:p>
-        </w:tc>
-        <w:tc>
-          <w:tcPr>
-            <w:tcW w:w="1503" w:type="dxa"/>
-          </w:tcPr>
-          <w:p>
-            <w:pPr>
-              <w:rPr>
-                <w:b/>
-                <w:lang w:val="en-US"/>
-              </w:rPr>
-            </w:pPr>
-          </w:p>
-        </w:tc>
-        <w:tc>
-          <w:tcPr>
-            <w:tcW w:w="1502" w:type="dxa"/>
-          </w:tcPr>
-          <w:p>
-            <w:pPr>
-              <w:rPr>
-                <w:b/>
-                <w:lang w:val="en-US"/>
-              </w:rPr>
-            </w:pPr>
-          </w:p>
-        </w:tc>
-        <w:tc>
-          <w:tcPr>
-            <w:tcW w:w="1502" w:type="dxa"/>
-          </w:tcPr>
-          <w:p>
-            <w:pPr>
-              <w:rPr>
-                <w:b/>
-                <w:lang w:val="en-US"/>
-              </w:rPr>
-            </w:pPr>
-          </w:p>
-        </w:tc>
-        <w:tc>
-          <w:tcPr>
-            <w:tcW w:w="1503" w:type="dxa"/>
-          </w:tcPr>
-          <w:p>
-            <w:pPr>
-              <w:rPr>
-                <w:b/>
-                <w:lang w:val="en-US"/>
-              </w:rPr>
-            </w:pPr>
-          </w:p>
-        </w:tc>
-        <w:tc>
-          <w:tcPr>
-            <w:tcW w:w="1503" w:type="dxa"/>
-          </w:tcPr>
-          <w:p>
-            <w:pPr>
-              <w:rPr>
-                <w:b/>
-                <w:lang w:val="en-US"/>
-              </w:rPr>
-            </w:pPr>
+            <w:tcW w:w="1401" w:type="dxa"/>
+          </w:tcPr>
+          <w:p>
+            <w:r>
+              <w:t>POST</w:t>
+            </w:r>
+          </w:p>
+        </w:tc>
+        <w:tc>
+          <w:tcPr>
+            <w:tcW w:w="1406" w:type="dxa"/>
+          </w:tcPr>
+          <w:p>
+            <w:pPr>
+              <w:rPr>
+                <w:b/>
+                <w:lang w:val="en-US"/>
+              </w:rPr>
+            </w:pPr>
+            <w:r>
+              <w:t>/api/auth /register</w:t>
+            </w:r>
+          </w:p>
+        </w:tc>
+        <w:tc>
+          <w:tcPr>
+            <w:tcW w:w="1494" w:type="dxa"/>
+          </w:tcPr>
+          <w:p>
+            <w:pPr>
+              <w:rPr>
+                <w:b/>
+                <w:lang w:val="en-US"/>
+              </w:rPr>
+            </w:pPr>
+            <w:r>
+              <w:t>Register a new RaceDay user and create participant profile</w:t>
+            </w:r>
+          </w:p>
+        </w:tc>
+        <w:tc>
+          <w:tcPr>
+            <w:tcW w:w="1482" w:type="dxa"/>
+          </w:tcPr>
+          <w:p>
+            <w:pPr>
+              <w:rPr>
+                <w:b/>
+                <w:lang w:val="en-US"/>
+              </w:rPr>
+            </w:pPr>
+            <w:r>
+              <w:t>Public</w:t>
+            </w:r>
+          </w:p>
+        </w:tc>
+        <w:tc>
+          <w:tcPr>
+            <w:tcW w:w="1744" w:type="dxa"/>
+          </w:tcPr>
+          <w:p>
+            <w:pPr>
+              <w:rPr>
+                <w:b/>
+                <w:lang w:val="en-US"/>
+              </w:rPr>
+            </w:pPr>
+            <w:r>
+              <w:t>{ name, password, IDNumber,email, DateOfBirth}</w:t>
+            </w:r>
+          </w:p>
+        </w:tc>
+        <w:tc>
+          <w:tcPr>
+            <w:tcW w:w="1489" w:type="dxa"/>
+          </w:tcPr>
+          <w:p>
+            <w:pPr>
+              <w:rPr>
+                <w:b/>
+                <w:lang w:val="en-US"/>
+              </w:rPr>
+            </w:pPr>
+            <w:r>
+              <w:t>201 Created; 400 Bad Request;409 Conflict</w:t>
+            </w:r>
           </w:p>
         </w:tc>
       </w:tr>
       <w:tr>
         <w:tc>
           <w:tcPr>
-            <w:tcW w:w="1503" w:type="dxa"/>
-          </w:tcPr>
-          <w:p>
-            <w:pPr>
-              <w:rPr>
-                <w:b/>
-                <w:lang w:val="en-US"/>
-              </w:rPr>
-            </w:pPr>
-          </w:p>
-        </w:tc>
-        <w:tc>
-          <w:tcPr>
-            <w:tcW w:w="1503" w:type="dxa"/>
-          </w:tcPr>
-          <w:p>
-            <w:pPr>
-              <w:rPr>
-                <w:b/>
-                <w:lang w:val="en-US"/>
-              </w:rPr>
-            </w:pPr>
-          </w:p>
-        </w:tc>
-        <w:tc>
-          <w:tcPr>
-            <w:tcW w:w="1502" w:type="dxa"/>
-          </w:tcPr>
-          <w:p>
-            <w:pPr>
-              <w:rPr>
-                <w:b/>
-                <w:lang w:val="en-US"/>
-              </w:rPr>
-            </w:pPr>
-          </w:p>
-        </w:tc>
-        <w:tc>
-          <w:tcPr>
-            <w:tcW w:w="1502" w:type="dxa"/>
-          </w:tcPr>
-          <w:p>
-            <w:pPr>
-              <w:rPr>
-                <w:b/>
-                <w:lang w:val="en-US"/>
-              </w:rPr>
-            </w:pPr>
-          </w:p>
-        </w:tc>
-        <w:tc>
-          <w:tcPr>
-            <w:tcW w:w="1503" w:type="dxa"/>
-          </w:tcPr>
-          <w:p>
-            <w:pPr>
-              <w:rPr>
-                <w:b/>
-                <w:lang w:val="en-US"/>
-              </w:rPr>
-            </w:pPr>
-          </w:p>
-        </w:tc>
-        <w:tc>
-          <w:tcPr>
-            <w:tcW w:w="1503" w:type="dxa"/>
-          </w:tcPr>
-          <w:p>
-            <w:pPr>
-              <w:rPr>
-                <w:b/>
-                <w:lang w:val="en-US"/>
-              </w:rPr>
-            </w:pPr>
+            <w:tcW w:w="1401" w:type="dxa"/>
+          </w:tcPr>
+          <w:p>
+            <w:r>
+              <w:t>POST</w:t>
+            </w:r>
+          </w:p>
+        </w:tc>
+        <w:tc>
+          <w:tcPr>
+            <w:tcW w:w="1406" w:type="dxa"/>
+          </w:tcPr>
+          <w:p>
+            <w:pPr>
+              <w:rPr>
+                <w:b/>
+                <w:lang w:val="en-US"/>
+              </w:rPr>
+            </w:pPr>
+            <w:r>
+              <w:t>/api/auth /login</w:t>
+            </w:r>
+          </w:p>
+        </w:tc>
+        <w:tc>
+          <w:tcPr>
+            <w:tcW w:w="1494" w:type="dxa"/>
+          </w:tcPr>
+          <w:p>
+            <w:pPr>
+              <w:rPr>
+                <w:b/>
+                <w:lang w:val="en-US"/>
+              </w:rPr>
+            </w:pPr>
+            <w:r>
+              <w:t>Authenticates a registed user and return user role</w:t>
+            </w:r>
+          </w:p>
+        </w:tc>
+        <w:tc>
+          <w:tcPr>
+            <w:tcW w:w="1482" w:type="dxa"/>
+          </w:tcPr>
+          <w:p>
+            <w:pPr>
+              <w:rPr>
+                <w:b/>
+                <w:lang w:val="en-US"/>
+              </w:rPr>
+            </w:pPr>
+            <w:r>
+              <w:t>Public</w:t>
+            </w:r>
+          </w:p>
+        </w:tc>
+        <w:tc>
+          <w:tcPr>
+            <w:tcW w:w="1744" w:type="dxa"/>
+          </w:tcPr>
+          <w:p>
+            <w:pPr>
+              <w:rPr>
+                <w:b/>
+                <w:lang w:val="en-US"/>
+              </w:rPr>
+            </w:pPr>
+            <w:r>
+              <w:t>(email, password}</w:t>
+            </w:r>
+          </w:p>
+        </w:tc>
+        <w:tc>
+          <w:tcPr>
+            <w:tcW w:w="1489" w:type="dxa"/>
+          </w:tcPr>
+          <w:p>
+            <w:pPr>
+              <w:rPr>
+                <w:b/>
+                <w:lang w:val="en-US"/>
+              </w:rPr>
+            </w:pPr>
+            <w:r>
+              <w:t>200 OK; 400 Bad request; 401 Unauthorized</w:t>
+            </w:r>
           </w:p>
         </w:tc>
       </w:tr>
@@ -924,6 +948,8 @@
           <w:lang w:val="en-US"/>
         </w:rPr>
       </w:pPr>
+      <w:bookmarkStart w:id="0" w:name="_GoBack"/>
+      <w:bookmarkEnd w:id="0"/>
     </w:p>
     <w:p>
       <w:pPr>
@@ -2630,7 +2656,6 @@
                 <w:lang w:val="en-US"/>
               </w:rPr>
             </w:pPr>
-            <w:bookmarkStart w:id="0" w:name="_GoBack" w:colFirst="0" w:colLast="5"/>
             <w:r>
               <w:rPr>
                 <w:b/>
@@ -2746,7 +2771,6 @@
           </w:p>
         </w:tc>
       </w:tr>
-      <w:bookmarkEnd w:id="0"/>
       <w:tr>
         <w:tc>
           <w:tcPr>

</xml_diff>

<commit_message>
Populating events with data
</commit_message>
<xml_diff>
--- a/docs/RaceDay_API_Endpoint_Plan.docx
+++ b/docs/RaceDay_API_Endpoint_Plan.docx
@@ -948,8 +948,6 @@
           <w:lang w:val="en-US"/>
         </w:rPr>
       </w:pPr>
-      <w:bookmarkStart w:id="0" w:name="_GoBack"/>
-      <w:bookmarkEnd w:id="0"/>
     </w:p>
     <w:p>
       <w:pPr>
@@ -973,17 +971,17 @@
         <w:tblLook w:val="04A0" w:firstRow="1" w:lastRow="0" w:firstColumn="1" w:lastColumn="0" w:noHBand="0" w:noVBand="1"/>
       </w:tblPr>
       <w:tblGrid>
-        <w:gridCol w:w="1502"/>
-        <w:gridCol w:w="1502"/>
-        <w:gridCol w:w="1503"/>
-        <w:gridCol w:w="1503"/>
-        <w:gridCol w:w="1503"/>
-        <w:gridCol w:w="1503"/>
+        <w:gridCol w:w="1276"/>
+        <w:gridCol w:w="1641"/>
+        <w:gridCol w:w="1488"/>
+        <w:gridCol w:w="1458"/>
+        <w:gridCol w:w="1653"/>
+        <w:gridCol w:w="1500"/>
       </w:tblGrid>
       <w:tr>
         <w:tc>
           <w:tcPr>
-            <w:tcW w:w="1502" w:type="dxa"/>
+            <w:tcW w:w="1276" w:type="dxa"/>
             <w:shd w:val="clear" w:color="auto" w:fill="833C0B" w:themeFill="accent2" w:themeFillShade="80"/>
           </w:tcPr>
           <w:p>
@@ -1004,7 +1002,7 @@
         </w:tc>
         <w:tc>
           <w:tcPr>
-            <w:tcW w:w="1502" w:type="dxa"/>
+            <w:tcW w:w="1641" w:type="dxa"/>
             <w:shd w:val="clear" w:color="auto" w:fill="833C0B" w:themeFill="accent2" w:themeFillShade="80"/>
           </w:tcPr>
           <w:p>
@@ -1025,7 +1023,7 @@
         </w:tc>
         <w:tc>
           <w:tcPr>
-            <w:tcW w:w="1503" w:type="dxa"/>
+            <w:tcW w:w="1488" w:type="dxa"/>
             <w:shd w:val="clear" w:color="auto" w:fill="833C0B" w:themeFill="accent2" w:themeFillShade="80"/>
           </w:tcPr>
           <w:p>
@@ -1046,7 +1044,7 @@
         </w:tc>
         <w:tc>
           <w:tcPr>
-            <w:tcW w:w="1503" w:type="dxa"/>
+            <w:tcW w:w="1458" w:type="dxa"/>
             <w:shd w:val="clear" w:color="auto" w:fill="833C0B" w:themeFill="accent2" w:themeFillShade="80"/>
           </w:tcPr>
           <w:p>
@@ -1067,7 +1065,7 @@
         </w:tc>
         <w:tc>
           <w:tcPr>
-            <w:tcW w:w="1503" w:type="dxa"/>
+            <w:tcW w:w="1653" w:type="dxa"/>
             <w:shd w:val="clear" w:color="auto" w:fill="833C0B" w:themeFill="accent2" w:themeFillShade="80"/>
           </w:tcPr>
           <w:p>
@@ -1088,7 +1086,7 @@
         </w:tc>
         <w:tc>
           <w:tcPr>
-            <w:tcW w:w="1503" w:type="dxa"/>
+            <w:tcW w:w="1500" w:type="dxa"/>
             <w:shd w:val="clear" w:color="auto" w:fill="833C0B" w:themeFill="accent2" w:themeFillShade="80"/>
           </w:tcPr>
           <w:p>
@@ -1111,232 +1109,559 @@
       <w:tr>
         <w:tc>
           <w:tcPr>
-            <w:tcW w:w="1502" w:type="dxa"/>
-          </w:tcPr>
-          <w:p>
-            <w:pPr>
-              <w:rPr>
-                <w:b/>
-                <w:lang w:val="en-US"/>
-              </w:rPr>
-            </w:pPr>
-          </w:p>
-        </w:tc>
-        <w:tc>
-          <w:tcPr>
-            <w:tcW w:w="1502" w:type="dxa"/>
-          </w:tcPr>
-          <w:p>
-            <w:pPr>
-              <w:rPr>
-                <w:b/>
-                <w:lang w:val="en-US"/>
-              </w:rPr>
-            </w:pPr>
-          </w:p>
-        </w:tc>
-        <w:tc>
-          <w:tcPr>
-            <w:tcW w:w="1503" w:type="dxa"/>
-          </w:tcPr>
-          <w:p>
-            <w:pPr>
-              <w:rPr>
-                <w:b/>
-                <w:lang w:val="en-US"/>
-              </w:rPr>
-            </w:pPr>
-          </w:p>
-        </w:tc>
-        <w:tc>
-          <w:tcPr>
-            <w:tcW w:w="1503" w:type="dxa"/>
-          </w:tcPr>
-          <w:p>
-            <w:pPr>
-              <w:rPr>
-                <w:b/>
-                <w:lang w:val="en-US"/>
-              </w:rPr>
-            </w:pPr>
-          </w:p>
-        </w:tc>
-        <w:tc>
-          <w:tcPr>
-            <w:tcW w:w="1503" w:type="dxa"/>
-          </w:tcPr>
-          <w:p>
-            <w:pPr>
-              <w:rPr>
-                <w:b/>
-                <w:lang w:val="en-US"/>
-              </w:rPr>
-            </w:pPr>
-          </w:p>
-        </w:tc>
-        <w:tc>
-          <w:tcPr>
-            <w:tcW w:w="1503" w:type="dxa"/>
-          </w:tcPr>
-          <w:p>
-            <w:pPr>
-              <w:rPr>
-                <w:b/>
-                <w:lang w:val="en-US"/>
-              </w:rPr>
-            </w:pPr>
+            <w:tcW w:w="1276" w:type="dxa"/>
+          </w:tcPr>
+          <w:p>
+            <w:r>
+              <w:t xml:space="preserve">GET </w:t>
+            </w:r>
+          </w:p>
+        </w:tc>
+        <w:tc>
+          <w:tcPr>
+            <w:tcW w:w="1641" w:type="dxa"/>
+          </w:tcPr>
+          <w:p>
+            <w:pPr>
+              <w:rPr>
+                <w:b/>
+                <w:lang w:val="en-US"/>
+              </w:rPr>
+            </w:pPr>
+            <w:r>
+              <w:t>/api/events</w:t>
+            </w:r>
+          </w:p>
+        </w:tc>
+        <w:tc>
+          <w:tcPr>
+            <w:tcW w:w="1488" w:type="dxa"/>
+          </w:tcPr>
+          <w:p>
+            <w:pPr>
+              <w:rPr>
+                <w:b/>
+                <w:lang w:val="en-US"/>
+              </w:rPr>
+            </w:pPr>
+            <w:r>
+              <w:t>Return all RaceDay events available for browsing</w:t>
+            </w:r>
+          </w:p>
+        </w:tc>
+        <w:tc>
+          <w:tcPr>
+            <w:tcW w:w="1458" w:type="dxa"/>
+          </w:tcPr>
+          <w:p>
+            <w:r>
+              <w:t>Public</w:t>
+            </w:r>
+          </w:p>
+        </w:tc>
+        <w:tc>
+          <w:tcPr>
+            <w:tcW w:w="1653" w:type="dxa"/>
+          </w:tcPr>
+          <w:p>
+            <w:r>
+              <w:t xml:space="preserve">None </w:t>
+            </w:r>
+          </w:p>
+        </w:tc>
+        <w:tc>
+          <w:tcPr>
+            <w:tcW w:w="1500" w:type="dxa"/>
+          </w:tcPr>
+          <w:p>
+            <w:pPr>
+              <w:rPr>
+                <w:b/>
+                <w:lang w:val="en-US"/>
+              </w:rPr>
+            </w:pPr>
+            <w:r>
+              <w:t>200 OK</w:t>
+            </w:r>
           </w:p>
         </w:tc>
       </w:tr>
       <w:tr>
         <w:tc>
           <w:tcPr>
-            <w:tcW w:w="1502" w:type="dxa"/>
-          </w:tcPr>
-          <w:p>
-            <w:pPr>
-              <w:rPr>
-                <w:b/>
-                <w:lang w:val="en-US"/>
-              </w:rPr>
-            </w:pPr>
-          </w:p>
-        </w:tc>
-        <w:tc>
-          <w:tcPr>
-            <w:tcW w:w="1502" w:type="dxa"/>
-          </w:tcPr>
-          <w:p>
-            <w:pPr>
-              <w:rPr>
-                <w:b/>
-                <w:lang w:val="en-US"/>
-              </w:rPr>
-            </w:pPr>
-          </w:p>
-        </w:tc>
-        <w:tc>
-          <w:tcPr>
-            <w:tcW w:w="1503" w:type="dxa"/>
-          </w:tcPr>
-          <w:p>
-            <w:pPr>
-              <w:rPr>
-                <w:b/>
-                <w:lang w:val="en-US"/>
-              </w:rPr>
-            </w:pPr>
-          </w:p>
-        </w:tc>
-        <w:tc>
-          <w:tcPr>
-            <w:tcW w:w="1503" w:type="dxa"/>
-          </w:tcPr>
-          <w:p>
-            <w:pPr>
-              <w:rPr>
-                <w:b/>
-                <w:lang w:val="en-US"/>
-              </w:rPr>
-            </w:pPr>
-          </w:p>
-        </w:tc>
-        <w:tc>
-          <w:tcPr>
-            <w:tcW w:w="1503" w:type="dxa"/>
-          </w:tcPr>
-          <w:p>
-            <w:pPr>
-              <w:rPr>
-                <w:b/>
-                <w:lang w:val="en-US"/>
-              </w:rPr>
-            </w:pPr>
-          </w:p>
-        </w:tc>
-        <w:tc>
-          <w:tcPr>
-            <w:tcW w:w="1503" w:type="dxa"/>
-          </w:tcPr>
-          <w:p>
-            <w:pPr>
-              <w:rPr>
-                <w:b/>
-                <w:lang w:val="en-US"/>
-              </w:rPr>
-            </w:pPr>
+            <w:tcW w:w="1276" w:type="dxa"/>
+          </w:tcPr>
+          <w:p>
+            <w:r>
+              <w:t xml:space="preserve">GET </w:t>
+            </w:r>
+          </w:p>
+        </w:tc>
+        <w:tc>
+          <w:tcPr>
+            <w:tcW w:w="1641" w:type="dxa"/>
+          </w:tcPr>
+          <w:p>
+            <w:pPr>
+              <w:rPr>
+                <w:b/>
+                <w:lang w:val="en-US"/>
+              </w:rPr>
+            </w:pPr>
+            <w:r>
+              <w:t>/api/events/{id}</w:t>
+            </w:r>
+          </w:p>
+        </w:tc>
+        <w:tc>
+          <w:tcPr>
+            <w:tcW w:w="1488" w:type="dxa"/>
+          </w:tcPr>
+          <w:p>
+            <w:pPr>
+              <w:rPr>
+                <w:b/>
+                <w:lang w:val="en-US"/>
+              </w:rPr>
+            </w:pPr>
+            <w:r>
+              <w:t>Returns the details of one RaceDay using the supplied eventID</w:t>
+            </w:r>
+          </w:p>
+        </w:tc>
+        <w:tc>
+          <w:tcPr>
+            <w:tcW w:w="1458" w:type="dxa"/>
+          </w:tcPr>
+          <w:p>
+            <w:r>
+              <w:t>Public</w:t>
+            </w:r>
+          </w:p>
+        </w:tc>
+        <w:tc>
+          <w:tcPr>
+            <w:tcW w:w="1653" w:type="dxa"/>
+          </w:tcPr>
+          <w:p>
+            <w:r>
+              <w:t xml:space="preserve">None </w:t>
+            </w:r>
+          </w:p>
+        </w:tc>
+        <w:tc>
+          <w:tcPr>
+            <w:tcW w:w="1500" w:type="dxa"/>
+          </w:tcPr>
+          <w:p>
+            <w:pPr>
+              <w:rPr>
+                <w:b/>
+                <w:lang w:val="en-US"/>
+              </w:rPr>
+            </w:pPr>
+            <w:r>
+              <w:t>200 OK; 404 Not found</w:t>
+            </w:r>
           </w:p>
         </w:tc>
       </w:tr>
       <w:tr>
         <w:tc>
           <w:tcPr>
-            <w:tcW w:w="1502" w:type="dxa"/>
-          </w:tcPr>
-          <w:p>
-            <w:pPr>
-              <w:rPr>
-                <w:b/>
-                <w:lang w:val="en-US"/>
-              </w:rPr>
-            </w:pPr>
-          </w:p>
-        </w:tc>
-        <w:tc>
-          <w:tcPr>
-            <w:tcW w:w="1502" w:type="dxa"/>
-          </w:tcPr>
-          <w:p>
-            <w:pPr>
-              <w:rPr>
-                <w:b/>
-                <w:lang w:val="en-US"/>
-              </w:rPr>
-            </w:pPr>
-          </w:p>
-        </w:tc>
-        <w:tc>
-          <w:tcPr>
-            <w:tcW w:w="1503" w:type="dxa"/>
-          </w:tcPr>
-          <w:p>
-            <w:pPr>
-              <w:rPr>
-                <w:b/>
-                <w:lang w:val="en-US"/>
-              </w:rPr>
-            </w:pPr>
-          </w:p>
-        </w:tc>
-        <w:tc>
-          <w:tcPr>
-            <w:tcW w:w="1503" w:type="dxa"/>
-          </w:tcPr>
-          <w:p>
-            <w:pPr>
-              <w:rPr>
-                <w:b/>
-                <w:lang w:val="en-US"/>
-              </w:rPr>
-            </w:pPr>
-          </w:p>
-        </w:tc>
-        <w:tc>
-          <w:tcPr>
-            <w:tcW w:w="1503" w:type="dxa"/>
-          </w:tcPr>
-          <w:p>
-            <w:pPr>
-              <w:rPr>
-                <w:b/>
-                <w:lang w:val="en-US"/>
-              </w:rPr>
-            </w:pPr>
-          </w:p>
-        </w:tc>
-        <w:tc>
-          <w:tcPr>
-            <w:tcW w:w="1503" w:type="dxa"/>
+            <w:tcW w:w="1276" w:type="dxa"/>
+          </w:tcPr>
+          <w:p>
+            <w:pPr>
+              <w:rPr>
+                <w:b/>
+                <w:lang w:val="en-US"/>
+              </w:rPr>
+            </w:pPr>
+            <w:r>
+              <w:t>POST</w:t>
+            </w:r>
+          </w:p>
+        </w:tc>
+        <w:tc>
+          <w:tcPr>
+            <w:tcW w:w="1641" w:type="dxa"/>
+          </w:tcPr>
+          <w:p>
+            <w:pPr>
+              <w:rPr>
+                <w:b/>
+                <w:lang w:val="en-US"/>
+              </w:rPr>
+            </w:pPr>
+            <w:r>
+              <w:t>/api/events</w:t>
+            </w:r>
+          </w:p>
+        </w:tc>
+        <w:tc>
+          <w:tcPr>
+            <w:tcW w:w="1488" w:type="dxa"/>
+          </w:tcPr>
+          <w:p>
+            <w:pPr>
+              <w:rPr>
+                <w:b/>
+                <w:lang w:val="en-US"/>
+              </w:rPr>
+            </w:pPr>
+            <w:r>
+              <w:t>Create a new RaceDay event owned by the authenticated Organiser</w:t>
+            </w:r>
+          </w:p>
+        </w:tc>
+        <w:tc>
+          <w:tcPr>
+            <w:tcW w:w="1458" w:type="dxa"/>
+          </w:tcPr>
+          <w:p>
+            <w:pPr>
+              <w:rPr>
+                <w:b/>
+                <w:lang w:val="en-US"/>
+              </w:rPr>
+            </w:pPr>
+            <w:r>
+              <w:t>Organiser</w:t>
+            </w:r>
+          </w:p>
+          <w:p>
+            <w:pPr>
+              <w:jc w:val="center"/>
+              <w:rPr>
+                <w:lang w:val="en-US"/>
+              </w:rPr>
+            </w:pPr>
+          </w:p>
+        </w:tc>
+        <w:tc>
+          <w:tcPr>
+            <w:tcW w:w="1653" w:type="dxa"/>
+          </w:tcPr>
+          <w:p>
+            <w:pPr>
+              <w:rPr>
+                <w:b/>
+                <w:lang w:val="en-US"/>
+              </w:rPr>
+            </w:pPr>
+            <w:r>
+              <w:t>{ eventName, description, eventDate, location, distanceKM, eventType, maxParticipants }</w:t>
+            </w:r>
+          </w:p>
+        </w:tc>
+        <w:tc>
+          <w:tcPr>
+            <w:tcW w:w="1500" w:type="dxa"/>
+          </w:tcPr>
+          <w:p>
+            <w:pPr>
+              <w:rPr>
+                <w:b/>
+                <w:lang w:val="en-US"/>
+              </w:rPr>
+            </w:pPr>
+            <w:r>
+              <w:t>201 Created; 400 bad request; 401 Unauthorized; 403 Forbidden</w:t>
+            </w:r>
+            <w:bookmarkStart w:id="0" w:name="_GoBack"/>
+            <w:bookmarkEnd w:id="0"/>
+          </w:p>
+        </w:tc>
+      </w:tr>
+      <w:tr>
+        <w:tc>
+          <w:tcPr>
+            <w:tcW w:w="1276" w:type="dxa"/>
+          </w:tcPr>
+          <w:p>
+            <w:pPr>
+              <w:rPr>
+                <w:b/>
+                <w:lang w:val="en-US"/>
+              </w:rPr>
+            </w:pPr>
+            <w:r>
+              <w:t>PUT</w:t>
+            </w:r>
+          </w:p>
+        </w:tc>
+        <w:tc>
+          <w:tcPr>
+            <w:tcW w:w="1641" w:type="dxa"/>
+          </w:tcPr>
+          <w:p>
+            <w:pPr>
+              <w:rPr>
+                <w:b/>
+                <w:lang w:val="en-US"/>
+              </w:rPr>
+            </w:pPr>
+            <w:r>
+              <w:t>/api/events{id}</w:t>
+            </w:r>
+          </w:p>
+        </w:tc>
+        <w:tc>
+          <w:tcPr>
+            <w:tcW w:w="1488" w:type="dxa"/>
+          </w:tcPr>
+          <w:p>
+            <w:pPr>
+              <w:rPr>
+                <w:b/>
+                <w:lang w:val="en-US"/>
+              </w:rPr>
+            </w:pPr>
+            <w:r>
+              <w:t xml:space="preserve">Update an existing event owned by the </w:t>
+            </w:r>
+            <w:r>
+              <w:lastRenderedPageBreak/>
+              <w:t>authenticated Organiser</w:t>
+            </w:r>
+          </w:p>
+        </w:tc>
+        <w:tc>
+          <w:tcPr>
+            <w:tcW w:w="1458" w:type="dxa"/>
+          </w:tcPr>
+          <w:p>
+            <w:pPr>
+              <w:rPr>
+                <w:b/>
+                <w:lang w:val="en-US"/>
+              </w:rPr>
+            </w:pPr>
+            <w:r>
+              <w:lastRenderedPageBreak/>
+              <w:t>Organiser</w:t>
+            </w:r>
+          </w:p>
+          <w:p>
+            <w:pPr>
+              <w:jc w:val="center"/>
+              <w:rPr>
+                <w:lang w:val="en-US"/>
+              </w:rPr>
+            </w:pPr>
+          </w:p>
+        </w:tc>
+        <w:tc>
+          <w:tcPr>
+            <w:tcW w:w="1653" w:type="dxa"/>
+          </w:tcPr>
+          <w:p>
+            <w:pPr>
+              <w:rPr>
+                <w:b/>
+                <w:lang w:val="en-US"/>
+              </w:rPr>
+            </w:pPr>
+            <w:r>
+              <w:t xml:space="preserve">{ eventName, description, eventDate, location, </w:t>
+            </w:r>
+            <w:r>
+              <w:lastRenderedPageBreak/>
+              <w:t>distanceKM, eventType, maxParticipants }</w:t>
+            </w:r>
+          </w:p>
+        </w:tc>
+        <w:tc>
+          <w:tcPr>
+            <w:tcW w:w="1500" w:type="dxa"/>
+          </w:tcPr>
+          <w:p>
+            <w:pPr>
+              <w:rPr>
+                <w:b/>
+                <w:lang w:val="en-US"/>
+              </w:rPr>
+            </w:pPr>
+            <w:r>
+              <w:lastRenderedPageBreak/>
+              <w:t xml:space="preserve">200 OK; 400 Bad Request; 401 Unauthorized; </w:t>
+            </w:r>
+            <w:r>
+              <w:lastRenderedPageBreak/>
+              <w:t>403 Forbidden; 404 Not Found</w:t>
+            </w:r>
+          </w:p>
+        </w:tc>
+      </w:tr>
+      <w:tr>
+        <w:tc>
+          <w:tcPr>
+            <w:tcW w:w="1276" w:type="dxa"/>
+          </w:tcPr>
+          <w:p>
+            <w:pPr>
+              <w:rPr>
+                <w:b/>
+                <w:lang w:val="en-US"/>
+              </w:rPr>
+            </w:pPr>
+            <w:r>
+              <w:lastRenderedPageBreak/>
+              <w:t>DELETE</w:t>
+            </w:r>
+          </w:p>
+        </w:tc>
+        <w:tc>
+          <w:tcPr>
+            <w:tcW w:w="1641" w:type="dxa"/>
+          </w:tcPr>
+          <w:p>
+            <w:pPr>
+              <w:rPr>
+                <w:b/>
+                <w:lang w:val="en-US"/>
+              </w:rPr>
+            </w:pPr>
+            <w:r>
+              <w:t>/api/events/{id}</w:t>
+            </w:r>
+          </w:p>
+        </w:tc>
+        <w:tc>
+          <w:tcPr>
+            <w:tcW w:w="1488" w:type="dxa"/>
+          </w:tcPr>
+          <w:p>
+            <w:pPr>
+              <w:rPr>
+                <w:b/>
+                <w:lang w:val="en-US"/>
+              </w:rPr>
+            </w:pPr>
+            <w:r>
+              <w:t>Delete an event owned</w:t>
+            </w:r>
+          </w:p>
+        </w:tc>
+        <w:tc>
+          <w:tcPr>
+            <w:tcW w:w="1458" w:type="dxa"/>
+          </w:tcPr>
+          <w:p>
+            <w:pPr>
+              <w:rPr>
+                <w:b/>
+                <w:lang w:val="en-US"/>
+              </w:rPr>
+            </w:pPr>
+            <w:r>
+              <w:t>Organiser</w:t>
+            </w:r>
+          </w:p>
+        </w:tc>
+        <w:tc>
+          <w:tcPr>
+            <w:tcW w:w="1653" w:type="dxa"/>
+          </w:tcPr>
+          <w:p>
+            <w:pPr>
+              <w:rPr>
+                <w:b/>
+                <w:lang w:val="en-US"/>
+              </w:rPr>
+            </w:pPr>
+            <w:r>
+              <w:t>None</w:t>
+            </w:r>
+          </w:p>
+        </w:tc>
+        <w:tc>
+          <w:tcPr>
+            <w:tcW w:w="1500" w:type="dxa"/>
+          </w:tcPr>
+          <w:p>
+            <w:pPr>
+              <w:rPr>
+                <w:b/>
+                <w:lang w:val="en-US"/>
+              </w:rPr>
+            </w:pPr>
+            <w:r>
+              <w:t>204 No Content; 401</w:t>
+            </w:r>
+          </w:p>
+        </w:tc>
+      </w:tr>
+      <w:tr>
+        <w:tc>
+          <w:tcPr>
+            <w:tcW w:w="1276" w:type="dxa"/>
+          </w:tcPr>
+          <w:p>
+            <w:pPr>
+              <w:rPr>
+                <w:b/>
+                <w:lang w:val="en-US"/>
+              </w:rPr>
+            </w:pPr>
+          </w:p>
+        </w:tc>
+        <w:tc>
+          <w:tcPr>
+            <w:tcW w:w="1641" w:type="dxa"/>
+          </w:tcPr>
+          <w:p>
+            <w:pPr>
+              <w:rPr>
+                <w:b/>
+                <w:lang w:val="en-US"/>
+              </w:rPr>
+            </w:pPr>
+          </w:p>
+        </w:tc>
+        <w:tc>
+          <w:tcPr>
+            <w:tcW w:w="1488" w:type="dxa"/>
+          </w:tcPr>
+          <w:p>
+            <w:pPr>
+              <w:rPr>
+                <w:b/>
+                <w:lang w:val="en-US"/>
+              </w:rPr>
+            </w:pPr>
+          </w:p>
+        </w:tc>
+        <w:tc>
+          <w:tcPr>
+            <w:tcW w:w="1458" w:type="dxa"/>
+          </w:tcPr>
+          <w:p>
+            <w:pPr>
+              <w:rPr>
+                <w:b/>
+                <w:lang w:val="en-US"/>
+              </w:rPr>
+            </w:pPr>
+          </w:p>
+        </w:tc>
+        <w:tc>
+          <w:tcPr>
+            <w:tcW w:w="1653" w:type="dxa"/>
+          </w:tcPr>
+          <w:p>
+            <w:pPr>
+              <w:rPr>
+                <w:b/>
+                <w:lang w:val="en-US"/>
+              </w:rPr>
+            </w:pPr>
+          </w:p>
+        </w:tc>
+        <w:tc>
+          <w:tcPr>
+            <w:tcW w:w="1500" w:type="dxa"/>
           </w:tcPr>
           <w:p>
             <w:pPr>

</xml_diff>

<commit_message>
Populating user profile with data
</commit_message>
<xml_diff>
--- a/docs/RaceDay_API_Endpoint_Plan.docx
+++ b/docs/RaceDay_API_Endpoint_Plan.docx
@@ -1369,299 +1369,669 @@
             <w:r>
               <w:t>201 Created; 400 bad request; 401 Unauthorized; 403 Forbidden</w:t>
             </w:r>
+          </w:p>
+        </w:tc>
+      </w:tr>
+      <w:tr>
+        <w:tc>
+          <w:tcPr>
+            <w:tcW w:w="1276" w:type="dxa"/>
+          </w:tcPr>
+          <w:p>
+            <w:pPr>
+              <w:rPr>
+                <w:b/>
+                <w:lang w:val="en-US"/>
+              </w:rPr>
+            </w:pPr>
+            <w:r>
+              <w:t>PUT</w:t>
+            </w:r>
+          </w:p>
+        </w:tc>
+        <w:tc>
+          <w:tcPr>
+            <w:tcW w:w="1641" w:type="dxa"/>
+          </w:tcPr>
+          <w:p>
+            <w:pPr>
+              <w:rPr>
+                <w:b/>
+                <w:lang w:val="en-US"/>
+              </w:rPr>
+            </w:pPr>
+            <w:r>
+              <w:t>/api/events{id}</w:t>
+            </w:r>
+          </w:p>
+        </w:tc>
+        <w:tc>
+          <w:tcPr>
+            <w:tcW w:w="1488" w:type="dxa"/>
+          </w:tcPr>
+          <w:p>
+            <w:pPr>
+              <w:rPr>
+                <w:b/>
+                <w:lang w:val="en-US"/>
+              </w:rPr>
+            </w:pPr>
+            <w:r>
+              <w:t xml:space="preserve">Update an existing event owned by the </w:t>
+            </w:r>
+            <w:r>
+              <w:lastRenderedPageBreak/>
+              <w:t>authenticated Organiser</w:t>
+            </w:r>
+          </w:p>
+        </w:tc>
+        <w:tc>
+          <w:tcPr>
+            <w:tcW w:w="1458" w:type="dxa"/>
+          </w:tcPr>
+          <w:p>
+            <w:pPr>
+              <w:rPr>
+                <w:b/>
+                <w:lang w:val="en-US"/>
+              </w:rPr>
+            </w:pPr>
+            <w:r>
+              <w:lastRenderedPageBreak/>
+              <w:t>Organiser</w:t>
+            </w:r>
+          </w:p>
+          <w:p>
+            <w:pPr>
+              <w:jc w:val="center"/>
+              <w:rPr>
+                <w:lang w:val="en-US"/>
+              </w:rPr>
+            </w:pPr>
+          </w:p>
+        </w:tc>
+        <w:tc>
+          <w:tcPr>
+            <w:tcW w:w="1653" w:type="dxa"/>
+          </w:tcPr>
+          <w:p>
+            <w:pPr>
+              <w:rPr>
+                <w:b/>
+                <w:lang w:val="en-US"/>
+              </w:rPr>
+            </w:pPr>
+            <w:r>
+              <w:t xml:space="preserve">{ eventName, description, eventDate, location, </w:t>
+            </w:r>
+            <w:r>
+              <w:lastRenderedPageBreak/>
+              <w:t>distanceKM, eventType, maxParticipants }</w:t>
+            </w:r>
+          </w:p>
+        </w:tc>
+        <w:tc>
+          <w:tcPr>
+            <w:tcW w:w="1500" w:type="dxa"/>
+          </w:tcPr>
+          <w:p>
+            <w:pPr>
+              <w:rPr>
+                <w:b/>
+                <w:lang w:val="en-US"/>
+              </w:rPr>
+            </w:pPr>
+            <w:r>
+              <w:lastRenderedPageBreak/>
+              <w:t xml:space="preserve">200 OK; 400 Bad Request; 401 Unauthorized; </w:t>
+            </w:r>
+            <w:r>
+              <w:lastRenderedPageBreak/>
+              <w:t>403 Forbidden; 404 Not Found</w:t>
+            </w:r>
+          </w:p>
+        </w:tc>
+      </w:tr>
+      <w:tr>
+        <w:tc>
+          <w:tcPr>
+            <w:tcW w:w="1276" w:type="dxa"/>
+          </w:tcPr>
+          <w:p>
+            <w:pPr>
+              <w:rPr>
+                <w:b/>
+                <w:lang w:val="en-US"/>
+              </w:rPr>
+            </w:pPr>
+            <w:r>
+              <w:lastRenderedPageBreak/>
+              <w:t>DELETE</w:t>
+            </w:r>
+          </w:p>
+        </w:tc>
+        <w:tc>
+          <w:tcPr>
+            <w:tcW w:w="1641" w:type="dxa"/>
+          </w:tcPr>
+          <w:p>
+            <w:pPr>
+              <w:rPr>
+                <w:b/>
+                <w:lang w:val="en-US"/>
+              </w:rPr>
+            </w:pPr>
+            <w:r>
+              <w:t>/api/events/{id}</w:t>
+            </w:r>
+          </w:p>
+        </w:tc>
+        <w:tc>
+          <w:tcPr>
+            <w:tcW w:w="1488" w:type="dxa"/>
+          </w:tcPr>
+          <w:p>
+            <w:pPr>
+              <w:rPr>
+                <w:b/>
+                <w:lang w:val="en-US"/>
+              </w:rPr>
+            </w:pPr>
+            <w:r>
+              <w:t>Delete an event owned</w:t>
+            </w:r>
+          </w:p>
+        </w:tc>
+        <w:tc>
+          <w:tcPr>
+            <w:tcW w:w="1458" w:type="dxa"/>
+          </w:tcPr>
+          <w:p>
+            <w:pPr>
+              <w:rPr>
+                <w:b/>
+                <w:lang w:val="en-US"/>
+              </w:rPr>
+            </w:pPr>
+            <w:r>
+              <w:t>Organiser</w:t>
+            </w:r>
+          </w:p>
+        </w:tc>
+        <w:tc>
+          <w:tcPr>
+            <w:tcW w:w="1653" w:type="dxa"/>
+          </w:tcPr>
+          <w:p>
+            <w:pPr>
+              <w:rPr>
+                <w:b/>
+                <w:lang w:val="en-US"/>
+              </w:rPr>
+            </w:pPr>
+            <w:r>
+              <w:t>None</w:t>
+            </w:r>
+          </w:p>
+        </w:tc>
+        <w:tc>
+          <w:tcPr>
+            <w:tcW w:w="1500" w:type="dxa"/>
+          </w:tcPr>
+          <w:p>
+            <w:pPr>
+              <w:rPr>
+                <w:b/>
+                <w:lang w:val="en-US"/>
+              </w:rPr>
+            </w:pPr>
+            <w:r>
+              <w:t>204 No Content; 401</w:t>
+            </w:r>
+          </w:p>
+        </w:tc>
+      </w:tr>
+    </w:tbl>
+    <w:p>
+      <w:pPr>
+        <w:rPr>
+          <w:b/>
+          <w:lang w:val="en-US"/>
+        </w:rPr>
+      </w:pPr>
+    </w:p>
+    <w:p>
+      <w:pPr>
+        <w:rPr>
+          <w:b/>
+          <w:lang w:val="en-US"/>
+        </w:rPr>
+      </w:pPr>
+    </w:p>
+    <w:p>
+      <w:pPr>
+        <w:rPr>
+          <w:b/>
+          <w:lang w:val="en-US"/>
+        </w:rPr>
+      </w:pPr>
+      <w:r>
+        <w:rPr>
+          <w:b/>
+          <w:lang w:val="en-US"/>
+        </w:rPr>
+        <w:t>USER PROFILE</w:t>
+      </w:r>
+    </w:p>
+    <w:tbl>
+      <w:tblPr>
+        <w:tblStyle w:val="TableGrid"/>
+        <w:tblW w:w="0" w:type="auto"/>
+        <w:tblLook w:val="04A0" w:firstRow="1" w:lastRow="0" w:firstColumn="1" w:lastColumn="0" w:noHBand="0" w:noVBand="1"/>
+      </w:tblPr>
+      <w:tblGrid>
+        <w:gridCol w:w="1348"/>
+        <w:gridCol w:w="1502"/>
+        <w:gridCol w:w="1493"/>
+        <w:gridCol w:w="1473"/>
+        <w:gridCol w:w="1758"/>
+        <w:gridCol w:w="1442"/>
+      </w:tblGrid>
+      <w:tr>
+        <w:tc>
+          <w:tcPr>
+            <w:tcW w:w="1502" w:type="dxa"/>
+            <w:shd w:val="clear" w:color="auto" w:fill="833C0B" w:themeFill="accent2" w:themeFillShade="80"/>
+          </w:tcPr>
+          <w:p>
+            <w:pPr>
+              <w:rPr>
+                <w:b/>
+                <w:lang w:val="en-US"/>
+              </w:rPr>
+            </w:pPr>
+            <w:r>
+              <w:rPr>
+                <w:b/>
+                <w:lang w:val="en-US"/>
+              </w:rPr>
+              <w:t>HTTP METHOD</w:t>
+            </w:r>
+          </w:p>
+        </w:tc>
+        <w:tc>
+          <w:tcPr>
+            <w:tcW w:w="1502" w:type="dxa"/>
+            <w:shd w:val="clear" w:color="auto" w:fill="833C0B" w:themeFill="accent2" w:themeFillShade="80"/>
+          </w:tcPr>
+          <w:p>
+            <w:pPr>
+              <w:rPr>
+                <w:b/>
+                <w:lang w:val="en-US"/>
+              </w:rPr>
+            </w:pPr>
+            <w:r>
+              <w:rPr>
+                <w:b/>
+                <w:lang w:val="en-US"/>
+              </w:rPr>
+              <w:t>Route</w:t>
+            </w:r>
+          </w:p>
+        </w:tc>
+        <w:tc>
+          <w:tcPr>
+            <w:tcW w:w="1503" w:type="dxa"/>
+            <w:shd w:val="clear" w:color="auto" w:fill="833C0B" w:themeFill="accent2" w:themeFillShade="80"/>
+          </w:tcPr>
+          <w:p>
+            <w:pPr>
+              <w:rPr>
+                <w:b/>
+                <w:lang w:val="en-US"/>
+              </w:rPr>
+            </w:pPr>
+            <w:r>
+              <w:rPr>
+                <w:b/>
+                <w:lang w:val="en-US"/>
+              </w:rPr>
+              <w:t>Description</w:t>
+            </w:r>
+          </w:p>
+        </w:tc>
+        <w:tc>
+          <w:tcPr>
+            <w:tcW w:w="1503" w:type="dxa"/>
+            <w:shd w:val="clear" w:color="auto" w:fill="833C0B" w:themeFill="accent2" w:themeFillShade="80"/>
+          </w:tcPr>
+          <w:p>
+            <w:pPr>
+              <w:rPr>
+                <w:b/>
+                <w:lang w:val="en-US"/>
+              </w:rPr>
+            </w:pPr>
+            <w:r>
+              <w:rPr>
+                <w:b/>
+                <w:lang w:val="en-US"/>
+              </w:rPr>
+              <w:t>Role Requirement</w:t>
+            </w:r>
+          </w:p>
+        </w:tc>
+        <w:tc>
+          <w:tcPr>
+            <w:tcW w:w="1503" w:type="dxa"/>
+            <w:shd w:val="clear" w:color="auto" w:fill="833C0B" w:themeFill="accent2" w:themeFillShade="80"/>
+          </w:tcPr>
+          <w:p>
+            <w:pPr>
+              <w:rPr>
+                <w:b/>
+                <w:lang w:val="en-US"/>
+              </w:rPr>
+            </w:pPr>
+            <w:r>
+              <w:rPr>
+                <w:b/>
+                <w:lang w:val="en-US"/>
+              </w:rPr>
+              <w:t>Request body</w:t>
+            </w:r>
+          </w:p>
+        </w:tc>
+        <w:tc>
+          <w:tcPr>
+            <w:tcW w:w="1503" w:type="dxa"/>
+            <w:shd w:val="clear" w:color="auto" w:fill="833C0B" w:themeFill="accent2" w:themeFillShade="80"/>
+          </w:tcPr>
+          <w:p>
+            <w:pPr>
+              <w:rPr>
+                <w:b/>
+                <w:lang w:val="en-US"/>
+              </w:rPr>
+            </w:pPr>
+            <w:r>
+              <w:rPr>
+                <w:b/>
+                <w:lang w:val="en-US"/>
+              </w:rPr>
+              <w:t>Expected Respond</w:t>
+            </w:r>
+          </w:p>
+        </w:tc>
+      </w:tr>
+      <w:tr>
+        <w:tc>
+          <w:tcPr>
+            <w:tcW w:w="1502" w:type="dxa"/>
+          </w:tcPr>
+          <w:p>
+            <w:pPr>
+              <w:rPr>
+                <w:b/>
+                <w:lang w:val="en-US"/>
+              </w:rPr>
+            </w:pPr>
+            <w:r>
+              <w:t>GET</w:t>
+            </w:r>
+          </w:p>
+        </w:tc>
+        <w:tc>
+          <w:tcPr>
+            <w:tcW w:w="1502" w:type="dxa"/>
+          </w:tcPr>
+          <w:p>
+            <w:pPr>
+              <w:rPr>
+                <w:b/>
+                <w:lang w:val="en-US"/>
+              </w:rPr>
+            </w:pPr>
+            <w:r>
+              <w:t>/api/users/me</w:t>
+            </w:r>
+          </w:p>
+        </w:tc>
+        <w:tc>
+          <w:tcPr>
+            <w:tcW w:w="1503" w:type="dxa"/>
+          </w:tcPr>
+          <w:p>
+            <w:pPr>
+              <w:rPr>
+                <w:b/>
+                <w:lang w:val="en-US"/>
+              </w:rPr>
+            </w:pPr>
+            <w:r>
+              <w:t>Return the profile of the currently authenticated RaceDay user</w:t>
+            </w:r>
+          </w:p>
+        </w:tc>
+        <w:tc>
+          <w:tcPr>
+            <w:tcW w:w="1503" w:type="dxa"/>
+          </w:tcPr>
+          <w:p>
+            <w:pPr>
+              <w:rPr>
+                <w:b/>
+                <w:lang w:val="en-US"/>
+              </w:rPr>
+            </w:pPr>
+            <w:r>
+              <w:t>Any authonti cated user</w:t>
+            </w:r>
+          </w:p>
+        </w:tc>
+        <w:tc>
+          <w:tcPr>
+            <w:tcW w:w="1503" w:type="dxa"/>
+          </w:tcPr>
+          <w:p>
+            <w:pPr>
+              <w:rPr>
+                <w:b/>
+                <w:lang w:val="en-US"/>
+              </w:rPr>
+            </w:pPr>
+            <w:r>
+              <w:t>None</w:t>
+            </w:r>
+          </w:p>
+        </w:tc>
+        <w:tc>
+          <w:tcPr>
+            <w:tcW w:w="1503" w:type="dxa"/>
+          </w:tcPr>
+          <w:p>
+            <w:pPr>
+              <w:rPr>
+                <w:b/>
+                <w:lang w:val="en-US"/>
+              </w:rPr>
+            </w:pPr>
+            <w:r>
+              <w:t>200 OK; Unauthorize d; 404 Not found</w:t>
+            </w:r>
+          </w:p>
+        </w:tc>
+      </w:tr>
+      <w:tr>
+        <w:tc>
+          <w:tcPr>
+            <w:tcW w:w="1502" w:type="dxa"/>
+          </w:tcPr>
+          <w:p>
+            <w:pPr>
+              <w:rPr>
+                <w:b/>
+                <w:lang w:val="en-US"/>
+              </w:rPr>
+            </w:pPr>
+            <w:r>
+              <w:t>PUT</w:t>
+            </w:r>
+          </w:p>
+        </w:tc>
+        <w:tc>
+          <w:tcPr>
+            <w:tcW w:w="1502" w:type="dxa"/>
+          </w:tcPr>
+          <w:p>
+            <w:pPr>
+              <w:rPr>
+                <w:b/>
+                <w:lang w:val="en-US"/>
+              </w:rPr>
+            </w:pPr>
+            <w:r>
+              <w:t>/api/users/me</w:t>
+            </w:r>
             <w:bookmarkStart w:id="0" w:name="_GoBack"/>
             <w:bookmarkEnd w:id="0"/>
           </w:p>
         </w:tc>
+        <w:tc>
+          <w:tcPr>
+            <w:tcW w:w="1503" w:type="dxa"/>
+          </w:tcPr>
+          <w:p>
+            <w:pPr>
+              <w:rPr>
+                <w:b/>
+                <w:lang w:val="en-US"/>
+              </w:rPr>
+            </w:pPr>
+            <w:r>
+              <w:t>Update editable details for currently authenticated user</w:t>
+            </w:r>
+          </w:p>
+        </w:tc>
+        <w:tc>
+          <w:tcPr>
+            <w:tcW w:w="1503" w:type="dxa"/>
+          </w:tcPr>
+          <w:p>
+            <w:pPr>
+              <w:rPr>
+                <w:b/>
+                <w:lang w:val="en-US"/>
+              </w:rPr>
+            </w:pPr>
+            <w:r>
+              <w:t>Any authonti cated user</w:t>
+            </w:r>
+          </w:p>
+        </w:tc>
+        <w:tc>
+          <w:tcPr>
+            <w:tcW w:w="1503" w:type="dxa"/>
+          </w:tcPr>
+          <w:p>
+            <w:pPr>
+              <w:rPr>
+                <w:b/>
+                <w:lang w:val="en-US"/>
+              </w:rPr>
+            </w:pPr>
+            <w:r>
+              <w:t>{ fullName,contact Number?, emergencyConta ct?}</w:t>
+            </w:r>
+          </w:p>
+        </w:tc>
+        <w:tc>
+          <w:tcPr>
+            <w:tcW w:w="1503" w:type="dxa"/>
+          </w:tcPr>
+          <w:p>
+            <w:pPr>
+              <w:rPr>
+                <w:b/>
+                <w:lang w:val="en-US"/>
+              </w:rPr>
+            </w:pPr>
+            <w:r>
+              <w:t>200 OK; 400 Bad request; 401 Unauthorize d</w:t>
+            </w:r>
+          </w:p>
+        </w:tc>
       </w:tr>
       <w:tr>
         <w:tc>
           <w:tcPr>
-            <w:tcW w:w="1276" w:type="dxa"/>
-          </w:tcPr>
-          <w:p>
-            <w:pPr>
-              <w:rPr>
-                <w:b/>
-                <w:lang w:val="en-US"/>
-              </w:rPr>
-            </w:pPr>
-            <w:r>
-              <w:t>PUT</w:t>
-            </w:r>
-          </w:p>
-        </w:tc>
-        <w:tc>
-          <w:tcPr>
-            <w:tcW w:w="1641" w:type="dxa"/>
-          </w:tcPr>
-          <w:p>
-            <w:pPr>
-              <w:rPr>
-                <w:b/>
-                <w:lang w:val="en-US"/>
-              </w:rPr>
-            </w:pPr>
-            <w:r>
-              <w:t>/api/events{id}</w:t>
-            </w:r>
-          </w:p>
-        </w:tc>
-        <w:tc>
-          <w:tcPr>
-            <w:tcW w:w="1488" w:type="dxa"/>
-          </w:tcPr>
-          <w:p>
-            <w:pPr>
-              <w:rPr>
-                <w:b/>
-                <w:lang w:val="en-US"/>
-              </w:rPr>
-            </w:pPr>
-            <w:r>
-              <w:t xml:space="preserve">Update an existing event owned by the </w:t>
-            </w:r>
-            <w:r>
-              <w:lastRenderedPageBreak/>
-              <w:t>authenticated Organiser</w:t>
-            </w:r>
-          </w:p>
-        </w:tc>
-        <w:tc>
-          <w:tcPr>
-            <w:tcW w:w="1458" w:type="dxa"/>
-          </w:tcPr>
-          <w:p>
-            <w:pPr>
-              <w:rPr>
-                <w:b/>
-                <w:lang w:val="en-US"/>
-              </w:rPr>
-            </w:pPr>
-            <w:r>
-              <w:lastRenderedPageBreak/>
-              <w:t>Organiser</w:t>
-            </w:r>
-          </w:p>
-          <w:p>
-            <w:pPr>
-              <w:jc w:val="center"/>
-              <w:rPr>
-                <w:lang w:val="en-US"/>
-              </w:rPr>
-            </w:pPr>
-          </w:p>
-        </w:tc>
-        <w:tc>
-          <w:tcPr>
-            <w:tcW w:w="1653" w:type="dxa"/>
-          </w:tcPr>
-          <w:p>
-            <w:pPr>
-              <w:rPr>
-                <w:b/>
-                <w:lang w:val="en-US"/>
-              </w:rPr>
-            </w:pPr>
-            <w:r>
-              <w:t xml:space="preserve">{ eventName, description, eventDate, location, </w:t>
-            </w:r>
-            <w:r>
-              <w:lastRenderedPageBreak/>
-              <w:t>distanceKM, eventType, maxParticipants }</w:t>
-            </w:r>
-          </w:p>
-        </w:tc>
-        <w:tc>
-          <w:tcPr>
-            <w:tcW w:w="1500" w:type="dxa"/>
-          </w:tcPr>
-          <w:p>
-            <w:pPr>
-              <w:rPr>
-                <w:b/>
-                <w:lang w:val="en-US"/>
-              </w:rPr>
-            </w:pPr>
-            <w:r>
-              <w:lastRenderedPageBreak/>
-              <w:t xml:space="preserve">200 OK; 400 Bad Request; 401 Unauthorized; </w:t>
-            </w:r>
-            <w:r>
-              <w:lastRenderedPageBreak/>
-              <w:t>403 Forbidden; 404 Not Found</w:t>
-            </w:r>
-          </w:p>
-        </w:tc>
-      </w:tr>
-      <w:tr>
-        <w:tc>
-          <w:tcPr>
-            <w:tcW w:w="1276" w:type="dxa"/>
-          </w:tcPr>
-          <w:p>
-            <w:pPr>
-              <w:rPr>
-                <w:b/>
-                <w:lang w:val="en-US"/>
-              </w:rPr>
-            </w:pPr>
-            <w:r>
-              <w:lastRenderedPageBreak/>
-              <w:t>DELETE</w:t>
-            </w:r>
-          </w:p>
-        </w:tc>
-        <w:tc>
-          <w:tcPr>
-            <w:tcW w:w="1641" w:type="dxa"/>
-          </w:tcPr>
-          <w:p>
-            <w:pPr>
-              <w:rPr>
-                <w:b/>
-                <w:lang w:val="en-US"/>
-              </w:rPr>
-            </w:pPr>
-            <w:r>
-              <w:t>/api/events/{id}</w:t>
-            </w:r>
-          </w:p>
-        </w:tc>
-        <w:tc>
-          <w:tcPr>
-            <w:tcW w:w="1488" w:type="dxa"/>
-          </w:tcPr>
-          <w:p>
-            <w:pPr>
-              <w:rPr>
-                <w:b/>
-                <w:lang w:val="en-US"/>
-              </w:rPr>
-            </w:pPr>
-            <w:r>
-              <w:t>Delete an event owned</w:t>
-            </w:r>
-          </w:p>
-        </w:tc>
-        <w:tc>
-          <w:tcPr>
-            <w:tcW w:w="1458" w:type="dxa"/>
-          </w:tcPr>
-          <w:p>
-            <w:pPr>
-              <w:rPr>
-                <w:b/>
-                <w:lang w:val="en-US"/>
-              </w:rPr>
-            </w:pPr>
-            <w:r>
-              <w:t>Organiser</w:t>
-            </w:r>
-          </w:p>
-        </w:tc>
-        <w:tc>
-          <w:tcPr>
-            <w:tcW w:w="1653" w:type="dxa"/>
-          </w:tcPr>
-          <w:p>
-            <w:pPr>
-              <w:rPr>
-                <w:b/>
-                <w:lang w:val="en-US"/>
-              </w:rPr>
-            </w:pPr>
-            <w:r>
-              <w:t>None</w:t>
-            </w:r>
-          </w:p>
-        </w:tc>
-        <w:tc>
-          <w:tcPr>
-            <w:tcW w:w="1500" w:type="dxa"/>
-          </w:tcPr>
-          <w:p>
-            <w:pPr>
-              <w:rPr>
-                <w:b/>
-                <w:lang w:val="en-US"/>
-              </w:rPr>
-            </w:pPr>
-            <w:r>
-              <w:t>204 No Content; 401</w:t>
-            </w:r>
-          </w:p>
-        </w:tc>
-      </w:tr>
-      <w:tr>
-        <w:tc>
-          <w:tcPr>
-            <w:tcW w:w="1276" w:type="dxa"/>
-          </w:tcPr>
-          <w:p>
-            <w:pPr>
-              <w:rPr>
-                <w:b/>
-                <w:lang w:val="en-US"/>
-              </w:rPr>
-            </w:pPr>
-          </w:p>
-        </w:tc>
-        <w:tc>
-          <w:tcPr>
-            <w:tcW w:w="1641" w:type="dxa"/>
-          </w:tcPr>
-          <w:p>
-            <w:pPr>
-              <w:rPr>
-                <w:b/>
-                <w:lang w:val="en-US"/>
-              </w:rPr>
-            </w:pPr>
-          </w:p>
-        </w:tc>
-        <w:tc>
-          <w:tcPr>
-            <w:tcW w:w="1488" w:type="dxa"/>
-          </w:tcPr>
-          <w:p>
-            <w:pPr>
-              <w:rPr>
-                <w:b/>
-                <w:lang w:val="en-US"/>
-              </w:rPr>
-            </w:pPr>
-          </w:p>
-        </w:tc>
-        <w:tc>
-          <w:tcPr>
-            <w:tcW w:w="1458" w:type="dxa"/>
-          </w:tcPr>
-          <w:p>
-            <w:pPr>
-              <w:rPr>
-                <w:b/>
-                <w:lang w:val="en-US"/>
-              </w:rPr>
-            </w:pPr>
-          </w:p>
-        </w:tc>
-        <w:tc>
-          <w:tcPr>
-            <w:tcW w:w="1653" w:type="dxa"/>
-          </w:tcPr>
-          <w:p>
-            <w:pPr>
-              <w:rPr>
-                <w:b/>
-                <w:lang w:val="en-US"/>
-              </w:rPr>
-            </w:pPr>
-          </w:p>
-        </w:tc>
-        <w:tc>
-          <w:tcPr>
-            <w:tcW w:w="1500" w:type="dxa"/>
+            <w:tcW w:w="1502" w:type="dxa"/>
+          </w:tcPr>
+          <w:p>
+            <w:pPr>
+              <w:rPr>
+                <w:b/>
+                <w:lang w:val="en-US"/>
+              </w:rPr>
+            </w:pPr>
+          </w:p>
+        </w:tc>
+        <w:tc>
+          <w:tcPr>
+            <w:tcW w:w="1502" w:type="dxa"/>
+          </w:tcPr>
+          <w:p>
+            <w:pPr>
+              <w:rPr>
+                <w:b/>
+                <w:lang w:val="en-US"/>
+              </w:rPr>
+            </w:pPr>
+          </w:p>
+        </w:tc>
+        <w:tc>
+          <w:tcPr>
+            <w:tcW w:w="1503" w:type="dxa"/>
+          </w:tcPr>
+          <w:p>
+            <w:pPr>
+              <w:rPr>
+                <w:b/>
+                <w:lang w:val="en-US"/>
+              </w:rPr>
+            </w:pPr>
+          </w:p>
+        </w:tc>
+        <w:tc>
+          <w:tcPr>
+            <w:tcW w:w="1503" w:type="dxa"/>
+          </w:tcPr>
+          <w:p>
+            <w:pPr>
+              <w:rPr>
+                <w:b/>
+                <w:lang w:val="en-US"/>
+              </w:rPr>
+            </w:pPr>
+          </w:p>
+        </w:tc>
+        <w:tc>
+          <w:tcPr>
+            <w:tcW w:w="1503" w:type="dxa"/>
+          </w:tcPr>
+          <w:p>
+            <w:pPr>
+              <w:rPr>
+                <w:b/>
+                <w:lang w:val="en-US"/>
+              </w:rPr>
+            </w:pPr>
+          </w:p>
+        </w:tc>
+        <w:tc>
+          <w:tcPr>
+            <w:tcW w:w="1503" w:type="dxa"/>
           </w:tcPr>
           <w:p>
             <w:pPr>
@@ -1702,7 +2072,7 @@
           <w:b/>
           <w:lang w:val="en-US"/>
         </w:rPr>
-        <w:t>USER PROFILE</w:t>
+        <w:t>CATEGORY</w:t>
       </w:r>
     </w:p>
     <w:tbl>
@@ -2116,7 +2486,7 @@
           <w:b/>
           <w:lang w:val="en-US"/>
         </w:rPr>
-        <w:t>CATEGORY</w:t>
+        <w:t>ENROLMENT</w:t>
       </w:r>
     </w:p>
     <w:tbl>
@@ -2530,7 +2900,14 @@
           <w:b/>
           <w:lang w:val="en-US"/>
         </w:rPr>
-        <w:t>ENROLMENT</w:t>
+        <w:t>RESULT</w:t>
+      </w:r>
+      <w:r>
+        <w:rPr>
+          <w:b/>
+          <w:lang w:val="en-US"/>
+        </w:rPr>
+        <w:t>S</w:t>
       </w:r>
     </w:p>
     <w:tbl>
@@ -2565,427 +2942,7 @@
                 <w:b/>
                 <w:lang w:val="en-US"/>
               </w:rPr>
-              <w:t>HTTP METHOD</w:t>
-            </w:r>
-          </w:p>
-        </w:tc>
-        <w:tc>
-          <w:tcPr>
-            <w:tcW w:w="1502" w:type="dxa"/>
-            <w:shd w:val="clear" w:color="auto" w:fill="833C0B" w:themeFill="accent2" w:themeFillShade="80"/>
-          </w:tcPr>
-          <w:p>
-            <w:pPr>
-              <w:rPr>
-                <w:b/>
-                <w:lang w:val="en-US"/>
-              </w:rPr>
-            </w:pPr>
-            <w:r>
-              <w:rPr>
-                <w:b/>
-                <w:lang w:val="en-US"/>
-              </w:rPr>
-              <w:t>Route</w:t>
-            </w:r>
-          </w:p>
-        </w:tc>
-        <w:tc>
-          <w:tcPr>
-            <w:tcW w:w="1503" w:type="dxa"/>
-            <w:shd w:val="clear" w:color="auto" w:fill="833C0B" w:themeFill="accent2" w:themeFillShade="80"/>
-          </w:tcPr>
-          <w:p>
-            <w:pPr>
-              <w:rPr>
-                <w:b/>
-                <w:lang w:val="en-US"/>
-              </w:rPr>
-            </w:pPr>
-            <w:r>
-              <w:rPr>
-                <w:b/>
-                <w:lang w:val="en-US"/>
-              </w:rPr>
-              <w:t>Description</w:t>
-            </w:r>
-          </w:p>
-        </w:tc>
-        <w:tc>
-          <w:tcPr>
-            <w:tcW w:w="1503" w:type="dxa"/>
-            <w:shd w:val="clear" w:color="auto" w:fill="833C0B" w:themeFill="accent2" w:themeFillShade="80"/>
-          </w:tcPr>
-          <w:p>
-            <w:pPr>
-              <w:rPr>
-                <w:b/>
-                <w:lang w:val="en-US"/>
-              </w:rPr>
-            </w:pPr>
-            <w:r>
-              <w:rPr>
-                <w:b/>
-                <w:lang w:val="en-US"/>
-              </w:rPr>
-              <w:t>Role Requirement</w:t>
-            </w:r>
-          </w:p>
-        </w:tc>
-        <w:tc>
-          <w:tcPr>
-            <w:tcW w:w="1503" w:type="dxa"/>
-            <w:shd w:val="clear" w:color="auto" w:fill="833C0B" w:themeFill="accent2" w:themeFillShade="80"/>
-          </w:tcPr>
-          <w:p>
-            <w:pPr>
-              <w:rPr>
-                <w:b/>
-                <w:lang w:val="en-US"/>
-              </w:rPr>
-            </w:pPr>
-            <w:r>
-              <w:rPr>
-                <w:b/>
-                <w:lang w:val="en-US"/>
-              </w:rPr>
-              <w:t>Request body</w:t>
-            </w:r>
-          </w:p>
-        </w:tc>
-        <w:tc>
-          <w:tcPr>
-            <w:tcW w:w="1503" w:type="dxa"/>
-            <w:shd w:val="clear" w:color="auto" w:fill="833C0B" w:themeFill="accent2" w:themeFillShade="80"/>
-          </w:tcPr>
-          <w:p>
-            <w:pPr>
-              <w:rPr>
-                <w:b/>
-                <w:lang w:val="en-US"/>
-              </w:rPr>
-            </w:pPr>
-            <w:r>
-              <w:rPr>
-                <w:b/>
-                <w:lang w:val="en-US"/>
-              </w:rPr>
-              <w:t>Expected Respond</w:t>
-            </w:r>
-          </w:p>
-        </w:tc>
-      </w:tr>
-      <w:tr>
-        <w:tc>
-          <w:tcPr>
-            <w:tcW w:w="1502" w:type="dxa"/>
-          </w:tcPr>
-          <w:p>
-            <w:pPr>
-              <w:rPr>
-                <w:b/>
-                <w:lang w:val="en-US"/>
-              </w:rPr>
-            </w:pPr>
-          </w:p>
-        </w:tc>
-        <w:tc>
-          <w:tcPr>
-            <w:tcW w:w="1502" w:type="dxa"/>
-          </w:tcPr>
-          <w:p>
-            <w:pPr>
-              <w:rPr>
-                <w:b/>
-                <w:lang w:val="en-US"/>
-              </w:rPr>
-            </w:pPr>
-          </w:p>
-        </w:tc>
-        <w:tc>
-          <w:tcPr>
-            <w:tcW w:w="1503" w:type="dxa"/>
-          </w:tcPr>
-          <w:p>
-            <w:pPr>
-              <w:rPr>
-                <w:b/>
-                <w:lang w:val="en-US"/>
-              </w:rPr>
-            </w:pPr>
-          </w:p>
-        </w:tc>
-        <w:tc>
-          <w:tcPr>
-            <w:tcW w:w="1503" w:type="dxa"/>
-          </w:tcPr>
-          <w:p>
-            <w:pPr>
-              <w:rPr>
-                <w:b/>
-                <w:lang w:val="en-US"/>
-              </w:rPr>
-            </w:pPr>
-          </w:p>
-        </w:tc>
-        <w:tc>
-          <w:tcPr>
-            <w:tcW w:w="1503" w:type="dxa"/>
-          </w:tcPr>
-          <w:p>
-            <w:pPr>
-              <w:rPr>
-                <w:b/>
-                <w:lang w:val="en-US"/>
-              </w:rPr>
-            </w:pPr>
-          </w:p>
-        </w:tc>
-        <w:tc>
-          <w:tcPr>
-            <w:tcW w:w="1503" w:type="dxa"/>
-          </w:tcPr>
-          <w:p>
-            <w:pPr>
-              <w:rPr>
-                <w:b/>
-                <w:lang w:val="en-US"/>
-              </w:rPr>
-            </w:pPr>
-          </w:p>
-        </w:tc>
-      </w:tr>
-      <w:tr>
-        <w:tc>
-          <w:tcPr>
-            <w:tcW w:w="1502" w:type="dxa"/>
-          </w:tcPr>
-          <w:p>
-            <w:pPr>
-              <w:rPr>
-                <w:b/>
-                <w:lang w:val="en-US"/>
-              </w:rPr>
-            </w:pPr>
-          </w:p>
-        </w:tc>
-        <w:tc>
-          <w:tcPr>
-            <w:tcW w:w="1502" w:type="dxa"/>
-          </w:tcPr>
-          <w:p>
-            <w:pPr>
-              <w:rPr>
-                <w:b/>
-                <w:lang w:val="en-US"/>
-              </w:rPr>
-            </w:pPr>
-          </w:p>
-        </w:tc>
-        <w:tc>
-          <w:tcPr>
-            <w:tcW w:w="1503" w:type="dxa"/>
-          </w:tcPr>
-          <w:p>
-            <w:pPr>
-              <w:rPr>
-                <w:b/>
-                <w:lang w:val="en-US"/>
-              </w:rPr>
-            </w:pPr>
-          </w:p>
-        </w:tc>
-        <w:tc>
-          <w:tcPr>
-            <w:tcW w:w="1503" w:type="dxa"/>
-          </w:tcPr>
-          <w:p>
-            <w:pPr>
-              <w:rPr>
-                <w:b/>
-                <w:lang w:val="en-US"/>
-              </w:rPr>
-            </w:pPr>
-          </w:p>
-        </w:tc>
-        <w:tc>
-          <w:tcPr>
-            <w:tcW w:w="1503" w:type="dxa"/>
-          </w:tcPr>
-          <w:p>
-            <w:pPr>
-              <w:rPr>
-                <w:b/>
-                <w:lang w:val="en-US"/>
-              </w:rPr>
-            </w:pPr>
-          </w:p>
-        </w:tc>
-        <w:tc>
-          <w:tcPr>
-            <w:tcW w:w="1503" w:type="dxa"/>
-          </w:tcPr>
-          <w:p>
-            <w:pPr>
-              <w:rPr>
-                <w:b/>
-                <w:lang w:val="en-US"/>
-              </w:rPr>
-            </w:pPr>
-          </w:p>
-        </w:tc>
-      </w:tr>
-      <w:tr>
-        <w:tc>
-          <w:tcPr>
-            <w:tcW w:w="1502" w:type="dxa"/>
-          </w:tcPr>
-          <w:p>
-            <w:pPr>
-              <w:rPr>
-                <w:b/>
-                <w:lang w:val="en-US"/>
-              </w:rPr>
-            </w:pPr>
-          </w:p>
-        </w:tc>
-        <w:tc>
-          <w:tcPr>
-            <w:tcW w:w="1502" w:type="dxa"/>
-          </w:tcPr>
-          <w:p>
-            <w:pPr>
-              <w:rPr>
-                <w:b/>
-                <w:lang w:val="en-US"/>
-              </w:rPr>
-            </w:pPr>
-          </w:p>
-        </w:tc>
-        <w:tc>
-          <w:tcPr>
-            <w:tcW w:w="1503" w:type="dxa"/>
-          </w:tcPr>
-          <w:p>
-            <w:pPr>
-              <w:rPr>
-                <w:b/>
-                <w:lang w:val="en-US"/>
-              </w:rPr>
-            </w:pPr>
-          </w:p>
-        </w:tc>
-        <w:tc>
-          <w:tcPr>
-            <w:tcW w:w="1503" w:type="dxa"/>
-          </w:tcPr>
-          <w:p>
-            <w:pPr>
-              <w:rPr>
-                <w:b/>
-                <w:lang w:val="en-US"/>
-              </w:rPr>
-            </w:pPr>
-          </w:p>
-        </w:tc>
-        <w:tc>
-          <w:tcPr>
-            <w:tcW w:w="1503" w:type="dxa"/>
-          </w:tcPr>
-          <w:p>
-            <w:pPr>
-              <w:rPr>
-                <w:b/>
-                <w:lang w:val="en-US"/>
-              </w:rPr>
-            </w:pPr>
-          </w:p>
-        </w:tc>
-        <w:tc>
-          <w:tcPr>
-            <w:tcW w:w="1503" w:type="dxa"/>
-          </w:tcPr>
-          <w:p>
-            <w:pPr>
-              <w:rPr>
-                <w:b/>
-                <w:lang w:val="en-US"/>
-              </w:rPr>
-            </w:pPr>
-          </w:p>
-        </w:tc>
-      </w:tr>
-    </w:tbl>
-    <w:p>
-      <w:pPr>
-        <w:rPr>
-          <w:b/>
-          <w:lang w:val="en-US"/>
-        </w:rPr>
-      </w:pPr>
-    </w:p>
-    <w:p>
-      <w:pPr>
-        <w:rPr>
-          <w:b/>
-          <w:lang w:val="en-US"/>
-        </w:rPr>
-      </w:pPr>
-    </w:p>
-    <w:p>
-      <w:pPr>
-        <w:rPr>
-          <w:b/>
-          <w:lang w:val="en-US"/>
-        </w:rPr>
-      </w:pPr>
-      <w:r>
-        <w:rPr>
-          <w:b/>
-          <w:lang w:val="en-US"/>
-        </w:rPr>
-        <w:t>RESULT</w:t>
-      </w:r>
-      <w:r>
-        <w:rPr>
-          <w:b/>
-          <w:lang w:val="en-US"/>
-        </w:rPr>
-        <w:t>S</w:t>
-      </w:r>
-    </w:p>
-    <w:tbl>
-      <w:tblPr>
-        <w:tblStyle w:val="TableGrid"/>
-        <w:tblW w:w="0" w:type="auto"/>
-        <w:tblLook w:val="04A0" w:firstRow="1" w:lastRow="0" w:firstColumn="1" w:lastColumn="0" w:noHBand="0" w:noVBand="1"/>
-      </w:tblPr>
-      <w:tblGrid>
-        <w:gridCol w:w="1502"/>
-        <w:gridCol w:w="1502"/>
-        <w:gridCol w:w="1503"/>
-        <w:gridCol w:w="1503"/>
-        <w:gridCol w:w="1503"/>
-        <w:gridCol w:w="1503"/>
-      </w:tblGrid>
-      <w:tr>
-        <w:tc>
-          <w:tcPr>
-            <w:tcW w:w="1502" w:type="dxa"/>
-            <w:shd w:val="clear" w:color="auto" w:fill="833C0B" w:themeFill="accent2" w:themeFillShade="80"/>
-          </w:tcPr>
-          <w:p>
-            <w:pPr>
-              <w:rPr>
-                <w:b/>
-                <w:lang w:val="en-US"/>
-              </w:rPr>
-            </w:pPr>
-            <w:r>
-              <w:rPr>
-                <w:b/>
-                <w:lang w:val="en-US"/>
-              </w:rPr>
+              <w:lastRenderedPageBreak/>
               <w:t>HTTP METHOD</w:t>
             </w:r>
           </w:p>

</xml_diff>

<commit_message>
Populated category with data
</commit_message>
<xml_diff>
--- a/docs/RaceDay_API_Endpoint_Plan.docx
+++ b/docs/RaceDay_API_Endpoint_Plan.docx
@@ -1640,6 +1640,27 @@
       <w:tr>
         <w:tc>
           <w:tcPr>
+            <w:tcW w:w="1348" w:type="dxa"/>
+            <w:shd w:val="clear" w:color="auto" w:fill="833C0B" w:themeFill="accent2" w:themeFillShade="80"/>
+          </w:tcPr>
+          <w:p>
+            <w:pPr>
+              <w:rPr>
+                <w:b/>
+                <w:lang w:val="en-US"/>
+              </w:rPr>
+            </w:pPr>
+            <w:r>
+              <w:rPr>
+                <w:b/>
+                <w:lang w:val="en-US"/>
+              </w:rPr>
+              <w:t>HTTP METHOD</w:t>
+            </w:r>
+          </w:p>
+        </w:tc>
+        <w:tc>
+          <w:tcPr>
             <w:tcW w:w="1502" w:type="dxa"/>
             <w:shd w:val="clear" w:color="auto" w:fill="833C0B" w:themeFill="accent2" w:themeFillShade="80"/>
           </w:tcPr>
@@ -1655,10 +1676,338 @@
                 <w:b/>
                 <w:lang w:val="en-US"/>
               </w:rPr>
-              <w:t>HTTP METHOD</w:t>
-            </w:r>
-          </w:p>
-        </w:tc>
+              <w:t>Route</w:t>
+            </w:r>
+          </w:p>
+        </w:tc>
+        <w:tc>
+          <w:tcPr>
+            <w:tcW w:w="1493" w:type="dxa"/>
+            <w:shd w:val="clear" w:color="auto" w:fill="833C0B" w:themeFill="accent2" w:themeFillShade="80"/>
+          </w:tcPr>
+          <w:p>
+            <w:pPr>
+              <w:rPr>
+                <w:b/>
+                <w:lang w:val="en-US"/>
+              </w:rPr>
+            </w:pPr>
+            <w:r>
+              <w:rPr>
+                <w:b/>
+                <w:lang w:val="en-US"/>
+              </w:rPr>
+              <w:t>Description</w:t>
+            </w:r>
+          </w:p>
+        </w:tc>
+        <w:tc>
+          <w:tcPr>
+            <w:tcW w:w="1473" w:type="dxa"/>
+            <w:shd w:val="clear" w:color="auto" w:fill="833C0B" w:themeFill="accent2" w:themeFillShade="80"/>
+          </w:tcPr>
+          <w:p>
+            <w:pPr>
+              <w:rPr>
+                <w:b/>
+                <w:lang w:val="en-US"/>
+              </w:rPr>
+            </w:pPr>
+            <w:r>
+              <w:rPr>
+                <w:b/>
+                <w:lang w:val="en-US"/>
+              </w:rPr>
+              <w:t>Role Requirement</w:t>
+            </w:r>
+          </w:p>
+        </w:tc>
+        <w:tc>
+          <w:tcPr>
+            <w:tcW w:w="1758" w:type="dxa"/>
+            <w:shd w:val="clear" w:color="auto" w:fill="833C0B" w:themeFill="accent2" w:themeFillShade="80"/>
+          </w:tcPr>
+          <w:p>
+            <w:pPr>
+              <w:rPr>
+                <w:b/>
+                <w:lang w:val="en-US"/>
+              </w:rPr>
+            </w:pPr>
+            <w:r>
+              <w:rPr>
+                <w:b/>
+                <w:lang w:val="en-US"/>
+              </w:rPr>
+              <w:t>Request body</w:t>
+            </w:r>
+          </w:p>
+        </w:tc>
+        <w:tc>
+          <w:tcPr>
+            <w:tcW w:w="1442" w:type="dxa"/>
+            <w:shd w:val="clear" w:color="auto" w:fill="833C0B" w:themeFill="accent2" w:themeFillShade="80"/>
+          </w:tcPr>
+          <w:p>
+            <w:pPr>
+              <w:rPr>
+                <w:b/>
+                <w:lang w:val="en-US"/>
+              </w:rPr>
+            </w:pPr>
+            <w:r>
+              <w:rPr>
+                <w:b/>
+                <w:lang w:val="en-US"/>
+              </w:rPr>
+              <w:t>Expected Respond</w:t>
+            </w:r>
+          </w:p>
+        </w:tc>
+      </w:tr>
+      <w:tr>
+        <w:tc>
+          <w:tcPr>
+            <w:tcW w:w="1348" w:type="dxa"/>
+          </w:tcPr>
+          <w:p>
+            <w:pPr>
+              <w:rPr>
+                <w:b/>
+                <w:lang w:val="en-US"/>
+              </w:rPr>
+            </w:pPr>
+            <w:r>
+              <w:t>GET</w:t>
+            </w:r>
+          </w:p>
+        </w:tc>
+        <w:tc>
+          <w:tcPr>
+            <w:tcW w:w="1502" w:type="dxa"/>
+          </w:tcPr>
+          <w:p>
+            <w:pPr>
+              <w:rPr>
+                <w:b/>
+                <w:lang w:val="en-US"/>
+              </w:rPr>
+            </w:pPr>
+            <w:r>
+              <w:t>/api/users/me</w:t>
+            </w:r>
+          </w:p>
+        </w:tc>
+        <w:tc>
+          <w:tcPr>
+            <w:tcW w:w="1493" w:type="dxa"/>
+          </w:tcPr>
+          <w:p>
+            <w:pPr>
+              <w:rPr>
+                <w:b/>
+                <w:lang w:val="en-US"/>
+              </w:rPr>
+            </w:pPr>
+            <w:r>
+              <w:t>Return the profile of the currently authenticated RaceDay user</w:t>
+            </w:r>
+          </w:p>
+        </w:tc>
+        <w:tc>
+          <w:tcPr>
+            <w:tcW w:w="1473" w:type="dxa"/>
+          </w:tcPr>
+          <w:p>
+            <w:pPr>
+              <w:rPr>
+                <w:b/>
+                <w:lang w:val="en-US"/>
+              </w:rPr>
+            </w:pPr>
+            <w:r>
+              <w:t>Any authonti cated user</w:t>
+            </w:r>
+          </w:p>
+        </w:tc>
+        <w:tc>
+          <w:tcPr>
+            <w:tcW w:w="1758" w:type="dxa"/>
+          </w:tcPr>
+          <w:p>
+            <w:pPr>
+              <w:rPr>
+                <w:b/>
+                <w:lang w:val="en-US"/>
+              </w:rPr>
+            </w:pPr>
+            <w:r>
+              <w:t>None</w:t>
+            </w:r>
+          </w:p>
+        </w:tc>
+        <w:tc>
+          <w:tcPr>
+            <w:tcW w:w="1442" w:type="dxa"/>
+          </w:tcPr>
+          <w:p>
+            <w:pPr>
+              <w:rPr>
+                <w:b/>
+                <w:lang w:val="en-US"/>
+              </w:rPr>
+            </w:pPr>
+            <w:r>
+              <w:t>200 OK; Unauthorize d; 404 Not found</w:t>
+            </w:r>
+          </w:p>
+        </w:tc>
+      </w:tr>
+      <w:tr>
+        <w:tc>
+          <w:tcPr>
+            <w:tcW w:w="1348" w:type="dxa"/>
+          </w:tcPr>
+          <w:p>
+            <w:pPr>
+              <w:rPr>
+                <w:b/>
+                <w:lang w:val="en-US"/>
+              </w:rPr>
+            </w:pPr>
+            <w:r>
+              <w:t>PUT</w:t>
+            </w:r>
+          </w:p>
+        </w:tc>
+        <w:tc>
+          <w:tcPr>
+            <w:tcW w:w="1502" w:type="dxa"/>
+          </w:tcPr>
+          <w:p>
+            <w:pPr>
+              <w:rPr>
+                <w:b/>
+                <w:lang w:val="en-US"/>
+              </w:rPr>
+            </w:pPr>
+            <w:r>
+              <w:t>/api/users/me</w:t>
+            </w:r>
+          </w:p>
+        </w:tc>
+        <w:tc>
+          <w:tcPr>
+            <w:tcW w:w="1493" w:type="dxa"/>
+          </w:tcPr>
+          <w:p>
+            <w:pPr>
+              <w:rPr>
+                <w:b/>
+                <w:lang w:val="en-US"/>
+              </w:rPr>
+            </w:pPr>
+            <w:r>
+              <w:t>Update editable details for currently authenticated user</w:t>
+            </w:r>
+          </w:p>
+        </w:tc>
+        <w:tc>
+          <w:tcPr>
+            <w:tcW w:w="1473" w:type="dxa"/>
+          </w:tcPr>
+          <w:p>
+            <w:pPr>
+              <w:rPr>
+                <w:b/>
+                <w:lang w:val="en-US"/>
+              </w:rPr>
+            </w:pPr>
+            <w:r>
+              <w:t>Any authonti cated user</w:t>
+            </w:r>
+          </w:p>
+        </w:tc>
+        <w:tc>
+          <w:tcPr>
+            <w:tcW w:w="1758" w:type="dxa"/>
+          </w:tcPr>
+          <w:p>
+            <w:pPr>
+              <w:rPr>
+                <w:b/>
+                <w:lang w:val="en-US"/>
+              </w:rPr>
+            </w:pPr>
+            <w:r>
+              <w:t>{ fullName,contact Number?, emergencyConta ct?}</w:t>
+            </w:r>
+          </w:p>
+        </w:tc>
+        <w:tc>
+          <w:tcPr>
+            <w:tcW w:w="1442" w:type="dxa"/>
+          </w:tcPr>
+          <w:p>
+            <w:pPr>
+              <w:rPr>
+                <w:b/>
+                <w:lang w:val="en-US"/>
+              </w:rPr>
+            </w:pPr>
+            <w:r>
+              <w:t>200 OK; 400 Bad request; 401 Unauthorize d</w:t>
+            </w:r>
+          </w:p>
+        </w:tc>
+      </w:tr>
+    </w:tbl>
+    <w:p>
+      <w:pPr>
+        <w:rPr>
+          <w:b/>
+          <w:lang w:val="en-US"/>
+        </w:rPr>
+      </w:pPr>
+    </w:p>
+    <w:p>
+      <w:pPr>
+        <w:rPr>
+          <w:b/>
+          <w:lang w:val="en-US"/>
+        </w:rPr>
+      </w:pPr>
+    </w:p>
+    <w:p>
+      <w:pPr>
+        <w:rPr>
+          <w:b/>
+          <w:lang w:val="en-US"/>
+        </w:rPr>
+      </w:pPr>
+      <w:r>
+        <w:rPr>
+          <w:b/>
+          <w:lang w:val="en-US"/>
+        </w:rPr>
+        <w:t>CATEGORY</w:t>
+      </w:r>
+    </w:p>
+    <w:tbl>
+      <w:tblPr>
+        <w:tblStyle w:val="TableGrid"/>
+        <w:tblW w:w="0" w:type="auto"/>
+        <w:tblLook w:val="04A0" w:firstRow="1" w:lastRow="0" w:firstColumn="1" w:lastColumn="0" w:noHBand="0" w:noVBand="1"/>
+      </w:tblPr>
+      <w:tblGrid>
+        <w:gridCol w:w="1452"/>
+        <w:gridCol w:w="1515"/>
+        <w:gridCol w:w="1492"/>
+        <w:gridCol w:w="1493"/>
+        <w:gridCol w:w="1581"/>
+        <w:gridCol w:w="1483"/>
+      </w:tblGrid>
+      <w:tr>
         <w:tc>
           <w:tcPr>
             <w:tcW w:w="1502" w:type="dxa"/>
@@ -1676,6 +2025,27 @@
                 <w:b/>
                 <w:lang w:val="en-US"/>
               </w:rPr>
+              <w:t>HTTP METHOD</w:t>
+            </w:r>
+          </w:p>
+        </w:tc>
+        <w:tc>
+          <w:tcPr>
+            <w:tcW w:w="1502" w:type="dxa"/>
+            <w:shd w:val="clear" w:color="auto" w:fill="833C0B" w:themeFill="accent2" w:themeFillShade="80"/>
+          </w:tcPr>
+          <w:p>
+            <w:pPr>
+              <w:rPr>
+                <w:b/>
+                <w:lang w:val="en-US"/>
+              </w:rPr>
+            </w:pPr>
+            <w:r>
+              <w:rPr>
+                <w:b/>
+                <w:lang w:val="en-US"/>
+              </w:rPr>
               <w:t>Route</w:t>
             </w:r>
           </w:p>
@@ -1794,39 +2164,39 @@
               </w:rPr>
             </w:pPr>
             <w:r>
-              <w:t>/api/users/me</w:t>
-            </w:r>
-          </w:p>
-        </w:tc>
-        <w:tc>
-          <w:tcPr>
-            <w:tcW w:w="1503" w:type="dxa"/>
-          </w:tcPr>
-          <w:p>
-            <w:pPr>
-              <w:rPr>
-                <w:b/>
-                <w:lang w:val="en-US"/>
-              </w:rPr>
-            </w:pPr>
-            <w:r>
-              <w:t>Return the profile of the currently authenticated RaceDay user</w:t>
-            </w:r>
-          </w:p>
-        </w:tc>
-        <w:tc>
-          <w:tcPr>
-            <w:tcW w:w="1503" w:type="dxa"/>
-          </w:tcPr>
-          <w:p>
-            <w:pPr>
-              <w:rPr>
-                <w:b/>
-                <w:lang w:val="en-US"/>
-              </w:rPr>
-            </w:pPr>
-            <w:r>
-              <w:t>Any authonti cated user</w:t>
+              <w:t>/api/events/{e ventsId}/categ ories</w:t>
+            </w:r>
+          </w:p>
+        </w:tc>
+        <w:tc>
+          <w:tcPr>
+            <w:tcW w:w="1503" w:type="dxa"/>
+          </w:tcPr>
+          <w:p>
+            <w:pPr>
+              <w:rPr>
+                <w:b/>
+                <w:lang w:val="en-US"/>
+              </w:rPr>
+            </w:pPr>
+            <w:r>
+              <w:t>Return all categories</w:t>
+            </w:r>
+          </w:p>
+        </w:tc>
+        <w:tc>
+          <w:tcPr>
+            <w:tcW w:w="1503" w:type="dxa"/>
+          </w:tcPr>
+          <w:p>
+            <w:pPr>
+              <w:rPr>
+                <w:b/>
+                <w:lang w:val="en-US"/>
+              </w:rPr>
+            </w:pPr>
+            <w:r>
+              <w:t>public</w:t>
             </w:r>
           </w:p>
         </w:tc>
@@ -1858,7 +2228,7 @@
               </w:rPr>
             </w:pPr>
             <w:r>
-              <w:t>200 OK; Unauthorize d; 404 Not found</w:t>
+              <w:t>200 OK; 404 Not Found</w:t>
             </w:r>
           </w:p>
         </w:tc>
@@ -1876,7 +2246,7 @@
               </w:rPr>
             </w:pPr>
             <w:r>
-              <w:t>PUT</w:t>
+              <w:t>POST</w:t>
             </w:r>
           </w:p>
         </w:tc>
@@ -1892,73 +2262,84 @@
               </w:rPr>
             </w:pPr>
             <w:r>
-              <w:t>/api/users/me</w:t>
+              <w:t>/api/events/{e ventsId}/categ ories</w:t>
+            </w:r>
+          </w:p>
+        </w:tc>
+        <w:tc>
+          <w:tcPr>
+            <w:tcW w:w="1503" w:type="dxa"/>
+          </w:tcPr>
+          <w:p>
+            <w:pPr>
+              <w:rPr>
+                <w:b/>
+                <w:lang w:val="en-US"/>
+              </w:rPr>
+            </w:pPr>
+            <w:r>
+              <w:t>Create a category for an event management by authnticated organiser</w:t>
+            </w:r>
+          </w:p>
+          <w:p>
+            <w:pPr>
+              <w:jc w:val="center"/>
+              <w:rPr>
+                <w:lang w:val="en-US"/>
+              </w:rPr>
+            </w:pPr>
+          </w:p>
+        </w:tc>
+        <w:tc>
+          <w:tcPr>
+            <w:tcW w:w="1503" w:type="dxa"/>
+          </w:tcPr>
+          <w:p>
+            <w:pPr>
+              <w:rPr>
+                <w:b/>
+                <w:lang w:val="en-US"/>
+              </w:rPr>
+            </w:pPr>
+            <w:r>
+              <w:t>Organise</w:t>
             </w:r>
             <w:bookmarkStart w:id="0" w:name="_GoBack"/>
             <w:bookmarkEnd w:id="0"/>
-          </w:p>
-        </w:tc>
-        <w:tc>
-          <w:tcPr>
-            <w:tcW w:w="1503" w:type="dxa"/>
-          </w:tcPr>
-          <w:p>
-            <w:pPr>
-              <w:rPr>
-                <w:b/>
-                <w:lang w:val="en-US"/>
-              </w:rPr>
-            </w:pPr>
-            <w:r>
-              <w:t>Update editable details for currently authenticated user</w:t>
-            </w:r>
-          </w:p>
-        </w:tc>
-        <w:tc>
-          <w:tcPr>
-            <w:tcW w:w="1503" w:type="dxa"/>
-          </w:tcPr>
-          <w:p>
-            <w:pPr>
-              <w:rPr>
-                <w:b/>
-                <w:lang w:val="en-US"/>
-              </w:rPr>
-            </w:pPr>
-            <w:r>
-              <w:t>Any authonti cated user</w:t>
-            </w:r>
-          </w:p>
-        </w:tc>
-        <w:tc>
-          <w:tcPr>
-            <w:tcW w:w="1503" w:type="dxa"/>
-          </w:tcPr>
-          <w:p>
-            <w:pPr>
-              <w:rPr>
-                <w:b/>
-                <w:lang w:val="en-US"/>
-              </w:rPr>
-            </w:pPr>
-            <w:r>
-              <w:t>{ fullName,contact Number?, emergencyConta ct?}</w:t>
-            </w:r>
-          </w:p>
-        </w:tc>
-        <w:tc>
-          <w:tcPr>
-            <w:tcW w:w="1503" w:type="dxa"/>
-          </w:tcPr>
-          <w:p>
-            <w:pPr>
-              <w:rPr>
-                <w:b/>
-                <w:lang w:val="en-US"/>
-              </w:rPr>
-            </w:pPr>
-            <w:r>
-              <w:t>200 OK; 400 Bad request; 401 Unauthorize d</w:t>
+            <w:r>
+              <w:t>r</w:t>
+            </w:r>
+          </w:p>
+        </w:tc>
+        <w:tc>
+          <w:tcPr>
+            <w:tcW w:w="1503" w:type="dxa"/>
+          </w:tcPr>
+          <w:p>
+            <w:pPr>
+              <w:rPr>
+                <w:b/>
+                <w:lang w:val="en-US"/>
+              </w:rPr>
+            </w:pPr>
+            <w:r>
+              <w:t>{ categoryName, minAge, maxAge,fee}</w:t>
+            </w:r>
+          </w:p>
+        </w:tc>
+        <w:tc>
+          <w:tcPr>
+            <w:tcW w:w="1503" w:type="dxa"/>
+          </w:tcPr>
+          <w:p>
+            <w:pPr>
+              <w:rPr>
+                <w:b/>
+                <w:lang w:val="en-US"/>
+              </w:rPr>
+            </w:pPr>
+            <w:r>
+              <w:t>201 Created; 400 Bad request; 401 Unauthorize d; 403 Forbidden; 404 Not Found</w:t>
             </w:r>
           </w:p>
         </w:tc>
@@ -1975,6 +2356,9 @@
                 <w:lang w:val="en-US"/>
               </w:rPr>
             </w:pPr>
+            <w:r>
+              <w:t>PUT</w:t>
+            </w:r>
           </w:p>
         </w:tc>
         <w:tc>
@@ -1988,58 +2372,83 @@
                 <w:lang w:val="en-US"/>
               </w:rPr>
             </w:pPr>
-          </w:p>
-        </w:tc>
-        <w:tc>
-          <w:tcPr>
-            <w:tcW w:w="1503" w:type="dxa"/>
-          </w:tcPr>
-          <w:p>
-            <w:pPr>
-              <w:rPr>
-                <w:b/>
-                <w:lang w:val="en-US"/>
-              </w:rPr>
-            </w:pPr>
-          </w:p>
-        </w:tc>
-        <w:tc>
-          <w:tcPr>
-            <w:tcW w:w="1503" w:type="dxa"/>
-          </w:tcPr>
-          <w:p>
-            <w:pPr>
-              <w:rPr>
-                <w:b/>
-                <w:lang w:val="en-US"/>
-              </w:rPr>
-            </w:pPr>
-          </w:p>
-        </w:tc>
-        <w:tc>
-          <w:tcPr>
-            <w:tcW w:w="1503" w:type="dxa"/>
-          </w:tcPr>
-          <w:p>
-            <w:pPr>
-              <w:rPr>
-                <w:b/>
-                <w:lang w:val="en-US"/>
-              </w:rPr>
-            </w:pPr>
-          </w:p>
-        </w:tc>
-        <w:tc>
-          <w:tcPr>
-            <w:tcW w:w="1503" w:type="dxa"/>
-          </w:tcPr>
-          <w:p>
-            <w:pPr>
-              <w:rPr>
-                <w:b/>
-                <w:lang w:val="en-US"/>
-              </w:rPr>
-            </w:pPr>
+            <w:r>
+              <w:t>/api/events/{e ventsId}/categ ories/{categor yIf}</w:t>
+            </w:r>
+          </w:p>
+        </w:tc>
+        <w:tc>
+          <w:tcPr>
+            <w:tcW w:w="1503" w:type="dxa"/>
+          </w:tcPr>
+          <w:p>
+            <w:pPr>
+              <w:rPr>
+                <w:b/>
+                <w:lang w:val="en-US"/>
+              </w:rPr>
+            </w:pPr>
+            <w:r>
+              <w:t>Update an existing category for an organiser owned event</w:t>
+            </w:r>
+          </w:p>
+        </w:tc>
+        <w:tc>
+          <w:tcPr>
+            <w:tcW w:w="1503" w:type="dxa"/>
+          </w:tcPr>
+          <w:p>
+            <w:pPr>
+              <w:rPr>
+                <w:b/>
+                <w:lang w:val="en-US"/>
+              </w:rPr>
+            </w:pPr>
+            <w:r>
+              <w:t>Organise</w:t>
+            </w:r>
+            <w:r>
+              <w:t>r</w:t>
+            </w:r>
+          </w:p>
+        </w:tc>
+        <w:tc>
+          <w:tcPr>
+            <w:tcW w:w="1503" w:type="dxa"/>
+          </w:tcPr>
+          <w:p>
+            <w:pPr>
+              <w:rPr>
+                <w:b/>
+                <w:lang w:val="en-US"/>
+              </w:rPr>
+            </w:pPr>
+            <w:r>
+              <w:t>{ categoryName, minAge, maxAge,fee}</w:t>
+            </w:r>
+          </w:p>
+          <w:p>
+            <w:pPr>
+              <w:rPr>
+                <w:lang w:val="en-US"/>
+              </w:rPr>
+            </w:pPr>
+          </w:p>
+        </w:tc>
+        <w:tc>
+          <w:tcPr>
+            <w:tcW w:w="1503" w:type="dxa"/>
+          </w:tcPr>
+          <w:p>
+            <w:pPr>
+              <w:rPr>
+                <w:b/>
+                <w:lang w:val="en-US"/>
+              </w:rPr>
+            </w:pPr>
+            <w:r>
+              <w:t>200 OK; 400 Bad request; 401 Unauthorize d; 403 Forbidden;</w:t>
+            </w:r>
           </w:p>
         </w:tc>
       </w:tr>
@@ -2072,7 +2481,8 @@
           <w:b/>
           <w:lang w:val="en-US"/>
         </w:rPr>
-        <w:t>CATEGORY</w:t>
+        <w:lastRenderedPageBreak/>
+        <w:t>ENROLMENT</w:t>
       </w:r>
     </w:p>
     <w:tbl>
@@ -2486,7 +2896,14 @@
           <w:b/>
           <w:lang w:val="en-US"/>
         </w:rPr>
-        <w:t>ENROLMENT</w:t>
+        <w:t>RESULT</w:t>
+      </w:r>
+      <w:r>
+        <w:rPr>
+          <w:b/>
+          <w:lang w:val="en-US"/>
+        </w:rPr>
+        <w:t>S</w:t>
       </w:r>
     </w:p>
     <w:tbl>
@@ -2521,428 +2938,6 @@
                 <w:b/>
                 <w:lang w:val="en-US"/>
               </w:rPr>
-              <w:t>HTTP METHOD</w:t>
-            </w:r>
-          </w:p>
-        </w:tc>
-        <w:tc>
-          <w:tcPr>
-            <w:tcW w:w="1502" w:type="dxa"/>
-            <w:shd w:val="clear" w:color="auto" w:fill="833C0B" w:themeFill="accent2" w:themeFillShade="80"/>
-          </w:tcPr>
-          <w:p>
-            <w:pPr>
-              <w:rPr>
-                <w:b/>
-                <w:lang w:val="en-US"/>
-              </w:rPr>
-            </w:pPr>
-            <w:r>
-              <w:rPr>
-                <w:b/>
-                <w:lang w:val="en-US"/>
-              </w:rPr>
-              <w:t>Route</w:t>
-            </w:r>
-          </w:p>
-        </w:tc>
-        <w:tc>
-          <w:tcPr>
-            <w:tcW w:w="1503" w:type="dxa"/>
-            <w:shd w:val="clear" w:color="auto" w:fill="833C0B" w:themeFill="accent2" w:themeFillShade="80"/>
-          </w:tcPr>
-          <w:p>
-            <w:pPr>
-              <w:rPr>
-                <w:b/>
-                <w:lang w:val="en-US"/>
-              </w:rPr>
-            </w:pPr>
-            <w:r>
-              <w:rPr>
-                <w:b/>
-                <w:lang w:val="en-US"/>
-              </w:rPr>
-              <w:t>Description</w:t>
-            </w:r>
-          </w:p>
-        </w:tc>
-        <w:tc>
-          <w:tcPr>
-            <w:tcW w:w="1503" w:type="dxa"/>
-            <w:shd w:val="clear" w:color="auto" w:fill="833C0B" w:themeFill="accent2" w:themeFillShade="80"/>
-          </w:tcPr>
-          <w:p>
-            <w:pPr>
-              <w:rPr>
-                <w:b/>
-                <w:lang w:val="en-US"/>
-              </w:rPr>
-            </w:pPr>
-            <w:r>
-              <w:rPr>
-                <w:b/>
-                <w:lang w:val="en-US"/>
-              </w:rPr>
-              <w:t>Role Requirement</w:t>
-            </w:r>
-          </w:p>
-        </w:tc>
-        <w:tc>
-          <w:tcPr>
-            <w:tcW w:w="1503" w:type="dxa"/>
-            <w:shd w:val="clear" w:color="auto" w:fill="833C0B" w:themeFill="accent2" w:themeFillShade="80"/>
-          </w:tcPr>
-          <w:p>
-            <w:pPr>
-              <w:rPr>
-                <w:b/>
-                <w:lang w:val="en-US"/>
-              </w:rPr>
-            </w:pPr>
-            <w:r>
-              <w:rPr>
-                <w:b/>
-                <w:lang w:val="en-US"/>
-              </w:rPr>
-              <w:t>Request body</w:t>
-            </w:r>
-          </w:p>
-        </w:tc>
-        <w:tc>
-          <w:tcPr>
-            <w:tcW w:w="1503" w:type="dxa"/>
-            <w:shd w:val="clear" w:color="auto" w:fill="833C0B" w:themeFill="accent2" w:themeFillShade="80"/>
-          </w:tcPr>
-          <w:p>
-            <w:pPr>
-              <w:rPr>
-                <w:b/>
-                <w:lang w:val="en-US"/>
-              </w:rPr>
-            </w:pPr>
-            <w:r>
-              <w:rPr>
-                <w:b/>
-                <w:lang w:val="en-US"/>
-              </w:rPr>
-              <w:t>Expected Respond</w:t>
-            </w:r>
-          </w:p>
-        </w:tc>
-      </w:tr>
-      <w:tr>
-        <w:tc>
-          <w:tcPr>
-            <w:tcW w:w="1502" w:type="dxa"/>
-          </w:tcPr>
-          <w:p>
-            <w:pPr>
-              <w:rPr>
-                <w:b/>
-                <w:lang w:val="en-US"/>
-              </w:rPr>
-            </w:pPr>
-          </w:p>
-        </w:tc>
-        <w:tc>
-          <w:tcPr>
-            <w:tcW w:w="1502" w:type="dxa"/>
-          </w:tcPr>
-          <w:p>
-            <w:pPr>
-              <w:rPr>
-                <w:b/>
-                <w:lang w:val="en-US"/>
-              </w:rPr>
-            </w:pPr>
-          </w:p>
-        </w:tc>
-        <w:tc>
-          <w:tcPr>
-            <w:tcW w:w="1503" w:type="dxa"/>
-          </w:tcPr>
-          <w:p>
-            <w:pPr>
-              <w:rPr>
-                <w:b/>
-                <w:lang w:val="en-US"/>
-              </w:rPr>
-            </w:pPr>
-          </w:p>
-        </w:tc>
-        <w:tc>
-          <w:tcPr>
-            <w:tcW w:w="1503" w:type="dxa"/>
-          </w:tcPr>
-          <w:p>
-            <w:pPr>
-              <w:rPr>
-                <w:b/>
-                <w:lang w:val="en-US"/>
-              </w:rPr>
-            </w:pPr>
-          </w:p>
-        </w:tc>
-        <w:tc>
-          <w:tcPr>
-            <w:tcW w:w="1503" w:type="dxa"/>
-          </w:tcPr>
-          <w:p>
-            <w:pPr>
-              <w:rPr>
-                <w:b/>
-                <w:lang w:val="en-US"/>
-              </w:rPr>
-            </w:pPr>
-          </w:p>
-        </w:tc>
-        <w:tc>
-          <w:tcPr>
-            <w:tcW w:w="1503" w:type="dxa"/>
-          </w:tcPr>
-          <w:p>
-            <w:pPr>
-              <w:rPr>
-                <w:b/>
-                <w:lang w:val="en-US"/>
-              </w:rPr>
-            </w:pPr>
-          </w:p>
-        </w:tc>
-      </w:tr>
-      <w:tr>
-        <w:tc>
-          <w:tcPr>
-            <w:tcW w:w="1502" w:type="dxa"/>
-          </w:tcPr>
-          <w:p>
-            <w:pPr>
-              <w:rPr>
-                <w:b/>
-                <w:lang w:val="en-US"/>
-              </w:rPr>
-            </w:pPr>
-          </w:p>
-        </w:tc>
-        <w:tc>
-          <w:tcPr>
-            <w:tcW w:w="1502" w:type="dxa"/>
-          </w:tcPr>
-          <w:p>
-            <w:pPr>
-              <w:rPr>
-                <w:b/>
-                <w:lang w:val="en-US"/>
-              </w:rPr>
-            </w:pPr>
-          </w:p>
-        </w:tc>
-        <w:tc>
-          <w:tcPr>
-            <w:tcW w:w="1503" w:type="dxa"/>
-          </w:tcPr>
-          <w:p>
-            <w:pPr>
-              <w:rPr>
-                <w:b/>
-                <w:lang w:val="en-US"/>
-              </w:rPr>
-            </w:pPr>
-          </w:p>
-        </w:tc>
-        <w:tc>
-          <w:tcPr>
-            <w:tcW w:w="1503" w:type="dxa"/>
-          </w:tcPr>
-          <w:p>
-            <w:pPr>
-              <w:rPr>
-                <w:b/>
-                <w:lang w:val="en-US"/>
-              </w:rPr>
-            </w:pPr>
-          </w:p>
-        </w:tc>
-        <w:tc>
-          <w:tcPr>
-            <w:tcW w:w="1503" w:type="dxa"/>
-          </w:tcPr>
-          <w:p>
-            <w:pPr>
-              <w:rPr>
-                <w:b/>
-                <w:lang w:val="en-US"/>
-              </w:rPr>
-            </w:pPr>
-          </w:p>
-        </w:tc>
-        <w:tc>
-          <w:tcPr>
-            <w:tcW w:w="1503" w:type="dxa"/>
-          </w:tcPr>
-          <w:p>
-            <w:pPr>
-              <w:rPr>
-                <w:b/>
-                <w:lang w:val="en-US"/>
-              </w:rPr>
-            </w:pPr>
-          </w:p>
-        </w:tc>
-      </w:tr>
-      <w:tr>
-        <w:tc>
-          <w:tcPr>
-            <w:tcW w:w="1502" w:type="dxa"/>
-          </w:tcPr>
-          <w:p>
-            <w:pPr>
-              <w:rPr>
-                <w:b/>
-                <w:lang w:val="en-US"/>
-              </w:rPr>
-            </w:pPr>
-          </w:p>
-        </w:tc>
-        <w:tc>
-          <w:tcPr>
-            <w:tcW w:w="1502" w:type="dxa"/>
-          </w:tcPr>
-          <w:p>
-            <w:pPr>
-              <w:rPr>
-                <w:b/>
-                <w:lang w:val="en-US"/>
-              </w:rPr>
-            </w:pPr>
-          </w:p>
-        </w:tc>
-        <w:tc>
-          <w:tcPr>
-            <w:tcW w:w="1503" w:type="dxa"/>
-          </w:tcPr>
-          <w:p>
-            <w:pPr>
-              <w:rPr>
-                <w:b/>
-                <w:lang w:val="en-US"/>
-              </w:rPr>
-            </w:pPr>
-          </w:p>
-        </w:tc>
-        <w:tc>
-          <w:tcPr>
-            <w:tcW w:w="1503" w:type="dxa"/>
-          </w:tcPr>
-          <w:p>
-            <w:pPr>
-              <w:rPr>
-                <w:b/>
-                <w:lang w:val="en-US"/>
-              </w:rPr>
-            </w:pPr>
-          </w:p>
-        </w:tc>
-        <w:tc>
-          <w:tcPr>
-            <w:tcW w:w="1503" w:type="dxa"/>
-          </w:tcPr>
-          <w:p>
-            <w:pPr>
-              <w:rPr>
-                <w:b/>
-                <w:lang w:val="en-US"/>
-              </w:rPr>
-            </w:pPr>
-          </w:p>
-        </w:tc>
-        <w:tc>
-          <w:tcPr>
-            <w:tcW w:w="1503" w:type="dxa"/>
-          </w:tcPr>
-          <w:p>
-            <w:pPr>
-              <w:rPr>
-                <w:b/>
-                <w:lang w:val="en-US"/>
-              </w:rPr>
-            </w:pPr>
-          </w:p>
-        </w:tc>
-      </w:tr>
-    </w:tbl>
-    <w:p>
-      <w:pPr>
-        <w:rPr>
-          <w:b/>
-          <w:lang w:val="en-US"/>
-        </w:rPr>
-      </w:pPr>
-    </w:p>
-    <w:p>
-      <w:pPr>
-        <w:rPr>
-          <w:b/>
-          <w:lang w:val="en-US"/>
-        </w:rPr>
-      </w:pPr>
-    </w:p>
-    <w:p>
-      <w:pPr>
-        <w:rPr>
-          <w:b/>
-          <w:lang w:val="en-US"/>
-        </w:rPr>
-      </w:pPr>
-      <w:r>
-        <w:rPr>
-          <w:b/>
-          <w:lang w:val="en-US"/>
-        </w:rPr>
-        <w:t>RESULT</w:t>
-      </w:r>
-      <w:r>
-        <w:rPr>
-          <w:b/>
-          <w:lang w:val="en-US"/>
-        </w:rPr>
-        <w:t>S</w:t>
-      </w:r>
-    </w:p>
-    <w:tbl>
-      <w:tblPr>
-        <w:tblStyle w:val="TableGrid"/>
-        <w:tblW w:w="0" w:type="auto"/>
-        <w:tblLook w:val="04A0" w:firstRow="1" w:lastRow="0" w:firstColumn="1" w:lastColumn="0" w:noHBand="0" w:noVBand="1"/>
-      </w:tblPr>
-      <w:tblGrid>
-        <w:gridCol w:w="1502"/>
-        <w:gridCol w:w="1502"/>
-        <w:gridCol w:w="1503"/>
-        <w:gridCol w:w="1503"/>
-        <w:gridCol w:w="1503"/>
-        <w:gridCol w:w="1503"/>
-      </w:tblGrid>
-      <w:tr>
-        <w:tc>
-          <w:tcPr>
-            <w:tcW w:w="1502" w:type="dxa"/>
-            <w:shd w:val="clear" w:color="auto" w:fill="833C0B" w:themeFill="accent2" w:themeFillShade="80"/>
-          </w:tcPr>
-          <w:p>
-            <w:pPr>
-              <w:rPr>
-                <w:b/>
-                <w:lang w:val="en-US"/>
-              </w:rPr>
-            </w:pPr>
-            <w:r>
-              <w:rPr>
-                <w:b/>
-                <w:lang w:val="en-US"/>
-              </w:rPr>
-              <w:lastRenderedPageBreak/>
               <w:t>HTTP METHOD</w:t>
             </w:r>
           </w:p>

</xml_diff>

<commit_message>
Populated Enrolment with data
</commit_message>
<xml_diff>
--- a/docs/RaceDay_API_Endpoint_Plan.docx
+++ b/docs/RaceDay_API_Endpoint_Plan.docx
@@ -2304,8 +2304,6 @@
             <w:r>
               <w:t>Organise</w:t>
             </w:r>
-            <w:bookmarkStart w:id="0" w:name="_GoBack"/>
-            <w:bookmarkEnd w:id="0"/>
             <w:r>
               <w:t>r</w:t>
             </w:r>
@@ -2452,6 +2450,85 @@
           </w:p>
         </w:tc>
       </w:tr>
+      <w:tr>
+        <w:tc>
+          <w:tcPr>
+            <w:tcW w:w="1502" w:type="dxa"/>
+          </w:tcPr>
+          <w:p>
+            <w:r>
+              <w:t>DELETE</w:t>
+            </w:r>
+          </w:p>
+        </w:tc>
+        <w:tc>
+          <w:tcPr>
+            <w:tcW w:w="1502" w:type="dxa"/>
+          </w:tcPr>
+          <w:p>
+            <w:r>
+              <w:t xml:space="preserve">/api/events/{e ventsId}/categ </w:t>
+            </w:r>
+            <w:r>
+              <w:lastRenderedPageBreak/>
+              <w:t>ories/{categor yIf}</w:t>
+            </w:r>
+          </w:p>
+        </w:tc>
+        <w:tc>
+          <w:tcPr>
+            <w:tcW w:w="1503" w:type="dxa"/>
+          </w:tcPr>
+          <w:p>
+            <w:r>
+              <w:lastRenderedPageBreak/>
+              <w:t xml:space="preserve">Deletes an event category </w:t>
+            </w:r>
+            <w:r>
+              <w:lastRenderedPageBreak/>
+              <w:t>when it is not protected</w:t>
+            </w:r>
+          </w:p>
+        </w:tc>
+        <w:tc>
+          <w:tcPr>
+            <w:tcW w:w="1503" w:type="dxa"/>
+          </w:tcPr>
+          <w:p>
+            <w:r>
+              <w:lastRenderedPageBreak/>
+              <w:t>Organise</w:t>
+            </w:r>
+            <w:r>
+              <w:t>r</w:t>
+            </w:r>
+          </w:p>
+        </w:tc>
+        <w:tc>
+          <w:tcPr>
+            <w:tcW w:w="1503" w:type="dxa"/>
+          </w:tcPr>
+          <w:p>
+            <w:r>
+              <w:t>none</w:t>
+            </w:r>
+          </w:p>
+        </w:tc>
+        <w:tc>
+          <w:tcPr>
+            <w:tcW w:w="1503" w:type="dxa"/>
+          </w:tcPr>
+          <w:p>
+            <w:r>
+              <w:t xml:space="preserve">204 No content; 401 Unauthorize </w:t>
+            </w:r>
+            <w:r>
+              <w:lastRenderedPageBreak/>
+              <w:t>d; 403 Forbidden; 404 Not Found; 409 Conflict</w:t>
+            </w:r>
+          </w:p>
+        </w:tc>
+      </w:tr>
     </w:tbl>
     <w:p>
       <w:pPr>
@@ -2481,7 +2558,6 @@
           <w:b/>
           <w:lang w:val="en-US"/>
         </w:rPr>
-        <w:lastRenderedPageBreak/>
         <w:t>ENROLMENT</w:t>
       </w:r>
     </w:p>
@@ -2492,12 +2568,12 @@
         <w:tblLook w:val="04A0" w:firstRow="1" w:lastRow="0" w:firstColumn="1" w:lastColumn="0" w:noHBand="0" w:noVBand="1"/>
       </w:tblPr>
       <w:tblGrid>
-        <w:gridCol w:w="1502"/>
-        <w:gridCol w:w="1502"/>
-        <w:gridCol w:w="1503"/>
-        <w:gridCol w:w="1503"/>
-        <w:gridCol w:w="1503"/>
-        <w:gridCol w:w="1503"/>
+        <w:gridCol w:w="1468"/>
+        <w:gridCol w:w="1601"/>
+        <w:gridCol w:w="1501"/>
+        <w:gridCol w:w="1496"/>
+        <w:gridCol w:w="1461"/>
+        <w:gridCol w:w="1489"/>
       </w:tblGrid>
       <w:tr>
         <w:tc>
@@ -2639,6 +2715,9 @@
                 <w:lang w:val="en-US"/>
               </w:rPr>
             </w:pPr>
+            <w:r>
+              <w:t>GET</w:t>
+            </w:r>
           </w:p>
         </w:tc>
         <w:tc>
@@ -2652,58 +2731,61 @@
                 <w:lang w:val="en-US"/>
               </w:rPr>
             </w:pPr>
-          </w:p>
-        </w:tc>
-        <w:tc>
-          <w:tcPr>
-            <w:tcW w:w="1503" w:type="dxa"/>
-          </w:tcPr>
-          <w:p>
-            <w:pPr>
-              <w:rPr>
-                <w:b/>
-                <w:lang w:val="en-US"/>
-              </w:rPr>
-            </w:pPr>
-          </w:p>
-        </w:tc>
-        <w:tc>
-          <w:tcPr>
-            <w:tcW w:w="1503" w:type="dxa"/>
-          </w:tcPr>
-          <w:p>
-            <w:pPr>
-              <w:rPr>
-                <w:b/>
-                <w:lang w:val="en-US"/>
-              </w:rPr>
-            </w:pPr>
-          </w:p>
-        </w:tc>
-        <w:tc>
-          <w:tcPr>
-            <w:tcW w:w="1503" w:type="dxa"/>
-          </w:tcPr>
-          <w:p>
-            <w:pPr>
-              <w:rPr>
-                <w:b/>
-                <w:lang w:val="en-US"/>
-              </w:rPr>
-            </w:pPr>
-          </w:p>
-        </w:tc>
-        <w:tc>
-          <w:tcPr>
-            <w:tcW w:w="1503" w:type="dxa"/>
-          </w:tcPr>
-          <w:p>
-            <w:pPr>
-              <w:rPr>
-                <w:b/>
-                <w:lang w:val="en-US"/>
-              </w:rPr>
-            </w:pPr>
+            <w:r>
+              <w:t>/api/enrolment s/me</w:t>
+            </w:r>
+          </w:p>
+        </w:tc>
+        <w:tc>
+          <w:tcPr>
+            <w:tcW w:w="1503" w:type="dxa"/>
+          </w:tcPr>
+          <w:p>
+            <w:pPr>
+              <w:rPr>
+                <w:b/>
+                <w:lang w:val="en-US"/>
+              </w:rPr>
+            </w:pPr>
+            <w:r>
+              <w:t>Return all events enrolments belonging to the authenticated participant</w:t>
+            </w:r>
+          </w:p>
+        </w:tc>
+        <w:tc>
+          <w:tcPr>
+            <w:tcW w:w="1503" w:type="dxa"/>
+          </w:tcPr>
+          <w:p>
+            <w:r>
+              <w:t>Partcipant</w:t>
+            </w:r>
+          </w:p>
+        </w:tc>
+        <w:tc>
+          <w:tcPr>
+            <w:tcW w:w="1503" w:type="dxa"/>
+          </w:tcPr>
+          <w:p>
+            <w:r>
+              <w:t xml:space="preserve">None </w:t>
+            </w:r>
+          </w:p>
+        </w:tc>
+        <w:tc>
+          <w:tcPr>
+            <w:tcW w:w="1503" w:type="dxa"/>
+          </w:tcPr>
+          <w:p>
+            <w:pPr>
+              <w:rPr>
+                <w:b/>
+                <w:lang w:val="en-US"/>
+              </w:rPr>
+            </w:pPr>
+            <w:r>
+              <w:t>200 OK; 401 Unauthentic ation; 403 Forbidden</w:t>
+            </w:r>
           </w:p>
         </w:tc>
       </w:tr>
@@ -2719,6 +2801,11 @@
                 <w:lang w:val="en-US"/>
               </w:rPr>
             </w:pPr>
+            <w:r>
+              <w:t>DELETE</w:t>
+            </w:r>
+            <w:bookmarkStart w:id="0" w:name="_GoBack"/>
+            <w:bookmarkEnd w:id="0"/>
           </w:p>
         </w:tc>
         <w:tc>
@@ -2732,58 +2819,61 @@
                 <w:lang w:val="en-US"/>
               </w:rPr>
             </w:pPr>
-          </w:p>
-        </w:tc>
-        <w:tc>
-          <w:tcPr>
-            <w:tcW w:w="1503" w:type="dxa"/>
-          </w:tcPr>
-          <w:p>
-            <w:pPr>
-              <w:rPr>
-                <w:b/>
-                <w:lang w:val="en-US"/>
-              </w:rPr>
-            </w:pPr>
-          </w:p>
-        </w:tc>
-        <w:tc>
-          <w:tcPr>
-            <w:tcW w:w="1503" w:type="dxa"/>
-          </w:tcPr>
-          <w:p>
-            <w:pPr>
-              <w:rPr>
-                <w:b/>
-                <w:lang w:val="en-US"/>
-              </w:rPr>
-            </w:pPr>
-          </w:p>
-        </w:tc>
-        <w:tc>
-          <w:tcPr>
-            <w:tcW w:w="1503" w:type="dxa"/>
-          </w:tcPr>
-          <w:p>
-            <w:pPr>
-              <w:rPr>
-                <w:b/>
-                <w:lang w:val="en-US"/>
-              </w:rPr>
-            </w:pPr>
-          </w:p>
-        </w:tc>
-        <w:tc>
-          <w:tcPr>
-            <w:tcW w:w="1503" w:type="dxa"/>
-          </w:tcPr>
-          <w:p>
-            <w:pPr>
-              <w:rPr>
-                <w:b/>
-                <w:lang w:val="en-US"/>
-              </w:rPr>
-            </w:pPr>
+            <w:r>
+              <w:t>/api/enrolment s/{id}</w:t>
+            </w:r>
+          </w:p>
+        </w:tc>
+        <w:tc>
+          <w:tcPr>
+            <w:tcW w:w="1503" w:type="dxa"/>
+          </w:tcPr>
+          <w:p>
+            <w:pPr>
+              <w:rPr>
+                <w:b/>
+                <w:lang w:val="en-US"/>
+              </w:rPr>
+            </w:pPr>
+            <w:r>
+              <w:t>Cancel an enrolment belonginging to the authenticated participant</w:t>
+            </w:r>
+          </w:p>
+        </w:tc>
+        <w:tc>
+          <w:tcPr>
+            <w:tcW w:w="1503" w:type="dxa"/>
+          </w:tcPr>
+          <w:p>
+            <w:r>
+              <w:t>Partcipant</w:t>
+            </w:r>
+          </w:p>
+        </w:tc>
+        <w:tc>
+          <w:tcPr>
+            <w:tcW w:w="1503" w:type="dxa"/>
+          </w:tcPr>
+          <w:p>
+            <w:r>
+              <w:t xml:space="preserve">None </w:t>
+            </w:r>
+          </w:p>
+        </w:tc>
+        <w:tc>
+          <w:tcPr>
+            <w:tcW w:w="1503" w:type="dxa"/>
+          </w:tcPr>
+          <w:p>
+            <w:pPr>
+              <w:rPr>
+                <w:b/>
+                <w:lang w:val="en-US"/>
+              </w:rPr>
+            </w:pPr>
+            <w:r>
+              <w:t>204 No content; 401 Unauthorize d; 403 Fprbidden; 404 Not Found; 409 Conflict</w:t>
+            </w:r>
           </w:p>
         </w:tc>
       </w:tr>
@@ -2799,6 +2889,9 @@
                 <w:lang w:val="en-US"/>
               </w:rPr>
             </w:pPr>
+            <w:r>
+              <w:t>GET</w:t>
+            </w:r>
           </w:p>
         </w:tc>
         <w:tc>
@@ -2812,58 +2905,67 @@
                 <w:lang w:val="en-US"/>
               </w:rPr>
             </w:pPr>
-          </w:p>
-        </w:tc>
-        <w:tc>
-          <w:tcPr>
-            <w:tcW w:w="1503" w:type="dxa"/>
-          </w:tcPr>
-          <w:p>
-            <w:pPr>
-              <w:rPr>
-                <w:b/>
-                <w:lang w:val="en-US"/>
-              </w:rPr>
-            </w:pPr>
-          </w:p>
-        </w:tc>
-        <w:tc>
-          <w:tcPr>
-            <w:tcW w:w="1503" w:type="dxa"/>
-          </w:tcPr>
-          <w:p>
-            <w:pPr>
-              <w:rPr>
-                <w:b/>
-                <w:lang w:val="en-US"/>
-              </w:rPr>
-            </w:pPr>
-          </w:p>
-        </w:tc>
-        <w:tc>
-          <w:tcPr>
-            <w:tcW w:w="1503" w:type="dxa"/>
-          </w:tcPr>
-          <w:p>
-            <w:pPr>
-              <w:rPr>
-                <w:b/>
-                <w:lang w:val="en-US"/>
-              </w:rPr>
-            </w:pPr>
-          </w:p>
-        </w:tc>
-        <w:tc>
-          <w:tcPr>
-            <w:tcW w:w="1503" w:type="dxa"/>
-          </w:tcPr>
-          <w:p>
-            <w:pPr>
-              <w:rPr>
-                <w:b/>
-                <w:lang w:val="en-US"/>
-              </w:rPr>
-            </w:pPr>
+            <w:r>
+              <w:t>/api/events/{e vent}/enrolme nts</w:t>
+            </w:r>
+          </w:p>
+        </w:tc>
+        <w:tc>
+          <w:tcPr>
+            <w:tcW w:w="1503" w:type="dxa"/>
+          </w:tcPr>
+          <w:p>
+            <w:pPr>
+              <w:rPr>
+                <w:b/>
+                <w:lang w:val="en-US"/>
+              </w:rPr>
+            </w:pPr>
+            <w:r>
+              <w:t>Return enrolments for an event owned by the authenticated Organiser</w:t>
+            </w:r>
+          </w:p>
+        </w:tc>
+        <w:tc>
+          <w:tcPr>
+            <w:tcW w:w="1503" w:type="dxa"/>
+          </w:tcPr>
+          <w:p>
+            <w:pPr>
+              <w:rPr>
+                <w:b/>
+                <w:lang w:val="en-US"/>
+              </w:rPr>
+            </w:pPr>
+            <w:r>
+              <w:t>Organiser</w:t>
+            </w:r>
+          </w:p>
+        </w:tc>
+        <w:tc>
+          <w:tcPr>
+            <w:tcW w:w="1503" w:type="dxa"/>
+          </w:tcPr>
+          <w:p>
+            <w:r>
+              <w:t xml:space="preserve">None </w:t>
+            </w:r>
+          </w:p>
+        </w:tc>
+        <w:tc>
+          <w:tcPr>
+            <w:tcW w:w="1503" w:type="dxa"/>
+          </w:tcPr>
+          <w:p>
+            <w:pPr>
+              <w:rPr>
+                <w:b/>
+                <w:lang w:val="en-US"/>
+              </w:rPr>
+            </w:pPr>
+            <w:r>
+              <w:t>200 OK; 401 Unauthorize d; 403 Forbidden; 404 Not Found</w:t>
+            </w:r>
           </w:p>
         </w:tc>
       </w:tr>

</xml_diff>

<commit_message>
Populate Results with data
</commit_message>
<xml_diff>
--- a/docs/RaceDay_API_Endpoint_Plan.docx
+++ b/docs/RaceDay_API_Endpoint_Plan.docx
@@ -2804,8 +2804,6 @@
             <w:r>
               <w:t>DELETE</w:t>
             </w:r>
-            <w:bookmarkStart w:id="0" w:name="_GoBack"/>
-            <w:bookmarkEnd w:id="0"/>
           </w:p>
         </w:tc>
         <w:tc>
@@ -3015,16 +3013,58 @@
         <w:tblLook w:val="04A0" w:firstRow="1" w:lastRow="0" w:firstColumn="1" w:lastColumn="0" w:noHBand="0" w:noVBand="1"/>
       </w:tblPr>
       <w:tblGrid>
+        <w:gridCol w:w="1491"/>
+        <w:gridCol w:w="1540"/>
         <w:gridCol w:w="1502"/>
-        <w:gridCol w:w="1502"/>
-        <w:gridCol w:w="1503"/>
-        <w:gridCol w:w="1503"/>
-        <w:gridCol w:w="1503"/>
-        <w:gridCol w:w="1503"/>
+        <w:gridCol w:w="1501"/>
+        <w:gridCol w:w="1490"/>
+        <w:gridCol w:w="1492"/>
       </w:tblGrid>
       <w:tr>
         <w:tc>
           <w:tcPr>
+            <w:tcW w:w="1491" w:type="dxa"/>
+            <w:shd w:val="clear" w:color="auto" w:fill="833C0B" w:themeFill="accent2" w:themeFillShade="80"/>
+          </w:tcPr>
+          <w:p>
+            <w:pPr>
+              <w:rPr>
+                <w:b/>
+                <w:lang w:val="en-US"/>
+              </w:rPr>
+            </w:pPr>
+            <w:r>
+              <w:rPr>
+                <w:b/>
+                <w:lang w:val="en-US"/>
+              </w:rPr>
+              <w:t>HTTP METHOD</w:t>
+            </w:r>
+          </w:p>
+        </w:tc>
+        <w:tc>
+          <w:tcPr>
+            <w:tcW w:w="1540" w:type="dxa"/>
+            <w:shd w:val="clear" w:color="auto" w:fill="833C0B" w:themeFill="accent2" w:themeFillShade="80"/>
+          </w:tcPr>
+          <w:p>
+            <w:pPr>
+              <w:rPr>
+                <w:b/>
+                <w:lang w:val="en-US"/>
+              </w:rPr>
+            </w:pPr>
+            <w:r>
+              <w:rPr>
+                <w:b/>
+                <w:lang w:val="en-US"/>
+              </w:rPr>
+              <w:t>Route</w:t>
+            </w:r>
+          </w:p>
+        </w:tc>
+        <w:tc>
+          <w:tcPr>
             <w:tcW w:w="1502" w:type="dxa"/>
             <w:shd w:val="clear" w:color="auto" w:fill="833C0B" w:themeFill="accent2" w:themeFillShade="80"/>
           </w:tcPr>
@@ -3040,13 +3080,13 @@
                 <w:b/>
                 <w:lang w:val="en-US"/>
               </w:rPr>
-              <w:t>HTTP METHOD</w:t>
-            </w:r>
-          </w:p>
-        </w:tc>
-        <w:tc>
-          <w:tcPr>
-            <w:tcW w:w="1502" w:type="dxa"/>
+              <w:t>Description</w:t>
+            </w:r>
+          </w:p>
+        </w:tc>
+        <w:tc>
+          <w:tcPr>
+            <w:tcW w:w="1501" w:type="dxa"/>
             <w:shd w:val="clear" w:color="auto" w:fill="833C0B" w:themeFill="accent2" w:themeFillShade="80"/>
           </w:tcPr>
           <w:p>
@@ -3061,13 +3101,13 @@
                 <w:b/>
                 <w:lang w:val="en-US"/>
               </w:rPr>
-              <w:t>Route</w:t>
-            </w:r>
-          </w:p>
-        </w:tc>
-        <w:tc>
-          <w:tcPr>
-            <w:tcW w:w="1503" w:type="dxa"/>
+              <w:t>Role Requirement</w:t>
+            </w:r>
+          </w:p>
+        </w:tc>
+        <w:tc>
+          <w:tcPr>
+            <w:tcW w:w="1490" w:type="dxa"/>
             <w:shd w:val="clear" w:color="auto" w:fill="833C0B" w:themeFill="accent2" w:themeFillShade="80"/>
           </w:tcPr>
           <w:p>
@@ -3082,55 +3122,13 @@
                 <w:b/>
                 <w:lang w:val="en-US"/>
               </w:rPr>
-              <w:t>Description</w:t>
-            </w:r>
-          </w:p>
-        </w:tc>
-        <w:tc>
-          <w:tcPr>
-            <w:tcW w:w="1503" w:type="dxa"/>
-            <w:shd w:val="clear" w:color="auto" w:fill="833C0B" w:themeFill="accent2" w:themeFillShade="80"/>
-          </w:tcPr>
-          <w:p>
-            <w:pPr>
-              <w:rPr>
-                <w:b/>
-                <w:lang w:val="en-US"/>
-              </w:rPr>
-            </w:pPr>
-            <w:r>
-              <w:rPr>
-                <w:b/>
-                <w:lang w:val="en-US"/>
-              </w:rPr>
-              <w:t>Role Requirement</w:t>
-            </w:r>
-          </w:p>
-        </w:tc>
-        <w:tc>
-          <w:tcPr>
-            <w:tcW w:w="1503" w:type="dxa"/>
-            <w:shd w:val="clear" w:color="auto" w:fill="833C0B" w:themeFill="accent2" w:themeFillShade="80"/>
-          </w:tcPr>
-          <w:p>
-            <w:pPr>
-              <w:rPr>
-                <w:b/>
-                <w:lang w:val="en-US"/>
-              </w:rPr>
-            </w:pPr>
-            <w:r>
-              <w:rPr>
-                <w:b/>
-                <w:lang w:val="en-US"/>
-              </w:rPr>
               <w:t>Request body</w:t>
             </w:r>
           </w:p>
         </w:tc>
         <w:tc>
           <w:tcPr>
-            <w:tcW w:w="1503" w:type="dxa"/>
+            <w:tcW w:w="1492" w:type="dxa"/>
             <w:shd w:val="clear" w:color="auto" w:fill="833C0B" w:themeFill="accent2" w:themeFillShade="80"/>
           </w:tcPr>
           <w:p>
@@ -3153,6 +3151,39 @@
       <w:tr>
         <w:tc>
           <w:tcPr>
+            <w:tcW w:w="1491" w:type="dxa"/>
+          </w:tcPr>
+          <w:p>
+            <w:pPr>
+              <w:rPr>
+                <w:b/>
+                <w:lang w:val="en-US"/>
+              </w:rPr>
+            </w:pPr>
+            <w:bookmarkStart w:id="0" w:name="_GoBack" w:colFirst="3" w:colLast="3"/>
+            <w:r>
+              <w:t>POST</w:t>
+            </w:r>
+          </w:p>
+        </w:tc>
+        <w:tc>
+          <w:tcPr>
+            <w:tcW w:w="1540" w:type="dxa"/>
+          </w:tcPr>
+          <w:p>
+            <w:pPr>
+              <w:rPr>
+                <w:b/>
+                <w:lang w:val="en-US"/>
+              </w:rPr>
+            </w:pPr>
+            <w:r>
+              <w:t>/api/enrolmen ts/{enrolmentI d}/result</w:t>
+            </w:r>
+          </w:p>
+        </w:tc>
+        <w:tc>
+          <w:tcPr>
             <w:tcW w:w="1502" w:type="dxa"/>
           </w:tcPr>
           <w:p>
@@ -3162,77 +3193,96 @@
                 <w:lang w:val="en-US"/>
               </w:rPr>
             </w:pPr>
-          </w:p>
-        </w:tc>
-        <w:tc>
-          <w:tcPr>
-            <w:tcW w:w="1502" w:type="dxa"/>
-          </w:tcPr>
-          <w:p>
-            <w:pPr>
-              <w:rPr>
-                <w:b/>
-                <w:lang w:val="en-US"/>
-              </w:rPr>
-            </w:pPr>
-          </w:p>
-        </w:tc>
-        <w:tc>
-          <w:tcPr>
-            <w:tcW w:w="1503" w:type="dxa"/>
-          </w:tcPr>
-          <w:p>
-            <w:pPr>
-              <w:rPr>
-                <w:b/>
-                <w:lang w:val="en-US"/>
-              </w:rPr>
-            </w:pPr>
-          </w:p>
-        </w:tc>
-        <w:tc>
-          <w:tcPr>
-            <w:tcW w:w="1503" w:type="dxa"/>
-          </w:tcPr>
-          <w:p>
-            <w:pPr>
-              <w:rPr>
-                <w:b/>
-                <w:lang w:val="en-US"/>
-              </w:rPr>
-            </w:pPr>
-          </w:p>
-        </w:tc>
-        <w:tc>
-          <w:tcPr>
-            <w:tcW w:w="1503" w:type="dxa"/>
-          </w:tcPr>
-          <w:p>
-            <w:pPr>
-              <w:rPr>
-                <w:b/>
-                <w:lang w:val="en-US"/>
-              </w:rPr>
-            </w:pPr>
-          </w:p>
-        </w:tc>
-        <w:tc>
-          <w:tcPr>
-            <w:tcW w:w="1503" w:type="dxa"/>
-          </w:tcPr>
-          <w:p>
-            <w:pPr>
-              <w:rPr>
-                <w:b/>
-                <w:lang w:val="en-US"/>
-              </w:rPr>
-            </w:pPr>
+            <w:r>
+              <w:t>Captures finish timeand finishing position</w:t>
+            </w:r>
+          </w:p>
+        </w:tc>
+        <w:tc>
+          <w:tcPr>
+            <w:tcW w:w="1501" w:type="dxa"/>
+          </w:tcPr>
+          <w:p>
+            <w:r>
+              <w:t xml:space="preserve">Organiser </w:t>
+            </w:r>
+          </w:p>
+        </w:tc>
+        <w:tc>
+          <w:tcPr>
+            <w:tcW w:w="1490" w:type="dxa"/>
+          </w:tcPr>
+          <w:p>
+            <w:pPr>
+              <w:rPr>
+                <w:b/>
+                <w:lang w:val="en-US"/>
+              </w:rPr>
+            </w:pPr>
+            <w:r>
+              <w:t>{ finishTime, position}</w:t>
+            </w:r>
+          </w:p>
+          <w:p>
+            <w:pPr>
+              <w:rPr>
+                <w:lang w:val="en-US"/>
+              </w:rPr>
+            </w:pPr>
+          </w:p>
+        </w:tc>
+        <w:tc>
+          <w:tcPr>
+            <w:tcW w:w="1492" w:type="dxa"/>
+          </w:tcPr>
+          <w:p>
+            <w:pPr>
+              <w:rPr>
+                <w:b/>
+                <w:lang w:val="en-US"/>
+              </w:rPr>
+            </w:pPr>
+            <w:r>
+              <w:t>201 Created; 400 Bad request; 403 forbidden; 404 not found; 409 conflict</w:t>
+            </w:r>
           </w:p>
         </w:tc>
       </w:tr>
       <w:tr>
         <w:tc>
           <w:tcPr>
+            <w:tcW w:w="1491" w:type="dxa"/>
+          </w:tcPr>
+          <w:p>
+            <w:pPr>
+              <w:rPr>
+                <w:b/>
+                <w:lang w:val="en-US"/>
+              </w:rPr>
+            </w:pPr>
+            <w:r>
+              <w:t>PUT</w:t>
+            </w:r>
+          </w:p>
+        </w:tc>
+        <w:tc>
+          <w:tcPr>
+            <w:tcW w:w="1540" w:type="dxa"/>
+          </w:tcPr>
+          <w:p>
+            <w:pPr>
+              <w:rPr>
+                <w:b/>
+                <w:lang w:val="en-US"/>
+              </w:rPr>
+            </w:pPr>
+            <w:r>
+              <w:t>/api/enrolmen ts/{enrolmentI d}/result</w:t>
+            </w:r>
+          </w:p>
+        </w:tc>
+        <w:tc>
+          <w:tcPr>
             <w:tcW w:w="1502" w:type="dxa"/>
           </w:tcPr>
           <w:p>
@@ -3242,6 +3292,90 @@
                 <w:lang w:val="en-US"/>
               </w:rPr>
             </w:pPr>
+            <w:r>
+              <w:t xml:space="preserve">Corrects or updates a previously caprutred </w:t>
+            </w:r>
+            <w:r>
+              <w:lastRenderedPageBreak/>
+              <w:t>result for an organiser owned event</w:t>
+            </w:r>
+          </w:p>
+        </w:tc>
+        <w:tc>
+          <w:tcPr>
+            <w:tcW w:w="1501" w:type="dxa"/>
+          </w:tcPr>
+          <w:p>
+            <w:r>
+              <w:lastRenderedPageBreak/>
+              <w:t xml:space="preserve">Organiser </w:t>
+            </w:r>
+          </w:p>
+        </w:tc>
+        <w:tc>
+          <w:tcPr>
+            <w:tcW w:w="1490" w:type="dxa"/>
+          </w:tcPr>
+          <w:p>
+            <w:pPr>
+              <w:rPr>
+                <w:b/>
+                <w:lang w:val="en-US"/>
+              </w:rPr>
+            </w:pPr>
+            <w:r>
+              <w:t>{ finishTime, position}</w:t>
+            </w:r>
+          </w:p>
+        </w:tc>
+        <w:tc>
+          <w:tcPr>
+            <w:tcW w:w="1492" w:type="dxa"/>
+          </w:tcPr>
+          <w:p>
+            <w:pPr>
+              <w:rPr>
+                <w:b/>
+                <w:lang w:val="en-US"/>
+              </w:rPr>
+            </w:pPr>
+            <w:r>
+              <w:t xml:space="preserve">200 ok; 400 bad request; 401 unauthotize </w:t>
+            </w:r>
+            <w:r>
+              <w:lastRenderedPageBreak/>
+              <w:t>d; 403 Forbidden; 404 not found</w:t>
+            </w:r>
+          </w:p>
+        </w:tc>
+      </w:tr>
+      <w:bookmarkEnd w:id="0"/>
+      <w:tr>
+        <w:tc>
+          <w:tcPr>
+            <w:tcW w:w="1491" w:type="dxa"/>
+          </w:tcPr>
+          <w:p>
+            <w:r>
+              <w:lastRenderedPageBreak/>
+              <w:t>GET</w:t>
+            </w:r>
+          </w:p>
+        </w:tc>
+        <w:tc>
+          <w:tcPr>
+            <w:tcW w:w="1540" w:type="dxa"/>
+          </w:tcPr>
+          <w:p>
+            <w:pPr>
+              <w:rPr>
+                <w:b/>
+                <w:lang w:val="en-US"/>
+              </w:rPr>
+            </w:pPr>
+            <w:r>
+              <w:t>/api/result/me</w:t>
+            </w:r>
           </w:p>
         </w:tc>
         <w:tc>
@@ -3255,64 +3389,77 @@
                 <w:lang w:val="en-US"/>
               </w:rPr>
             </w:pPr>
-          </w:p>
-        </w:tc>
-        <w:tc>
-          <w:tcPr>
-            <w:tcW w:w="1503" w:type="dxa"/>
-          </w:tcPr>
-          <w:p>
-            <w:pPr>
-              <w:rPr>
-                <w:b/>
-                <w:lang w:val="en-US"/>
-              </w:rPr>
-            </w:pPr>
-          </w:p>
-        </w:tc>
-        <w:tc>
-          <w:tcPr>
-            <w:tcW w:w="1503" w:type="dxa"/>
-          </w:tcPr>
-          <w:p>
-            <w:pPr>
-              <w:rPr>
-                <w:b/>
-                <w:lang w:val="en-US"/>
-              </w:rPr>
-            </w:pPr>
-          </w:p>
-        </w:tc>
-        <w:tc>
-          <w:tcPr>
-            <w:tcW w:w="1503" w:type="dxa"/>
-          </w:tcPr>
-          <w:p>
-            <w:pPr>
-              <w:rPr>
-                <w:b/>
-                <w:lang w:val="en-US"/>
-              </w:rPr>
-            </w:pPr>
-          </w:p>
-        </w:tc>
-        <w:tc>
-          <w:tcPr>
-            <w:tcW w:w="1503" w:type="dxa"/>
-          </w:tcPr>
-          <w:p>
-            <w:pPr>
-              <w:rPr>
-                <w:b/>
-                <w:lang w:val="en-US"/>
-              </w:rPr>
-            </w:pPr>
+            <w:r>
+              <w:t>Return race result for the authenticated participant across completed enrolments</w:t>
+            </w:r>
+          </w:p>
+        </w:tc>
+        <w:tc>
+          <w:tcPr>
+            <w:tcW w:w="1501" w:type="dxa"/>
+          </w:tcPr>
+          <w:p>
+            <w:r>
+              <w:t>none</w:t>
+            </w:r>
+          </w:p>
+        </w:tc>
+        <w:tc>
+          <w:tcPr>
+            <w:tcW w:w="1490" w:type="dxa"/>
+          </w:tcPr>
+          <w:p>
+            <w:r>
+              <w:t>none</w:t>
+            </w:r>
+          </w:p>
+        </w:tc>
+        <w:tc>
+          <w:tcPr>
+            <w:tcW w:w="1492" w:type="dxa"/>
+          </w:tcPr>
+          <w:p>
+            <w:pPr>
+              <w:rPr>
+                <w:b/>
+                <w:lang w:val="en-US"/>
+              </w:rPr>
+            </w:pPr>
+            <w:r>
+              <w:t>200 OK; 401 Unauthorize d; 404 Forbidden</w:t>
+            </w:r>
           </w:p>
         </w:tc>
       </w:tr>
       <w:tr>
         <w:tc>
           <w:tcPr>
+            <w:tcW w:w="1491" w:type="dxa"/>
+          </w:tcPr>
+          <w:p>
+            <w:r>
+              <w:t>GET</w:t>
+            </w:r>
+          </w:p>
+        </w:tc>
+        <w:tc>
+          <w:tcPr>
+            <w:tcW w:w="1540" w:type="dxa"/>
+          </w:tcPr>
+          <w:p>
+            <w:pPr>
+              <w:rPr>
+                <w:b/>
+                <w:lang w:val="en-US"/>
+              </w:rPr>
+            </w:pPr>
+            <w:r>
+              <w:t>/api/events/{e ventsId}/result</w:t>
+            </w:r>
+          </w:p>
+        </w:tc>
+        <w:tc>
+          <w:tcPr>
             <w:tcW w:w="1502" w:type="dxa"/>
           </w:tcPr>
           <w:p>
@@ -3322,71 +3469,45 @@
                 <w:lang w:val="en-US"/>
               </w:rPr>
             </w:pPr>
-          </w:p>
-        </w:tc>
-        <w:tc>
-          <w:tcPr>
-            <w:tcW w:w="1502" w:type="dxa"/>
-          </w:tcPr>
-          <w:p>
-            <w:pPr>
-              <w:rPr>
-                <w:b/>
-                <w:lang w:val="en-US"/>
-              </w:rPr>
-            </w:pPr>
-          </w:p>
-        </w:tc>
-        <w:tc>
-          <w:tcPr>
-            <w:tcW w:w="1503" w:type="dxa"/>
-          </w:tcPr>
-          <w:p>
-            <w:pPr>
-              <w:rPr>
-                <w:b/>
-                <w:lang w:val="en-US"/>
-              </w:rPr>
-            </w:pPr>
-          </w:p>
-        </w:tc>
-        <w:tc>
-          <w:tcPr>
-            <w:tcW w:w="1503" w:type="dxa"/>
-          </w:tcPr>
-          <w:p>
-            <w:pPr>
-              <w:rPr>
-                <w:b/>
-                <w:lang w:val="en-US"/>
-              </w:rPr>
-            </w:pPr>
-          </w:p>
-        </w:tc>
-        <w:tc>
-          <w:tcPr>
-            <w:tcW w:w="1503" w:type="dxa"/>
-          </w:tcPr>
-          <w:p>
-            <w:pPr>
-              <w:rPr>
-                <w:b/>
-                <w:lang w:val="en-US"/>
-              </w:rPr>
-            </w:pPr>
-          </w:p>
-        </w:tc>
-        <w:tc>
-          <w:tcPr>
-            <w:tcW w:w="1503" w:type="dxa"/>
-          </w:tcPr>
-          <w:p>
-            <w:pPr>
-              <w:rPr>
-                <w:b/>
-                <w:lang w:val="en-US"/>
-              </w:rPr>
-            </w:pPr>
+            <w:r>
+              <w:t>Return the recorded results for a specific event for reporting</w:t>
+            </w:r>
+          </w:p>
+        </w:tc>
+        <w:tc>
+          <w:tcPr>
+            <w:tcW w:w="1501" w:type="dxa"/>
+          </w:tcPr>
+          <w:p>
+            <w:r>
+              <w:t>none</w:t>
+            </w:r>
+          </w:p>
+        </w:tc>
+        <w:tc>
+          <w:tcPr>
+            <w:tcW w:w="1490" w:type="dxa"/>
+          </w:tcPr>
+          <w:p>
+            <w:r>
+              <w:t>none</w:t>
+            </w:r>
+          </w:p>
+        </w:tc>
+        <w:tc>
+          <w:tcPr>
+            <w:tcW w:w="1492" w:type="dxa"/>
+          </w:tcPr>
+          <w:p>
+            <w:pPr>
+              <w:rPr>
+                <w:b/>
+                <w:lang w:val="en-US"/>
+              </w:rPr>
+            </w:pPr>
+            <w:r>
+              <w:t>200 OK; 401 Unauthorize d, 403 Forbidden, 404 Not found</w:t>
+            </w:r>
           </w:p>
         </w:tc>
       </w:tr>

</xml_diff>